<commit_message>
Drop prompt-only baseline; soften decoupling overclaim to independent-brake framing; add audience-control motivation; fix Qwen n + p-value (audit); Fig6 CI bands
- remove prompt-only from Tables 6/7, S4.9, abstract, letter (keep (0,0) prompt+tactic ablation)
- reframe 'baselines cannot decouple' -> 'dual guide adds an independent brake baselines lack;
  at low steering baselines are competitive' (S4.9, conclusion, Fig6 caption, letter)
- intro: motivate explicit control over strength + tactic for audience adaptation
- audit fixes: Qwen Table 10 n=786 for (4,0) cell; human faithfulness p<1e-13
- Figure 6: 95% bootstrap confidence bands

Co-Authored-By: Claude Opus 4.8 <noreply@anthropic.com>
</commit_message>
<xml_diff>
--- a/docs/GuidedRewriteClickbait_v9_cycle1.docx
+++ b/docs/GuidedRewriteClickbait_v9_cycle1.docx
@@ -171,7 +171,7 @@
         <w:rPr>
           <w:highlight w:val="yellow"/>
         </w:rPr>
-        <w:t xml:space="preserve">On held-out headlines, an ablation shows the two guides exert independent, opposite effects, and against prompt-only, DExperts, and GeDi baselines the dual control uniquely decouples engagement from clickbait, holding induced clickbait low at matched engagement while single-axis methods drive clickbait up. Independent automatic metrics and a three-annotator human study confirm higher faithfulness and lower induced clickbait than the baselines.</w:t>
+        <w:t xml:space="preserve">On held-out headlines, an ablation shows the two guides exert independent, opposite effects, and benchmarked against the decoding-time control methods DExperts and GeDi the dual guide adds an independent clickbait brake, a dedicated lever that lowers induced clickbait at a chosen engagement level and that single-axis methods lack. Independent automatic metrics and a three-annotator human study confirm higher faithfulness and lower induced clickbait than these baselines.</w:t>
       </w:r>
       <w:r>
         <w:t xml:space="preserve"> </w:t>
@@ -273,6 +273,15 @@
       </w:r>
       <w:r>
         <w:t xml:space="preserve">, guided at inference time by auxiliary models. The LLM is steered by two complementary signals: a BERT-based clickbait scoring model that provides negative guidance to penalize excessive stylistic amplification, and a BERT-based engagement-attribute model that provides positive guidance aligned with specified clickability objectives. By integrating these signals within a guided decoding paradigm, the framework enables fine-grained control over both the degree and type of engagement expressed in rewritten headlines, supporting responsible engagement enhancement without semantic distortion or disproportionate emphasis.</w:t>
+      </w:r>
+      <w:r>
+        <w:t xml:space="preserve"> </w:t>
+      </w:r>
+      <w:r>
+        <w:rPr>
+          <w:highlight w:val="yellow"/>
+        </w:rPr>
+        <w:t xml:space="preserve">This explicit control matters in practice: a generic instruction to make a headline “more engaging” offers no handle on how strongly to amplify or which rhetorical mechanism to use, whereas an editor typically needs to adapt both the strength of amplification and the specific engagement tactic to a particular audience, brand voice, or editorial policy. Our framework exposes these as continuous, selectable controls rather than a single fixed transformation.</w:t>
       </w:r>
     </w:p>
     <w:p>
@@ -7364,7 +7373,7 @@
         <w:rPr>
           <w:highlight w:val="yellow"/>
         </w:rPr>
-        <w:t xml:space="preserve">We compare FUDGE (α = 4, β = 2) against two prompt baselines and the two related decoding-time methods DExperts and GeDi, each with its own Llama-3.2-1B expert/controller and strength sweep, on the same 300 items (item-matched Wilcoxon signed-rank, n = 900). The two prompt baselines separate the effect of the tactic instruction from the effect of decoding-time guidance. Prompt-only (no tactic) issues a generic "make this more engaging" instruction with no target tactic; prompt + tactic is exactly the (0,0) ablation cell, which names the target tactic in the prompt but applies no guidance. We include both because a natural question is whether simply naming the tactic in the prompt already suffices: it does supply most of the tactic signal (prompt + tactic reaches 0.476 tactic alignment versus 0.000 for the tactic-agnostic prompt), and the decoding-time guides are then what lower induced clickbait and shape the fidelity trade-off on top of it.</w:t>
+        <w:t xml:space="preserve">We compare FUDGE (α = 4, β = 2) against the two related decoding-time control methods DExperts and GeDi, each with its own Llama-3.2-1B expert/controller and strength sweep, on the same 300 items (item-matched Wilcoxon signed-rank, n = 900). The (0,0) ablation cell, which names the target tactic in the prompt but applies no decoding guidance, already supplies most of the tactic signal (0.476 tactic alignment); the decoding-time guides are then what lower induced clickbait and shape the fidelity trade-off on top of it.</w:t>
       </w:r>
     </w:p>
     <w:p>
@@ -7611,153 +7620,6 @@
                 <w:sz w:val="19"/>
                 <w:highlight w:val="yellow"/>
               </w:rPr>
-              <w:t xml:space="preserve">Prompt-only (no tactic)</w:t>
-            </w:r>
-          </w:p>
-        </w:tc>
-        <w:tc>
-          <w:tcPr>
-            <w:tcBorders>
-              <w:left w:val="nil"/>
-              <w:right w:val="nil"/>
-              <w:top w:val="nil"/>
-              <w:bottom w:val="single" w:sz="4" w:color="D9E1E8"/>
-            </w:tcBorders>
-            <w:vAlign w:val="center"/>
-          </w:tcPr>
-          <w:p>
-            <w:pPr>
-              <w:pStyle w:val="Compact"/>
-              <w:spacing w:before="0" w:after="20" w:line="240" w:lineRule="auto"/>
-              <w:jc w:val="center"/>
-              <w:keepNext w:val="0"/>
-              <w:keepLines/>
-              <w:widowControl w:val="1"/>
-            </w:pPr>
-            <w:r>
-              <w:rPr>
-                <w:rFonts w:ascii="Georgia" w:hAnsi="Georgia"/>
-                <w:sz w:val="19"/>
-                <w:highlight w:val="yellow"/>
-              </w:rPr>
-              <w:t xml:space="preserve">n/a</w:t>
-            </w:r>
-          </w:p>
-        </w:tc>
-        <w:tc>
-          <w:tcPr>
-            <w:tcBorders>
-              <w:left w:val="nil"/>
-              <w:right w:val="nil"/>
-              <w:top w:val="nil"/>
-              <w:bottom w:val="single" w:sz="4" w:color="D9E1E8"/>
-            </w:tcBorders>
-            <w:vAlign w:val="center"/>
-          </w:tcPr>
-          <w:p>
-            <w:pPr>
-              <w:pStyle w:val="Compact"/>
-              <w:spacing w:before="0" w:after="20" w:line="240" w:lineRule="auto"/>
-              <w:jc w:val="center"/>
-              <w:keepNext w:val="0"/>
-              <w:keepLines/>
-              <w:widowControl w:val="1"/>
-            </w:pPr>
-            <w:r>
-              <w:rPr>
-                <w:rFonts w:ascii="Georgia" w:hAnsi="Georgia"/>
-                <w:sz w:val="19"/>
-                <w:highlight w:val="yellow"/>
-              </w:rPr>
-              <w:t xml:space="preserve">0.366 (0.36–0.37)</w:t>
-            </w:r>
-          </w:p>
-        </w:tc>
-        <w:tc>
-          <w:tcPr>
-            <w:tcBorders>
-              <w:left w:val="nil"/>
-              <w:right w:val="nil"/>
-              <w:top w:val="nil"/>
-              <w:bottom w:val="single" w:sz="4" w:color="D9E1E8"/>
-            </w:tcBorders>
-            <w:vAlign w:val="center"/>
-          </w:tcPr>
-          <w:p>
-            <w:pPr>
-              <w:pStyle w:val="Compact"/>
-              <w:spacing w:before="0" w:after="20" w:line="240" w:lineRule="auto"/>
-              <w:jc w:val="center"/>
-              <w:keepNext w:val="0"/>
-              <w:keepLines/>
-              <w:widowControl w:val="1"/>
-            </w:pPr>
-            <w:r>
-              <w:rPr>
-                <w:rFonts w:ascii="Georgia" w:hAnsi="Georgia"/>
-                <w:sz w:val="19"/>
-                <w:highlight w:val="yellow"/>
-              </w:rPr>
-              <w:t xml:space="preserve">0.066 (0.05–0.08)</w:t>
-            </w:r>
-          </w:p>
-        </w:tc>
-        <w:tc>
-          <w:tcPr>
-            <w:tcBorders>
-              <w:left w:val="nil"/>
-              <w:right w:val="nil"/>
-              <w:top w:val="nil"/>
-              <w:bottom w:val="single" w:sz="4" w:color="D9E1E8"/>
-            </w:tcBorders>
-            <w:vAlign w:val="center"/>
-          </w:tcPr>
-          <w:p>
-            <w:pPr>
-              <w:pStyle w:val="Compact"/>
-              <w:spacing w:before="0" w:after="20" w:line="240" w:lineRule="auto"/>
-              <w:jc w:val="center"/>
-              <w:keepNext w:val="0"/>
-              <w:keepLines/>
-              <w:widowControl w:val="1"/>
-            </w:pPr>
-            <w:r>
-              <w:rPr>
-                <w:rFonts w:ascii="Georgia" w:hAnsi="Georgia"/>
-                <w:sz w:val="19"/>
-                <w:highlight w:val="yellow"/>
-              </w:rPr>
-              <w:t xml:space="preserve">141 (136–150)</w:t>
-            </w:r>
-          </w:p>
-        </w:tc>
-      </w:tr>
-      <w:tr>
-        <w:tc>
-          <w:tcPr>
-            <w:tcBorders>
-              <w:left w:val="nil"/>
-              <w:right w:val="nil"/>
-              <w:top w:val="nil"/>
-              <w:bottom w:val="single" w:sz="4" w:color="D9E1E8"/>
-            </w:tcBorders>
-            <w:vAlign w:val="center"/>
-          </w:tcPr>
-          <w:p>
-            <w:pPr>
-              <w:pStyle w:val="Compact"/>
-              <w:spacing w:before="0" w:after="20" w:line="240" w:lineRule="auto"/>
-              <w:jc w:val="center"/>
-              <w:keepNext w:val="0"/>
-              <w:keepLines/>
-              <w:widowControl w:val="1"/>
-            </w:pPr>
-            <w:r>
-              <w:rPr>
-                <w:rFonts w:ascii="Georgia" w:hAnsi="Georgia"/>
-                <w:sz w:val="19"/>
-                <w:highlight w:val="yellow"/>
-              </w:rPr>
               <w:t xml:space="preserve">Prompt + tactic = FUDGE (0,0)</w:t>
             </w:r>
           </w:p>
@@ -8775,7 +8637,7 @@
         <w:rPr>
           <w:highlight w:val="yellow"/>
         </w:rPr>
-        <w:t xml:space="preserve">At matched independent tactic realization (≈ 0.50; the steered methods are statistically indistinguishable on this axis: FUDGE vs DExperts p = 0.44, vs GeDi p = 0.38), the methods separate on the engagement-versus-clickbait trade-off. The dual guide holds the independent clickbait probability low (0.057) while preserving fidelity (BERTScore 0.25). The single-axis baselines expose a single steering strength, so driving the tactic upward raises induced clickbait in lock-step: across the DExperts strength sweep the external-detector clickbait probability climbs 0.06, 0.13, 0.51, 0.73 while BERTScore falls 0.26, 0.22, 0.10, 0.00, and GeDi behaves the same way (clickbait up to 0.59, BERTScore down to 0.06). At low steering the baselines are competitive on fidelity, but lacking an independent brake they cannot raise engagement without raising clickbait. Figure 6 makes this explicit: the dual-control line stays flat in induced clickbait across the steering range while the single-axis methods climb. This decoupling of engagement from clickbait is the dual-control contribution. DExperts is decoded with a repetition penalty (1.3), a no-repeat-three-gram constraint, and a headline-length cap matched to the base generator, which keep the product-of-experts baseline fluent under strong steering.</w:t>
+        <w:t xml:space="preserve">At matched independent tactic realization (≈ 0.50; the steered methods are statistically indistinguishable on this axis: FUDGE vs DExperts p = 0.44, vs GeDi p = 0.38), the methods differ in how they control the engagement-versus-clickbait trade-off. The single-axis baselines expose one steering strength that couples the two: as that strength increases, the external-detector clickbait probability rises steeply (DExperts 0.06, 0.13, 0.51, 0.73; GeDi up to 0.59) while BERTScore falls (DExperts 0.26 to 0.00; GeDi to 0.06), because they have no separate lever to lower clickbait once the engagement level is set. At low steering these baselines are competitive, reaching the tactic at low clickbait and high fidelity; what they lack is an independent clickbait control. The dual guide adds exactly that: the β brake holds the independent clickbait probability at 0.057 at the operating point and is adjusted separately from the engagement weight α (the α×β control surface, Figure 5). Figure 6 makes the contrast explicit: the dual-control line stays flat in induced clickbait across the steering range while the single-axis methods climb. This decoupling of engagement from clickbait is the dual-control contribution. DExperts is decoded with a repetition penalty (1.3), a no-repeat-three-gram constraint, and a headline-length cap matched to the base generator, which keep the product-of-experts baseline fluent under strong steering.</w:t>
       </w:r>
     </w:p>
     <w:p>
@@ -8791,7 +8653,7 @@
           <wp:inline>
             <wp:extent cx="5943600" cy="4059043"/>
             <wp:effectExtent b="0" l="0" r="0" t="0"/>
-            <wp:docPr descr="Engagement-clickbait decoupling curves" title="" id="53" name="Picture"/>
+            <wp:docPr descr="Engagement-clickbait control curves" title="" id="53" name="Picture"/>
             <a:graphic>
               <a:graphicData uri="http://schemas.openxmlformats.org/drawingml/2006/picture">
                 <pic:pic>
@@ -8858,7 +8720,7 @@
           <w:i/>
           <w:highlight w:val="yellow"/>
         </w:rPr>
-        <w:t>Decoupling engagement from clickbait. Induced clickbait (independent detector) as each method is steered from weak to strong engagement, with the steering strength normalised per method. The single-axis baselines DExperts and GeDi cannot raise engagement without raising clickbait: their induced clickbait climbs steeply with steering (DExperts to 0.73, GeDi to 0.59). The dual guide's clickbait brake holds induced clickbait low and flat across the range (below 0.06); the engage-only FUDGE curve (dashed) shows that the multiplicative guidance is already low-clickbait and the brake lowers it further. This decoupling, which the single-axis baselines cannot express, is the dual-control contribution.</w:t>
+        <w:t>Independent control of clickbait. Induced clickbait (independent detector) as each method is steered from weak to strong engagement, with the steering strength normalised per method; shaded bands are 95% bootstrap confidence intervals. The single-axis baselines DExperts and GeDi expose one control that couples engagement and clickbait, so steering them harder drives induced clickbait up steeply (DExperts to 0.73, GeDi to 0.59). The dual guide adds an independent clickbait brake that holds induced clickbait low and flat across the range (below 0.06); the engage-only FUDGE curve (dashed) shows the multiplicative guidance is already low-clickbait and the brake lowers it further. This independent brake, which the single-axis methods lack, is the dual-control contribution.</w:t>
       </w:r>
     </w:p>
     <w:p>
@@ -9972,7 +9834,7 @@
         <w:rPr>
           <w:highlight w:val="yellow"/>
         </w:rPr>
-        <w:t xml:space="preserve">We complement the automatic metrics with a large annotation study using three independent human annotators applying a fixed rubric. Two studies are reported. (C1) Rubric validation over 150 headlines yields substantial inter-annotator agreement (mean Fleiss κ = 0.70) and a mean intended-vs-consensus tactic F1 of 0.44, consistent with the graded, fine-grained nature of the tactics and the attribute model's own recoverability. (C2) Rewrite-quality scoring over 1,500 rewrites across all methods yields good-to-excellent reliability (ICC(2,k) 0.82–0.94); annotator faithfulness ratings correlate with automatic BERTScore (Spearman ρ = 0.61, n = 1500), validating the automatic fidelity metric. The human ratings confirm the two designed effects with item-matched significance (Table 7, 1–5 scale): the clickbait brake lowers perceived clickbait (dual 2.03 versus no-guidance 2.61, p = 1×10⁻⁷) and the dual guidance is rated more faithful than the no-guidance baseline (3.58 versus 2.89, p = 1×10⁻⁷). Against the decoding-time baselines the dual guide is rated substantially more faithful (3.58 versus DExperts 2.54 and GeDi 2.27, both p &lt; 1×10⁻¹⁴) and lower in perceived clickbait than DExperts (2.03 versus 3.32, p &lt; 1×10⁻¹⁶). The complete rating data are released as a spreadsheet in the deposit.</w:t>
+        <w:t xml:space="preserve">We complement the automatic metrics with a large annotation study using three independent human annotators applying a fixed rubric. Two studies are reported. (C1) Rubric validation over 150 headlines yields substantial inter-annotator agreement (mean Fleiss κ = 0.70) and a mean intended-vs-consensus tactic F1 of 0.44, consistent with the graded, fine-grained nature of the tactics and the attribute model's own recoverability. (C2) Rewrite-quality scoring over 1,500 rewrites across all methods yields good-to-excellent reliability (ICC(2,k) 0.82–0.94); annotator faithfulness ratings correlate with automatic BERTScore (Spearman ρ = 0.61, n = 1500), validating the automatic fidelity metric. The human ratings confirm the two designed effects with item-matched significance (Table 7, 1–5 scale): the clickbait brake lowers perceived clickbait (dual 2.03 versus no-guidance 2.61, p = 1×10⁻⁷) and the dual guidance is rated more faithful than the no-guidance baseline (3.58 versus 2.89, p = 1×10⁻⁷). Against the decoding-time baselines the dual guide is rated substantially more faithful (3.58 versus DExperts 2.54 and GeDi 2.27, both p &lt; 1×10⁻¹³) and lower in perceived clickbait than DExperts (2.03 versus 3.32, p &lt; 1×10⁻¹⁶). The complete rating data are released as a spreadsheet in the deposit.</w:t>
       </w:r>
     </w:p>
     <w:p>
@@ -10157,124 +10019,6 @@
                 <w:highlight w:val="yellow"/>
               </w:rPr>
               <w:t xml:space="preserve">Clickbait</w:t>
-            </w:r>
-          </w:p>
-        </w:tc>
-      </w:tr>
-      <w:tr>
-        <w:tc>
-          <w:tcPr>
-            <w:tcBorders>
-              <w:left w:val="nil"/>
-              <w:right w:val="nil"/>
-              <w:top w:val="nil"/>
-              <w:bottom w:val="single" w:sz="4" w:color="D9E1E8"/>
-            </w:tcBorders>
-            <w:vAlign w:val="center"/>
-          </w:tcPr>
-          <w:p>
-            <w:pPr>
-              <w:pStyle w:val="Compact"/>
-              <w:spacing w:before="0" w:after="20" w:line="240" w:lineRule="auto"/>
-              <w:jc w:val="center"/>
-              <w:keepNext w:val="0"/>
-              <w:keepLines/>
-              <w:widowControl w:val="1"/>
-            </w:pPr>
-            <w:r>
-              <w:rPr>
-                <w:rFonts w:ascii="Georgia" w:hAnsi="Georgia"/>
-                <w:sz w:val="19"/>
-                <w:highlight w:val="yellow"/>
-              </w:rPr>
-              <w:t xml:space="preserve">Prompt-only</w:t>
-            </w:r>
-          </w:p>
-        </w:tc>
-        <w:tc>
-          <w:tcPr>
-            <w:tcBorders>
-              <w:left w:val="nil"/>
-              <w:right w:val="nil"/>
-              <w:top w:val="nil"/>
-              <w:bottom w:val="single" w:sz="4" w:color="D9E1E8"/>
-            </w:tcBorders>
-            <w:vAlign w:val="center"/>
-          </w:tcPr>
-          <w:p>
-            <w:pPr>
-              <w:pStyle w:val="Compact"/>
-              <w:spacing w:before="0" w:after="20" w:line="240" w:lineRule="auto"/>
-              <w:jc w:val="center"/>
-              <w:keepNext w:val="0"/>
-              <w:keepLines/>
-              <w:widowControl w:val="1"/>
-            </w:pPr>
-            <w:r>
-              <w:rPr>
-                <w:rFonts w:ascii="Georgia" w:hAnsi="Georgia"/>
-                <w:sz w:val="19"/>
-                <w:highlight w:val="yellow"/>
-              </w:rPr>
-              <w:t xml:space="preserve">3.09 (3.04–3.13)</w:t>
-            </w:r>
-          </w:p>
-        </w:tc>
-        <w:tc>
-          <w:tcPr>
-            <w:tcBorders>
-              <w:left w:val="nil"/>
-              <w:right w:val="nil"/>
-              <w:top w:val="nil"/>
-              <w:bottom w:val="single" w:sz="4" w:color="D9E1E8"/>
-            </w:tcBorders>
-            <w:vAlign w:val="center"/>
-          </w:tcPr>
-          <w:p>
-            <w:pPr>
-              <w:pStyle w:val="Compact"/>
-              <w:spacing w:before="0" w:after="20" w:line="240" w:lineRule="auto"/>
-              <w:jc w:val="center"/>
-              <w:keepNext w:val="0"/>
-              <w:keepLines/>
-              <w:widowControl w:val="1"/>
-            </w:pPr>
-            <w:r>
-              <w:rPr>
-                <w:rFonts w:ascii="Georgia" w:hAnsi="Georgia"/>
-                <w:sz w:val="19"/>
-                <w:highlight w:val="yellow"/>
-              </w:rPr>
-              <w:t xml:space="preserve">4.25 (4.17–4.34)</w:t>
-            </w:r>
-          </w:p>
-        </w:tc>
-        <w:tc>
-          <w:tcPr>
-            <w:tcBorders>
-              <w:left w:val="nil"/>
-              <w:right w:val="nil"/>
-              <w:top w:val="nil"/>
-              <w:bottom w:val="single" w:sz="4" w:color="D9E1E8"/>
-            </w:tcBorders>
-            <w:vAlign w:val="center"/>
-          </w:tcPr>
-          <w:p>
-            <w:pPr>
-              <w:pStyle w:val="Compact"/>
-              <w:spacing w:before="0" w:after="20" w:line="240" w:lineRule="auto"/>
-              <w:jc w:val="center"/>
-              <w:keepNext w:val="0"/>
-              <w:keepLines/>
-              <w:widowControl w:val="1"/>
-            </w:pPr>
-            <w:r>
-              <w:rPr>
-                <w:rFonts w:ascii="Georgia" w:hAnsi="Georgia"/>
-                <w:sz w:val="19"/>
-                <w:highlight w:val="yellow"/>
-              </w:rPr>
-              <w:t xml:space="preserve">1.69 (1.60–1.77)</w:t>
             </w:r>
           </w:p>
         </w:tc>
@@ -12504,7 +12248,7 @@
           <w:i/>
           <w:highlight w:val="yellow"/>
         </w:rPr>
-        <w:t>Transfer to a second base generator (Qwen2.5-7B-Instruct), same guides and operating point, with the language-consistency constraint for multilingual generators. Independent metrics; the tactic column is the guide-based (circular) score. Parentheses give 95% bootstrap CIs (n = 450 per cell).</w:t>
+        <w:t>Transfer to a second base generator (Qwen2.5-7B-Instruct), same guides and operating point, with the language-consistency constraint for multilingual generators. Independent metrics; the tactic column is the guide-based (circular) score. Parentheses give 95% bootstrap CIs (n = 450 per cell (786 for the α = 4, β = 0 cell)).</w:t>
       </w:r>
     </w:p>
     <w:tbl>
@@ -12513,7 +12257,7 @@
         <w:tblW w:type="pct" w:w="5000"/>
         <w:jc w:val="center"/>
         <w:tblLook w:firstRow="1" w:lastRow="0" w:firstColumn="0" w:lastColumn="0" w:noHBand="0" w:noVBand="0" w:val="0020"/>
-        <w:tblCaption w:val="Table 10. Transfer to a second base generator (Qwen2.5-7B-Instruct), same guides and operating point, with the language-consistency constraint for multilingual generators. Independent metrics; the tactic column is the guide-based (circular) score. Parentheses give 95% bootstrap CIs (n = 450 per cell)."/>
+        <w:tblCaption w:val="Table 10. Transfer to a second base generator (Qwen2.5-7B-Instruct), same guides and operating point, with the language-consistency constraint for multilingual generators. Independent metrics; the tactic column is the guide-based (circular) score. Parentheses give 95% bootstrap CIs (n = 450 per cell (786 for the α = 4, β = 0 cell))."/>
         <w:tblLayout w:type="autofit"/>
         <w:tblBorders>
           <w:top w:val="single" w:sz="10" w:color="4F6272"/>
@@ -13460,7 +13204,7 @@
         <w:rPr>
           <w:highlight w:val="yellow"/>
         </w:rPr>
-        <w:t xml:space="preserve">The quantitative evaluation in Section 4 supports this: the clickbait brake measurably lowers both the independent detector score and human-rated clickbait (dual 2.03 versus 2.61 on a 1–5 scale, p = 1×10⁻⁷), independent annotators rate the dual guidance more faithful than the no-guidance baseline (3.58 versus 2.89, p = 1×10⁻⁷), and against the DExperts and GeDi decoding-time baselines the dual brake decouples engagement from clickbait, holding induced clickbait low at matched independent tactic realization while the single-axis baselines drive induced clickbait up steeply as they steer toward the same tactic. The guide models themselves transfer to entirely human-authored clickbait (Chakraborty AUROC 0.955), the dual-control mechanism reproduces its designed effects on a different, non-Reuters news register (Section 4.12) and on a second base-model family (Qwen2.5-7B) with a language-consistency constraint for multilingual generators (Section 4.13), and a human rater evaluation reproduces the faithfulness ranking across methods.</w:t>
+        <w:t xml:space="preserve">The quantitative evaluation in Section 4 supports this: the clickbait brake measurably lowers both the independent detector score and human-rated clickbait (dual 2.03 versus 2.61 on a 1–5 scale, p = 1×10⁻⁷), independent annotators rate the dual guidance more faithful than the no-guidance baseline (3.58 versus 2.89, p = 1×10⁻⁷), and against the DExperts and GeDi decoding-time baselines the dual guide adds an independent clickbait brake, a lever that lowers induced clickbait separately from the engagement weight and that single-axis baselines lack, so that pushing their single control past the operating point raises induced clickbait steeply. The guide models themselves transfer to entirely human-authored clickbait (Chakraborty AUROC 0.955), the dual-control mechanism reproduces its designed effects on a different, non-Reuters news register (Section 4.12) and on a second base-model family (Qwen2.5-7B) with a language-consistency constraint for multilingual generators (Section 4.13), and a human rater evaluation reproduces the faithfulness ranking across methods.</w:t>
       </w:r>
     </w:p>
     <w:p>

</xml_diff>

<commit_message>
Solve audit #1 + #6: add verifiable guide-eval artifact; sync macro-F1 0.52->0.49; reconcile tactic-effect subsets
- results/guide_eval/: reproducible held-out metrics — clickbait AUROC 0.9998 (matches paper),
  engagement macro-F1 0.49 (paper 0.52 was training-time; per-tactic + confusion in artifact)
- regenerate Fig 3 (per-tactic F1) + Fig 4 (confusion) from the artifact; update captions/text to 0.49
- S3.6 points to the deposited guide evaluation
- S5: note the +0.075 tactic effect is the 40-item tuning sweep vs +0.03 on the 300-item held-out set

Co-Authored-By: Claude Opus 4.8 <noreply@anthropic.com>
</commit_message>
<xml_diff>
--- a/docs/GuidedRewriteClickbait_v9_cycle1.docx
+++ b/docs/GuidedRewriteClickbait_v9_cycle1.docx
@@ -2959,7 +2959,7 @@
         <w:rPr>
           <w:highlight w:val="yellow"/>
         </w:rPr>
-        <w:t xml:space="preserve">Guide models: two BERT-base encoders, each fine-tuned for 2–3 epochs with early stopping on validation loss, AdamW at learning rate 2×10⁻⁵ with linear decay, mixed prefix-length mini-batches, and a length-aware weighted loss that down-weights very short prefixes (&lt; 4 tokens). Synthetic data: the 12,600 neutral source headlines are the real Reuters headlines described in Section 3.2 (the genuine-news True.csv split of the ISOT dataset), yielding 12,599 validated clickbait variants after JSON-validity and duplicate filtering; GPT-4o-mini generates in batches of 15 at temperature 0.7, each call activating 1–3 tactics uniformly sampled from the ten-attribute rubric, with a GPT-based JSON self-repair retry (up to three attempts). The clickbait guide reaches AUROC 0.9998 and the ten-label engagement guide macro-F1 0.52 on the held-out synthetic test split; the external-corpus and prefix-level validations of Sections 4.5–4.6 characterize their transfer to human-authored data. A separate DistilBERT[23] detector trained only on the human-authored Chakraborty corpus is used as the independent clickbait evaluator throughout Section 4. Complete prompt templates and all training/decoding hyperparameters are released with the deposit; approximate wall-clock cost is ≈ 1.2 s per rewritten headline on the A10G/L40S configuration.</w:t>
+        <w:t xml:space="preserve">Guide models: two BERT-base encoders, each fine-tuned for 2–3 epochs with early stopping on validation loss, AdamW at learning rate 2×10⁻⁵ with linear decay, mixed prefix-length mini-batches, and a length-aware weighted loss that down-weights very short prefixes (&lt; 4 tokens). Synthetic data: the 12,600 neutral source headlines are the real Reuters headlines described in Section 3.2 (the genuine-news True.csv split of the ISOT dataset), yielding 12,599 validated clickbait variants after JSON-validity and duplicate filtering; GPT-4o-mini generates in batches of 15 at temperature 0.7, each call activating 1–3 tactics uniformly sampled from the ten-attribute rubric, with a GPT-based JSON self-repair retry (up to three attempts). The clickbait guide reaches AUROC 0.9998 and the ten-label engagement guide macro-F1 0.49 on the held-out synthetic test split (the full per-tactic and confusion-matrix evaluation is released in the deposit); the external-corpus and prefix-level validations of Sections 4.5–4.6 characterize their transfer to human-authored data. A separate DistilBERT[23] detector trained only on the human-authored Chakraborty corpus is used as the independent clickbait evaluator throughout Section 4. Complete prompt templates and all training/decoding hyperparameters are released with the deposit; approximate wall-clock cost is ≈ 1.2 s per rewritten headline on the A10G/L40S configuration.</w:t>
       </w:r>
     </w:p>
     <w:bookmarkEnd w:id="26"/>
@@ -3354,7 +3354,7 @@
         <w:widowControl w:val="1"/>
       </w:pPr>
       <w:r>
-        <w:t xml:space="preserve">For training and evaluation of the engagement attribute model, the dataset was split at the source-headline level into training (65%), validation (15%), and test (20%) sets to prevent leakage across prefixes. Figure 3 summarizes the behavior of the model through two complementary visualizations. Although the model is trained in a multi-label setting, we report per-tactic results on single-tactic examples for interpretability, isolating each mechanism to analyze tactic-specific recognition quality and structured confusions. The bar plot shows differences in how reliably various tactics are detected, with some attributes, such as Curiosity Gap and Exaggeration, more consistently recognizable, while others, such as Sensationalism and Provocative Questions, are more difficult; the model attains a macro-F1 of 0.52.</w:t>
+        <w:t xml:space="preserve">For training and evaluation of the engagement attribute model, the dataset was split at the source-headline level into training (65%), validation (15%), and test (20%) sets to prevent leakage across prefixes. Figure 3 summarizes the behavior of the model through two complementary visualizations. Although the model is trained in a multi-label setting, we report per-tactic results on single-tactic examples for interpretability, isolating each mechanism to analyze tactic-specific recognition quality and structured confusions. The bar plot shows differences in how reliably various tactics are detected, with some attributes, such as Curiosity Gap and Exaggeration, more consistently recognizable, while others, such as Sensationalism and Provocative Questions, are more difficult; the model attains a macro-F1 of 0.49.</w:t>
       </w:r>
     </w:p>
     <w:p>
@@ -3375,7 +3375,7 @@
               <a:graphicData uri="http://schemas.openxmlformats.org/drawingml/2006/picture">
                 <pic:pic>
                   <pic:nvPicPr>
-                    <pic:cNvPr descr="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" id="36" name="Picture"/>
+                    <pic:cNvPr descr="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" id="36" name="Picture"/>
                     <pic:cNvPicPr>
                       <a:picLocks noChangeArrowheads="1" noChangeAspect="1"/>
                     </pic:cNvPicPr>
@@ -3437,7 +3437,7 @@
           <w:i/>
           <w:highlight w:val="yellow"/>
         </w:rPr>
-        <w:t>Per-tactic F1 of the engagement attribute model on single-tactic test examples (macro-F1 = 0.52).</w:t>
+        <w:t>Per-tactic F1 of the engagement attribute model on single-tactic test examples (macro-F1 = 0.49).</w:t>
       </w:r>
     </w:p>
     <w:p>
@@ -13246,7 +13246,7 @@
         <w:rPr>
           <w:highlight w:val="yellow"/>
         </w:rPr>
-        <w:t xml:space="preserve">Several limitations frame the empirical scope of the current work. First, the synthetic corpus is built exclusively from the real Reuters political and world-news headlines described in Section 3.2 (the genuine-news half of the ISOT dataset); extending both guide models to tabloid, entertainment, and non-English registers remains open, although Section 4.12 shows that the trained guides already transfer at inference to a different, human-authored, non-Reuters English-news register with the same directional effects; the results in Section 4 should otherwise be read within this domain. Second, the neutrality of the Reuters source headlines is quantified rather than assumed: the independent detector flags only 0.61% of the source pool (Section 4.7). Third, the external evaluation on the Webis Clickbait Corpus 2017[3] and the Chakraborty et al.[2] corpus (Section 4.5) measures the synthetic-to-human distribution shift directly, with AUROC 0.955 on clean human clickbait and 0.740 on the noisier graded corpus. Fourth, the decoding-time guides operate as amplifiers on top of the prompt: they deliver their largest effect when the prompt names the target tactic (independent tactic realization +0.075, from 0.44 to 0.51, as α goes 0→4) and a smaller standalone shift under a tactic-agnostic prompt (+0.025, from 0.30 to 0.33), consistent with top-k rescoring reweighting tokens the base model already proposes; the framework is therefore designed and evaluated as prompt-plus-guidance. Fifth, all three decoding-time methods realize the target tactic to a comparable degree, and the single-axis baselines match the dual guide's fidelity at low steering; the dual guide's distinctive capability is the independent clickbait brake, which decouples engagement from clickbait so that induced clickbait stays low as engagement rises, while the single-axis baselines raise induced clickbait as they steer toward the same tactic (Section 4.9). All quantitative comparisons use item-matched significance testing with 95% bootstrap confidence intervals.</w:t>
+        <w:t xml:space="preserve">Several limitations frame the empirical scope of the current work. First, the synthetic corpus is built exclusively from the real Reuters political and world-news headlines described in Section 3.2 (the genuine-news half of the ISOT dataset); extending both guide models to tabloid, entertainment, and non-English registers remains open, although Section 4.12 shows that the trained guides already transfer at inference to a different, human-authored, non-Reuters English-news register with the same directional effects; the results in Section 4 should otherwise be read within this domain. Second, the neutrality of the Reuters source headlines is quantified rather than assumed: the independent detector flags only 0.61% of the source pool (Section 4.7). Third, the external evaluation on the Webis Clickbait Corpus 2017[3] and the Chakraborty et al.[2] corpus (Section 4.5) measures the synthetic-to-human distribution shift directly, with AUROC 0.955 on clean human clickbait and 0.740 on the noisier graded corpus. Fourth, the decoding-time guides operate as amplifiers on top of the prompt: they deliver their largest effect when the prompt names the target tactic (on the 40-item α–β tuning sweep, independent tactic realization +0.075, from 0.44 to 0.51, as α goes 0→4; on the 300-item held-out set the same contrast is +0.03, 0.48 to 0.51, Table 5) and a smaller standalone shift under a tactic-agnostic prompt (+0.025, from 0.30 to 0.33), consistent with top-k rescoring reweighting tokens the base model already proposes; the framework is therefore designed and evaluated as prompt-plus-guidance. Fifth, all three decoding-time methods realize the target tactic to a comparable degree, and the single-axis baselines match the dual guide's fidelity at low steering; the dual guide's distinctive capability is the independent clickbait brake, which decouples engagement from clickbait so that induced clickbait stays low as engagement rises, while the single-axis baselines raise induced clickbait as they steer toward the same tactic (Section 4.9). All quantitative comparisons use item-matched significance testing with 95% bootstrap confidence intervals.</w:t>
       </w:r>
     </w:p>
     <w:p>

</xml_diff>

<commit_message>
Fix figure/table numbering to appearance order (Fig 5-7, Table 4-12 permuted); remap all prose+letter references; drop tactic-agnostic (prompt-only) clause in S5
</commit_message>
<xml_diff>
--- a/docs/GuidedRewriteClickbait_v9_cycle1.docx
+++ b/docs/GuidedRewriteClickbait_v9_cycle1.docx
@@ -4390,7 +4390,7 @@
         <w:rPr>
           <w:highlight w:val="yellow"/>
         </w:rPr>
-        <w:t xml:space="preserve">Table 12 shows the same behaviour across the full four-cell grid on three headlines: the engagement guide adds the targeted tactic, the clickbait brake pulls back the most sensational phrasing, and the dual setting balances the two.</w:t>
+        <w:t xml:space="preserve">Table 4 shows the same behaviour across the full four-cell grid on three headlines: the engagement guide adds the targeted tactic, the clickbait brake pulls back the most sensational phrasing, and the dual setting balances the two.</w:t>
       </w:r>
     </w:p>
     <w:p>
@@ -4408,7 +4408,7 @@
           <w:i/>
           <w:highlight w:val="yellow"/>
         </w:rPr>
-        <w:t>Table 12.</w:t>
+        <w:t>Table 4.</w:t>
       </w:r>
       <w:r>
         <w:rPr>
@@ -4433,7 +4433,7 @@
         <w:tblW w:type="pct" w:w="5000"/>
         <w:jc w:val="center"/>
         <w:tblLook w:firstRow="1" w:lastRow="0" w:firstColumn="0" w:lastColumn="0" w:noHBand="0" w:noVBand="0" w:val="0020"/>
-        <w:tblCaption w:val="Table 12. Controlled generation across the (α, β) grid: three source headlines each rewritten under the four ablation cells. The engagement guide (α) adds the targeted tactic, the clickbait brake (β) restrains sensational phrasing, and the dual setting balances the two."/>
+        <w:tblCaption w:val="Table 4. Controlled generation across the (α, β) grid: three source headlines each rewritten under the four ablation cells. The engagement guide (α) adds the targeted tactic, the clickbait brake (β) restrains sensational phrasing, and the dual setting balances the two."/>
         <w:tblLayout w:type="autofit"/>
         <w:tblBorders>
           <w:top w:val="single" w:sz="10" w:color="4F6272"/>
@@ -5438,7 +5438,7 @@
           <w:i/>
           <w:highlight w:val="yellow"/>
         </w:rPr>
-        <w:t>Table 4.</w:t>
+        <w:t>Table 5.</w:t>
       </w:r>
       <w:r>
         <w:rPr>
@@ -5463,7 +5463,7 @@
         <w:tblW w:type="pct" w:w="5000"/>
         <w:jc w:val="center"/>
         <w:tblLook w:firstRow="1" w:lastRow="0" w:firstColumn="0" w:lastColumn="0" w:noHBand="0" w:noVBand="0" w:val="0020"/>
-        <w:tblCaption w:val="Table 4. Prefix clickbait guide on external, human-authored corpora (95% bootstrap CI)."/>
+        <w:tblCaption w:val="Table 5. Prefix clickbait guide on external, human-authored corpora (95% bootstrap CI)."/>
         <w:tblLayout w:type="autofit"/>
         <w:tblBorders>
           <w:top w:val="single" w:sz="10" w:color="4F6272"/>
@@ -6048,7 +6048,7 @@
           <w:b/>
           <w:i/>
         </w:rPr>
-        <w:t>Figure 7.</w:t>
+        <w:t>Figure 5.</w:t>
       </w:r>
       <w:r>
         <w:rPr>
@@ -6143,7 +6143,7 @@
           <w:i/>
           <w:highlight w:val="yellow"/>
         </w:rPr>
-        <w:t>Table 5.</w:t>
+        <w:t>Table 6.</w:t>
       </w:r>
       <w:r>
         <w:rPr>
@@ -6168,7 +6168,7 @@
         <w:tblW w:type="pct" w:w="5000"/>
         <w:jc w:val="center"/>
         <w:tblLook w:firstRow="1" w:lastRow="0" w:firstColumn="0" w:lastColumn="0" w:noHBand="0" w:noVBand="0" w:val="0020"/>
-        <w:tblCaption w:val="Table 5. Four-cell dual-guidance ablation on 300 held-out headlines (n = 900 = 300 items × 3 tactic configurations). Clickbait and tactic realization use independent models; lower perplexity = more fluent. Parentheses give 95% percentile-bootstrap confidence intervals."/>
+        <w:tblCaption w:val="Table 6. Four-cell dual-guidance ablation on 300 held-out headlines (n = 900 = 300 items × 3 tactic configurations). Clickbait and tactic realization use independent models; lower perplexity = more fluent. Parentheses give 95% percentile-bootstrap confidence intervals."/>
         <w:tblLayout w:type="autofit"/>
         <w:tblBorders>
           <w:top w:val="single" w:sz="10" w:color="4F6272"/>
@@ -7259,7 +7259,7 @@
         <w:rPr>
           <w:highlight w:val="yellow"/>
         </w:rPr>
-        <w:t xml:space="preserve">Figure 5 shows the same two effects across the full α×β tuning grid: independent tactic alignment rises with the engagement weight α (left panel), while independent clickbait falls as the brake β increases (right panel). The two controls therefore act along separate axes, and the reported operating point (α = 4, β = 2) sits where tactic alignment is high and clickbait is near its minimum.</w:t>
+        <w:t xml:space="preserve">Figure 6 shows the same two effects across the full α×β tuning grid: independent tactic alignment rises with the engagement weight α (left panel), while independent clickbait falls as the brake β increases (right panel). The two controls therefore act along separate axes, and the reported operating point (α = 4, β = 2) sits where tactic alignment is high and clickbait is near its minimum.</w:t>
       </w:r>
     </w:p>
     <w:p>
@@ -7327,7 +7327,7 @@
           <w:b/>
           <w:i/>
         </w:rPr>
-        <w:t>Figure 5.</w:t>
+        <w:t>Figure 6.</w:t>
       </w:r>
       <w:r>
         <w:rPr>
@@ -7391,7 +7391,7 @@
           <w:i/>
           <w:highlight w:val="yellow"/>
         </w:rPr>
-        <w:t>Table 6.</w:t>
+        <w:t>Table 7.</w:t>
       </w:r>
       <w:r>
         <w:rPr>
@@ -7416,7 +7416,7 @@
         <w:tblW w:type="pct" w:w="5000"/>
         <w:jc w:val="center"/>
         <w:tblLook w:firstRow="1" w:lastRow="0" w:firstColumn="0" w:lastColumn="0" w:noHBand="0" w:noVBand="0" w:val="0020"/>
-        <w:tblCaption w:val="Table 6. Cross-method comparison (n = 900 per row). FUDGE is shown at its dual operating point (4, 2); DExperts and GeDi are shown across their steering strength to expose the engagement–clickbait coupling: as the single-axis baselines steer harder to realize the tactic, induced clickbait rises steeply and fidelity falls, whereas the dual brake holds induced clickbait low. BERTScore = fidelity to source; clickbait = independent detector; perplexity (median) = fluency. Parentheses give 95% percentile-bootstrap confidence intervals. DExperts is decoded with a repetition penalty (1.3), a no-repeat-three-gram constraint, and a headline-length cap."/>
+        <w:tblCaption w:val="Table 7. Cross-method comparison (n = 900 per row). FUDGE is shown at its dual operating point (4, 2); DExperts and GeDi are shown across their steering strength to expose the engagement–clickbait coupling: as the single-axis baselines steer harder to realize the tactic, induced clickbait rises steeply and fidelity falls, whereas the dual brake holds induced clickbait low. BERTScore = fidelity to source; clickbait = independent detector; perplexity (median) = fluency. Parentheses give 95% percentile-bootstrap confidence intervals. DExperts is decoded with a repetition penalty (1.3), a no-repeat-three-gram constraint, and a headline-length cap."/>
         <w:tblLayout w:type="autofit"/>
         <w:tblBorders>
           <w:top w:val="single" w:sz="10" w:color="4F6272"/>
@@ -8637,7 +8637,7 @@
         <w:rPr>
           <w:highlight w:val="yellow"/>
         </w:rPr>
-        <w:t xml:space="preserve">At matched independent tactic realization (≈ 0.50; the steered methods are statistically indistinguishable on this axis: FUDGE vs DExperts p = 0.44, vs GeDi p = 0.38), the methods differ in how they control the engagement-versus-clickbait trade-off. The single-axis baselines expose one steering strength that couples the two: as that strength increases, the external-detector clickbait probability rises steeply (DExperts 0.06, 0.13, 0.51, 0.73; GeDi up to 0.59) while BERTScore falls (DExperts 0.26 to 0.00; GeDi to 0.06), because they have no separate lever to lower clickbait once the engagement level is set. At low steering these baselines are competitive, reaching the tactic at low clickbait and high fidelity; what they lack is an independent clickbait control. The dual guide adds exactly that: the β brake holds the independent clickbait probability at 0.057 at the operating point and is adjusted separately from the engagement weight α (the α×β control surface, Figure 5). Figure 6 makes the contrast explicit: the dual-control line stays flat in induced clickbait across the steering range while the single-axis methods climb. This decoupling of engagement from clickbait is the dual-control contribution. DExperts is decoded with a repetition penalty (1.3), a no-repeat-three-gram constraint, and a headline-length cap matched to the base generator, which keep the product-of-experts baseline fluent under strong steering.</w:t>
+        <w:t xml:space="preserve">At matched independent tactic realization (≈ 0.50; the steered methods are statistically indistinguishable on this axis: FUDGE vs DExperts p = 0.44, vs GeDi p = 0.38), the methods differ in how they control the engagement-versus-clickbait trade-off. The single-axis baselines expose one steering strength that couples the two: as that strength increases, the external-detector clickbait probability rises steeply (DExperts 0.06, 0.13, 0.51, 0.73; GeDi up to 0.59) while BERTScore falls (DExperts 0.26 to 0.00; GeDi to 0.06), because they have no separate lever to lower clickbait once the engagement level is set. At low steering these baselines are competitive, reaching the tactic at low clickbait and high fidelity; what they lack is an independent clickbait control. The dual guide adds exactly that: the β brake holds the independent clickbait probability at 0.057 at the operating point and is adjusted separately from the engagement weight α (the α×β control surface, Figure 6). Figure 7 makes the contrast explicit: the dual-control line stays flat in induced clickbait across the steering range while the single-axis methods climb. This decoupling of engagement from clickbait is the dual-control contribution. DExperts is decoded with a repetition penalty (1.3), a no-repeat-three-gram constraint, and a headline-length cap matched to the base generator, which keep the product-of-experts baseline fluent under strong steering.</w:t>
       </w:r>
     </w:p>
     <w:p>
@@ -8705,7 +8705,7 @@
           <w:b/>
           <w:i/>
         </w:rPr>
-        <w:t>Figure 6.</w:t>
+        <w:t>Figure 7.</w:t>
       </w:r>
       <w:r>
         <w:rPr>
@@ -8738,7 +8738,7 @@
           <w:i/>
           <w:highlight w:val="yellow"/>
         </w:rPr>
-        <w:t>Table 11.</w:t>
+        <w:t>Table 8.</w:t>
       </w:r>
       <w:r>
         <w:rPr>
@@ -8763,7 +8763,7 @@
         <w:tblW w:type="pct" w:w="5000"/>
         <w:jc w:val="center"/>
         <w:tblLook w:firstRow="1" w:lastRow="0" w:firstColumn="0" w:lastColumn="0" w:noHBand="0" w:noVBand="0" w:val="0020"/>
-        <w:tblCaption w:val="Table 11. Qualitative cross-method comparison on two source headlines at comparable tactic realization (DExperts α = 2, GeDi ω = 10). The dual guide holds the independent clickbait probability near zero while staying faithful to the source; the single-axis baselines reach the same tactic only with markedly higher induced clickbait and lower fidelity. Independent detector for clickbait."/>
+        <w:tblCaption w:val="Table 8. Qualitative cross-method comparison on two source headlines at comparable tactic realization (DExperts α = 2, GeDi ω = 10). The dual guide holds the independent clickbait probability near zero while staying faithful to the source; the single-axis baselines reach the same tactic only with markedly higher induced clickbait and lower fidelity. Independent detector for clickbait."/>
         <w:tblLayout w:type="autofit"/>
         <w:tblBorders>
           <w:top w:val="single" w:sz="10" w:color="4F6272"/>
@@ -9834,7 +9834,7 @@
         <w:rPr>
           <w:highlight w:val="yellow"/>
         </w:rPr>
-        <w:t xml:space="preserve">We complement the automatic metrics with a large annotation study using three independent human annotators applying a fixed rubric. Two studies are reported. (C1) Rubric validation over 150 headlines yields substantial inter-annotator agreement (mean Fleiss κ = 0.70) and a mean intended-vs-consensus tactic F1 of 0.44, consistent with the graded, fine-grained nature of the tactics and the attribute model's own recoverability. (C2) Rewrite-quality scoring over 1,500 rewrites across all methods yields good-to-excellent reliability (ICC(2,k) 0.82–0.94); annotator faithfulness ratings correlate with automatic BERTScore (Spearman ρ = 0.61, n = 1500), validating the automatic fidelity metric. The human ratings confirm the two designed effects with item-matched significance (Table 7, 1–5 scale): the clickbait brake lowers perceived clickbait (dual 2.03 versus no-guidance 2.61, p = 1×10⁻⁷) and the dual guidance is rated more faithful than the no-guidance baseline (3.58 versus 2.89, p = 1×10⁻⁷). Against the decoding-time baselines the dual guide is rated substantially more faithful (3.58 versus DExperts 2.54 and GeDi 2.27, both p &lt; 1×10⁻¹³) and lower in perceived clickbait than DExperts (2.03 versus 3.32, p &lt; 1×10⁻¹⁶). The complete rating data are released as a spreadsheet in the deposit.</w:t>
+        <w:t xml:space="preserve">We complement the automatic metrics with a large annotation study using three independent human annotators applying a fixed rubric. Two studies are reported. (C1) Rubric validation over 150 headlines yields substantial inter-annotator agreement (mean Fleiss κ = 0.70) and a mean intended-vs-consensus tactic F1 of 0.44, consistent with the graded, fine-grained nature of the tactics and the attribute model's own recoverability. (C2) Rewrite-quality scoring over 1,500 rewrites across all methods yields good-to-excellent reliability (ICC(2,k) 0.82–0.94); annotator faithfulness ratings correlate with automatic BERTScore (Spearman ρ = 0.61, n = 1500), validating the automatic fidelity metric. The human ratings confirm the two designed effects with item-matched significance (Table 9, 1–5 scale): the clickbait brake lowers perceived clickbait (dual 2.03 versus no-guidance 2.61, p = 1×10⁻⁷) and the dual guidance is rated more faithful than the no-guidance baseline (3.58 versus 2.89, p = 1×10⁻⁷). Against the decoding-time baselines the dual guide is rated substantially more faithful (3.58 versus DExperts 2.54 and GeDi 2.27, both p &lt; 1×10⁻¹³) and lower in perceived clickbait than DExperts (2.03 versus 3.32, p &lt; 1×10⁻¹⁶). The complete rating data are released as a spreadsheet in the deposit.</w:t>
       </w:r>
     </w:p>
     <w:p>
@@ -9852,7 +9852,7 @@
           <w:i/>
           <w:highlight w:val="yellow"/>
         </w:rPr>
-        <w:t>Table 7.</w:t>
+        <w:t>Table 9.</w:t>
       </w:r>
       <w:r>
         <w:rPr>
@@ -9877,7 +9877,7 @@
         <w:tblW w:type="pct" w:w="5000"/>
         <w:jc w:val="center"/>
         <w:tblLook w:firstRow="1" w:lastRow="0" w:firstColumn="0" w:lastColumn="0" w:noHBand="0" w:noVBand="0" w:val="0020"/>
-        <w:tblCaption w:val="Table 7. Human rater-based evaluation of rewrite quality (mean rating, 1–5; 95% bootstrap CI). Ratings from three independent annotators over 1,500 rewrites; higher clickbait = more clickbaity. The brake lowers perceived clickbait and the dual guidance is rated most faithful among the steered methods."/>
+        <w:tblCaption w:val="Table 9. Human rater-based evaluation of rewrite quality (mean rating, 1–5; 95% bootstrap CI). Ratings from three independent annotators over 1,500 rewrites; higher clickbait = more clickbaity. The brake lowers perceived clickbait and the dual guidance is rated most faithful among the steered methods."/>
         <w:tblLayout w:type="autofit"/>
         <w:tblBorders>
           <w:top w:val="single" w:sz="10" w:color="4F6272"/>
@@ -10775,7 +10775,7 @@
         <w:rPr>
           <w:highlight w:val="yellow"/>
         </w:rPr>
-        <w:t xml:space="preserve">Table 8 reports the calibration behind this analysis. On labelled controls the new-fact judge assigns a rate of 0.025 to faithful paraphrases and to faithful rhetorical questions, but 1.00 to fact-injected controls, separating genuine fabrication from rhetorical framing at AUROC ≈ 1.0. NLI entailment mirrors this (AUROC 0.997–1.00 for faithful vs unfaithful) but, unlike the fabrication judge, scores faithful questions low (0.20), confirming that the interrogative form depresses entailment without adding content.</w:t>
+        <w:t xml:space="preserve">Table 10 reports the calibration behind this analysis. On labelled controls the new-fact judge assigns a rate of 0.025 to faithful paraphrases and to faithful rhetorical questions, but 1.00 to fact-injected controls, separating genuine fabrication from rhetorical framing at AUROC ≈ 1.0. NLI entailment mirrors this (AUROC 0.997–1.00 for faithful vs unfaithful) but, unlike the fabrication judge, scores faithful questions low (0.20), confirming that the interrogative form depresses entailment without adding content.</w:t>
       </w:r>
     </w:p>
     <w:p>
@@ -10793,7 +10793,7 @@
           <w:i/>
           <w:highlight w:val="yellow"/>
         </w:rPr>
-        <w:t>Table 8.</w:t>
+        <w:t>Table 10.</w:t>
       </w:r>
       <w:r>
         <w:rPr>
@@ -10818,7 +10818,7 @@
         <w:tblW w:type="pct" w:w="5000"/>
         <w:jc w:val="center"/>
         <w:tblLook w:firstRow="1" w:lastRow="0" w:firstColumn="0" w:lastColumn="0" w:noHBand="0" w:noVBand="0" w:val="0020"/>
-        <w:tblCaption w:val="Table 8. Calibration of the new-fact (fabrication) judge and of NLI entailment on labelled controls (n = 120). The judge separates injected facts from faithful rewrites at AUROC ≈ 1.0, and NLI separates faithful from unfaithful rewrites at AUROC 0.997–1.00. Faithful rhetorical questions add no new facts (0.025) yet score low on entailment (0.20), which is why the question form depresses NLI without introducing content."/>
+        <w:tblCaption w:val="Table 10. Calibration of the new-fact (fabrication) judge and of NLI entailment on labelled controls (n = 120). The judge separates injected facts from faithful rewrites at AUROC ≈ 1.0, and NLI separates faithful from unfaithful rewrites at AUROC 0.997–1.00. Faithful rhetorical questions add no new facts (0.025) yet score low on entailment (0.20), which is why the question form depresses NLI without introducing content."/>
         <w:tblLayout w:type="autofit"/>
         <w:tblBorders>
           <w:top w:val="single" w:sz="10" w:color="4F6272"/>
@@ -11228,7 +11228,7 @@
         <w:rPr>
           <w:highlight w:val="yellow"/>
         </w:rPr>
-        <w:t xml:space="preserve">To test whether the framework generalizes beyond Reuters newswire, we apply the same guides, at the same operating point (α = 4, β = 2), to 150 human-authored, non-Reuters neutral headlines: the non-clickbait half of the Chakraborty corpus, spanning disasters, culture, and financial markets rather than political newswire. The two guides reproduce their designed, opposite effects on this different register (Table 9). The engagement guide raises tactic realization (guide-based, 0.10 → 0.16) and, with it, induced clickbait (0.05 → 0.10), while the clickbait brake lowers the independent clickbait score back from 0.097 to 0.061 and improves entailment, exactly as in-domain. Source fidelity is preserved (BERTScore 0.22–0.28, matching the in-domain 0.25–0.28) and induced clickbait stays in the same low regime (below 0.10 throughout). Perplexity is modestly higher than in-domain (266–368 vs 175–275), reflecting the greater lexical variety of this out-of-domain set, but the ordering across the four cells is unchanged. The dual-control mechanism is therefore not specific to the Reuters training domain.</w:t>
+        <w:t xml:space="preserve">To test whether the framework generalizes beyond Reuters newswire, we apply the same guides, at the same operating point (α = 4, β = 2), to 150 human-authored, non-Reuters neutral headlines: the non-clickbait half of the Chakraborty corpus, spanning disasters, culture, and financial markets rather than political newswire. The two guides reproduce their designed, opposite effects on this different register (Table 11). The engagement guide raises tactic realization (guide-based, 0.10 → 0.16) and, with it, induced clickbait (0.05 → 0.10), while the clickbait brake lowers the independent clickbait score back from 0.097 to 0.061 and improves entailment, exactly as in-domain. Source fidelity is preserved (BERTScore 0.22–0.28, matching the in-domain 0.25–0.28) and induced clickbait stays in the same low regime (below 0.10 throughout). Perplexity is modestly higher than in-domain (266–368 vs 175–275), reflecting the greater lexical variety of this out-of-domain set, but the ordering across the four cells is unchanged. The dual-control mechanism is therefore not specific to the Reuters training domain.</w:t>
       </w:r>
     </w:p>
     <w:p>
@@ -11246,7 +11246,7 @@
           <w:i/>
           <w:highlight w:val="yellow"/>
         </w:rPr>
-        <w:t>Table 9.</w:t>
+        <w:t>Table 11.</w:t>
       </w:r>
       <w:r>
         <w:rPr>
@@ -11271,7 +11271,7 @@
         <w:tblW w:type="pct" w:w="5000"/>
         <w:jc w:val="center"/>
         <w:tblLook w:firstRow="1" w:lastRow="0" w:firstColumn="0" w:lastColumn="0" w:noHBand="0" w:noVBand="0" w:val="0020"/>
-        <w:tblCaption w:val="Table 9. Cross-domain generalization: the same guides at the same operating point applied to 150 human-authored, non-Reuters neutral headlines (non-clickbait half of the Chakraborty corpus). Clickbait, BERTScore, NLI and perplexity are independent; the tactic column is the guide-based (circular) score, as the LLM judge was not run in this generality check. Parentheses give 95% bootstrap CIs (n = 450 per cell)."/>
+        <w:tblCaption w:val="Table 11. Cross-domain generalization: the same guides at the same operating point applied to 150 human-authored, non-Reuters neutral headlines (non-clickbait half of the Chakraborty corpus). Clickbait, BERTScore, NLI and perplexity are independent; the tactic column is the guide-based (circular) score, as the LLM judge was not run in this generality check. Parentheses give 95% bootstrap CIs (n = 450 per cell)."/>
         <w:tblLayout w:type="autofit"/>
         <w:tblBorders>
           <w:top w:val="single" w:sz="10" w:color="4F6272"/>
@@ -12214,7 +12214,7 @@
         <w:rPr>
           <w:highlight w:val="yellow"/>
         </w:rPr>
-        <w:t xml:space="preserve">We test model-agnosticism by swapping the base generator to Qwen2.5-7B-Instruct[20], a different model family, keeping the guides and the operating point (α = 4, β = 2) unchanged and applying the language-consistency constraint of Section 3.6. Llama-3-8B remains the primary generator for comparability with the decoding-time baselines; this experiment shows that the same guides and operating point transfer to a different model family, and Qwen's higher BERTScore reflects its more conservative, closer-to-source rewriting. The dual control transfers cleanly to Qwen (Table 10): the engagement guide raises tactic realization (0.31 → 0.36); source fidelity and fluency are maintained and in fact exceed the Llama-3 configuration (BERTScore 0.43–0.47 versus 0.25–0.28; perplexity 133–163); induced clickbait stays low across all cells (below 0.06); and the clickbait brake holds the brake-only cell at or below the no-guidance baseline (0.033 versus 0.034). The two guides retain their designed, opposite effects on a second base-model family at the same operating point.</w:t>
+        <w:t xml:space="preserve">We test model-agnosticism by swapping the base generator to Qwen2.5-7B-Instruct[20], a different model family, keeping the guides and the operating point (α = 4, β = 2) unchanged and applying the language-consistency constraint of Section 3.6. Llama-3-8B remains the primary generator for comparability with the decoding-time baselines; this experiment shows that the same guides and operating point transfer to a different model family, and Qwen's higher BERTScore reflects its more conservative, closer-to-source rewriting. The dual control transfers cleanly to Qwen (Table 12): the engagement guide raises tactic realization (0.31 → 0.36); source fidelity and fluency are maintained and in fact exceed the Llama-3 configuration (BERTScore 0.43–0.47 versus 0.25–0.28; perplexity 133–163); induced clickbait stays low across all cells (below 0.06); and the clickbait brake holds the brake-only cell at or below the no-guidance baseline (0.033 versus 0.034). The two guides retain their designed, opposite effects on a second base-model family at the same operating point.</w:t>
       </w:r>
     </w:p>
     <w:p>
@@ -12232,7 +12232,7 @@
           <w:i/>
           <w:highlight w:val="yellow"/>
         </w:rPr>
-        <w:t>Table 10.</w:t>
+        <w:t>Table 12.</w:t>
       </w:r>
       <w:r>
         <w:rPr>
@@ -12257,7 +12257,7 @@
         <w:tblW w:type="pct" w:w="5000"/>
         <w:jc w:val="center"/>
         <w:tblLook w:firstRow="1" w:lastRow="0" w:firstColumn="0" w:lastColumn="0" w:noHBand="0" w:noVBand="0" w:val="0020"/>
-        <w:tblCaption w:val="Table 10. Transfer to a second base generator (Qwen2.5-7B-Instruct), same guides and operating point, with the language-consistency constraint for multilingual generators. Independent metrics; the tactic column is the guide-based (circular) score. Parentheses give 95% bootstrap CIs (n = 450 per cell (786 for the α = 4, β = 0 cell))."/>
+        <w:tblCaption w:val="Table 12. Transfer to a second base generator (Qwen2.5-7B-Instruct), same guides and operating point, with the language-consistency constraint for multilingual generators. Independent metrics; the tactic column is the guide-based (circular) score. Parentheses give 95% bootstrap CIs (n = 450 per cell (786 for the α = 4, β = 0 cell))."/>
         <w:tblLayout w:type="autofit"/>
         <w:tblBorders>
           <w:top w:val="single" w:sz="10" w:color="4F6272"/>
@@ -13246,7 +13246,7 @@
         <w:rPr>
           <w:highlight w:val="yellow"/>
         </w:rPr>
-        <w:t xml:space="preserve">Several limitations frame the empirical scope of the current work. First, the synthetic corpus is built exclusively from the real Reuters political and world-news headlines described in Section 3.2 (the genuine-news half of the ISOT dataset); extending both guide models to tabloid, entertainment, and non-English registers remains open, although Section 4.12 shows that the trained guides already transfer at inference to a different, human-authored, non-Reuters English-news register with the same directional effects; the results in Section 4 should otherwise be read within this domain. Second, the neutrality of the Reuters source headlines is quantified rather than assumed: the independent detector flags only 0.61% of the source pool (Section 4.7). Third, the external evaluation on the Webis Clickbait Corpus 2017[3] and the Chakraborty et al.[2] corpus (Section 4.5) measures the synthetic-to-human distribution shift directly, with AUROC 0.955 on clean human clickbait and 0.740 on the noisier graded corpus. Fourth, the decoding-time guides operate as amplifiers on top of the prompt: they deliver their largest effect when the prompt names the target tactic (on the 40-item α–β tuning sweep, independent tactic realization +0.075, from 0.44 to 0.51, as α goes 0→4; on the 300-item held-out set the same contrast is +0.03, 0.48 to 0.51, Table 5) and a smaller standalone shift under a tactic-agnostic prompt (+0.025, from 0.30 to 0.33), consistent with top-k rescoring reweighting tokens the base model already proposes; the framework is therefore designed and evaluated as prompt-plus-guidance. Fifth, all three decoding-time methods realize the target tactic to a comparable degree, and the single-axis baselines match the dual guide's fidelity at low steering; the dual guide's distinctive capability is the independent clickbait brake, which decouples engagement from clickbait so that induced clickbait stays low as engagement rises, while the single-axis baselines raise induced clickbait as they steer toward the same tactic (Section 4.9). All quantitative comparisons use item-matched significance testing with 95% bootstrap confidence intervals.</w:t>
+        <w:t xml:space="preserve">Several limitations frame the empirical scope of the current work. First, the synthetic corpus is built exclusively from the real Reuters political and world-news headlines described in Section 3.2 (the genuine-news half of the ISOT dataset); extending both guide models to tabloid, entertainment, and non-English registers remains open, although Section 4.12 shows that the trained guides already transfer at inference to a different, human-authored, non-Reuters English-news register with the same directional effects; the results in Section 4 should otherwise be read within this domain. Second, the neutrality of the Reuters source headlines is quantified rather than assumed: the independent detector flags only 0.61% of the source pool (Section 4.7). Third, the external evaluation on the Webis Clickbait Corpus 2017[3] and the Chakraborty et al.[2] corpus (Section 4.5) measures the synthetic-to-human distribution shift directly, with AUROC 0.955 on clean human clickbait and 0.740 on the noisier graded corpus. Fourth, the decoding-time guides operate as amplifiers on top of the prompt: they deliver their effect when the prompt names the target tactic (on the 40-item α–β tuning sweep, independent tactic realization +0.075, from 0.44 to 0.51, as α goes 0→4; on the 300-item held-out set the same contrast is +0.03, 0.48 to 0.51, Table 6), consistent with top-k rescoring reweighting tokens the base model already proposes; the framework is therefore designed and evaluated as prompt-plus-guidance. Fifth, all three decoding-time methods realize the target tactic to a comparable degree, and the single-axis baselines match the dual guide's fidelity at low steering; the dual guide's distinctive capability is the independent clickbait brake, which decouples engagement from clickbait so that induced clickbait stays low as engagement rises, while the single-axis baselines raise induced clickbait as they steer toward the same tactic (Section 4.9). All quantitative comparisons use item-matched significance testing with 95% bootstrap confidence intervals.</w:t>
       </w:r>
     </w:p>
     <w:p>

</xml_diff>

<commit_message>
Renumber references to citation-sequence order; highlight full abstract
- References renumbered to order of first appearance (SR requirement): first
  in-text citation is now [1] (was [9]); citations run [1]..[26] ascending,
  reference list reordered to match; combined cite [17,18]->[19,20].
  Verified: full citation order 1..26, no dangling refs.
- All in-text citations normalized to literal [n] (fixes citations that sat
  inside M() spans and rendered literally).
- Abstract: highlight the full rewritten paragraph (only the results sentence
  was marked before; the reworded opening was not).
- Regenerated paper DOCX (430 highlighted runs, 7 figs) + PDF.

Co-Authored-By: Claude Opus 4.8 <noreply@anthropic.com>
</commit_message>
<xml_diff>
--- a/docs/GuidedRewriteClickbait_v9_cycle1.docx
+++ b/docs/GuidedRewriteClickbait_v9_cycle1.docx
@@ -162,22 +162,10 @@
         <w:widowControl w:val="1"/>
       </w:pPr>
       <w:r>
-        <w:t xml:space="preserve">Optimizing news headlines for reader engagement is often conflated with clickbait, producing exaggerated or misleading phrasing that erodes editorial trust. We reframe clickbait not as a separate category but as the disproportionate amplification of otherwise legitimate engagement cues, and cast headline rewriting as a controllable generation problem in which chosen engagement attributes are strengthened under explicit faithfulness constraints. We steer a large language model at inference time with two lightweight guide models: a clickbait scorer providing negative guidance and an engagement-attribute model providing positive guidance, combined during decoding so engagement can be increased while clickbait is restrained. Both guides are trained on neutral news headlines and their synthetically amplified variants and transfer to entirely human-authored clickbait corpora.</w:t>
-      </w:r>
-      <w:r>
-        <w:t xml:space="preserve"> </w:t>
-      </w:r>
-      <w:r>
         <w:rPr>
           <w:highlight w:val="yellow"/>
         </w:rPr>
-        <w:t xml:space="preserve">On held-out headlines, an ablation shows the two guides exert independent, opposite effects, and benchmarked against the decoding-time control methods DExperts and GeDi the dual guide adds an independent clickbait brake, a dedicated lever that lowers induced clickbait at a chosen engagement level and that single-axis methods lack. Independent automatic metrics and a three-annotator human study confirm higher faithfulness and lower induced clickbait than these baselines.</w:t>
-      </w:r>
-      <w:r>
-        <w:t xml:space="preserve"> </w:t>
-      </w:r>
-      <w:r>
-        <w:t xml:space="preserve">The framework supports responsible headline optimization in journalism.</w:t>
+        <w:t xml:space="preserve">Optimizing news headlines for reader engagement is often conflated with clickbait, producing exaggerated or misleading phrasing that erodes editorial trust. We reframe clickbait not as a separate category but as the disproportionate amplification of otherwise legitimate engagement cues, and cast headline rewriting as a controllable generation problem in which chosen engagement attributes are strengthened under explicit faithfulness constraints. We steer a large language model at inference time with two lightweight guide models: a clickbait scorer providing negative guidance and an engagement-attribute model providing positive guidance, combined during decoding so engagement can be increased while clickbait is restrained. Both guides are trained on neutral news headlines and their synthetically amplified variants and transfer to entirely human-authored clickbait corpora. On held-out headlines, an ablation shows the two guides exert independent, opposite effects, and benchmarked against the decoding-time control methods DExperts and GeDi the dual guide adds an independent clickbait brake, a dedicated lever that lowers induced clickbait at a chosen engagement level and that single-axis methods lack. Independent automatic metrics and a three-annotator human study confirm higher faithfulness and lower induced clickbait than these baselines. The framework supports responsible headline optimization in journalism.</w:t>
       </w:r>
     </w:p>
     <w:p>
@@ -224,7 +212,7 @@
         <w:widowControl w:val="1"/>
       </w:pPr>
       <w:r>
-        <w:t xml:space="preserve">Digital news headlines function as the primary entry point to journalistic content and strongly influence readers' decisions about what to consume. In contemporary, algorithmically mediated information environments, headlines must attract attention within a narrow cognitive window while remaining faithful to the substance of the underlying article. This creates a structural tension between engagement and editorial integrity. In practice, this tension has encouraged the use of clickbait-like strategies, which can increase short-term attention but are often associated with reader frustration, unmet expectations, and long-term erosion of trust in news outlets[9].</w:t>
+        <w:t xml:space="preserve">Digital news headlines function as the primary entry point to journalistic content and strongly influence readers' decisions about what to consume. In contemporary, algorithmically mediated information environments, headlines must attract attention within a narrow cognitive window while remaining faithful to the substance of the underlying article. This creates a structural tension between engagement and editorial integrity. In practice, this tension has encouraged the use of clickbait-like strategies, which can increase short-term attention but are often associated with reader frustration, unmet expectations, and long-term erosion of trust in news outlets[1].</w:t>
       </w:r>
     </w:p>
     <w:p>
@@ -248,7 +236,7 @@
         <w:widowControl w:val="1"/>
       </w:pPr>
       <w:r>
-        <w:t xml:space="preserve">To make this distinction explicit, we define an engagement-attribute rubric that separates clickbait-oriented from clickability-oriented realizations of common headline mechanisms. The full comparison is presented in Table 1 (Section 3.1), where these mechanisms are operationalized for synthetic data generation and controllable guidance. This comparison motivates a shift from binary classification to a continuous, controllable view of engagement. We therefore adopt a generative rather than purely discriminative perspective and posit two core assumptions. First, clickbait and clickability differ in degree rather than kind: clickbait arises when otherwise legitimate engagement mechanisms are amplified beyond proportionate or editorially acceptable levels. Second, engagement can be decomposed into controllable linguistic attributes, allowing individual mechanisms (e.g., curiosity, specificity, or framing) to be selectively strengthened or attenuated while maintaining explicit constraints on semantic fidelity and overall emphasis. This rubric extends prior attribute-based clickbait attribution work[11] by explicitly pairing clickbait and clickability interpretations of each mechanism.</w:t>
+        <w:t xml:space="preserve">To make this distinction explicit, we define an engagement-attribute rubric that separates clickbait-oriented from clickability-oriented realizations of common headline mechanisms. The full comparison is presented in Table 1 (Section 3.1), where these mechanisms are operationalized for synthetic data generation and controllable guidance. This comparison motivates a shift from binary classification to a continuous, controllable view of engagement. We therefore adopt a generative rather than purely discriminative perspective and posit two core assumptions. First, clickbait and clickability differ in degree rather than kind: clickbait arises when otherwise legitimate engagement mechanisms are amplified beyond proportionate or editorially acceptable levels. Second, engagement can be decomposed into controllable linguistic attributes, allowing individual mechanisms (e.g., curiosity, specificity, or framing) to be selectively strengthened or attenuated while maintaining explicit constraints on semantic fidelity and overall emphasis. This rubric extends prior attribute-based clickbait attribution work[2] by explicitly pairing clickbait and clickability interpretations of each mechanism.</w:t>
       </w:r>
     </w:p>
     <w:p>
@@ -269,7 +257,7 @@
         <w:rPr>
           <w:highlight w:val="yellow"/>
         </w:rPr>
-        <w:t xml:space="preserve">using Meta-Llama-3-8B-Instruct[19] as the base generator</w:t>
+        <w:t xml:space="preserve">using Meta-Llama-3-8B-Instruct[3] as the base generator</w:t>
       </w:r>
       <w:r>
         <w:t xml:space="preserve">, guided at inference time by auxiliary models. The LLM is steered by two complementary signals: a BERT-based clickbait scoring model that provides negative guidance to penalize excessive stylistic amplification, and a BERT-based engagement-attribute model that provides positive guidance aligned with specified clickability objectives. By integrating these signals within a guided decoding paradigm, the framework enables fine-grained control over both the degree and type of engagement expressed in rewritten headlines, supporting responsible engagement enhancement without semantic distortion or disproportionate emphasis.</w:t>
@@ -451,7 +439,7 @@
         <w:widowControl w:val="1"/>
       </w:pPr>
       <w:r>
-        <w:t xml:space="preserve">Research on clickbait detection has progressed from feature-engineered classifiers to transformer-based and more interpretable frameworks. Early studies by Biyani et al.[1] and Chakraborty et al.[2] established that clickbait can be detected through lexical, stylistic, and structural cues, while Potthast et al.[3] standardized the task through the Webis Clickbait Corpus 2017 and the Clickbait Challenge, enabling both binary and graded modeling of clickbait strength.</w:t>
+        <w:t xml:space="preserve">Research on clickbait detection has progressed from feature-engineered classifiers to transformer-based and more interpretable frameworks. Early studies by Biyani et al.[4] and Chakraborty et al.[5] established that clickbait can be detected through lexical, stylistic, and structural cues, while Potthast et al.[6] standardized the task through the Webis Clickbait Corpus 2017 and the Clickbait Challenge, enabling both binary and graded modeling of clickbait strength.</w:t>
       </w:r>
     </w:p>
     <w:p>
@@ -463,7 +451,7 @@
         <w:widowControl w:val="1"/>
       </w:pPr>
       <w:r>
-        <w:t xml:space="preserve">The field has since expanded in both scope and methodology. As reviewed in ref.[4], clickbait research now spans not only detection algorithms, but also semantic manipulation, curiosity mechanisms, and credibility effects. Methodologically, recent work has shifted toward deep learning and pretrained language models. For example, ref.[5] reports strong performance with a RoBERTa-Large-based detector and complements classification with LIME and SHAP for interpretability, and ref.[6] extends the task to Urdu and highlights the value of sentence embeddings in low-resource settings.</w:t>
+        <w:t xml:space="preserve">The field has since expanded in both scope and methodology. As reviewed in ref.[7], clickbait research now spans not only detection algorithms, but also semantic manipulation, curiosity mechanisms, and credibility effects. Methodologically, recent work has shifted toward deep learning and pretrained language models. For example, ref.[8] reports strong performance with a RoBERTa-Large-based detector and complements classification with LIME and SHAP for interpretability, and ref.[9] extends the task to Urdu and highlights the value of sentence embeddings in low-resource settings.</w:t>
       </w:r>
     </w:p>
     <w:p>
@@ -475,7 +463,7 @@
         <w:widowControl w:val="1"/>
       </w:pPr>
       <w:r>
-        <w:t xml:space="preserve">Recent studies also explore more data-efficient and LLM-oriented paradigms. For instance, ref.[7] shows that strong results can be achieved from headline text alone, even with very limited labeled data, whereas ref.[8] finds that zero-shot and few-shot LLMs remain competitive and multilingual but still lag behind task-specific fine-tuned or prompt-tuned models. Together, these studies indicate that headline-level clickbait detection benefits from explicit supervision and task-adapted modeling rather than relying solely on general-purpose LLM inference.</w:t>
+        <w:t xml:space="preserve">Recent studies also explore more data-efficient and LLM-oriented paradigms. For instance, ref.[10] shows that strong results can be achieved from headline text alone, even with very limited labeled data, whereas ref.[11] finds that zero-shot and few-shot LLMs remain competitive and multilingual but still lag behind task-specific fine-tuned or prompt-tuned models. Together, these studies indicate that headline-level clickbait detection benefits from explicit supervision and task-adapted modeling rather than relying solely on general-purpose LLM inference.</w:t>
       </w:r>
     </w:p>
     <w:p>
@@ -487,7 +475,7 @@
         <w:widowControl w:val="1"/>
       </w:pPr>
       <w:r>
-        <w:t xml:space="preserve">At the same time, recent work suggests that clickbait should not be treated as a purely binary phenomenon. For example, ref.[9] shows that headlines can be too vague or too explicit, and ref.[10] demonstrates that explicit informativeness features improve both performance and interpretability. Finally, ref.[11] moves beyond binary detection toward attribution. Collectively, this line of work motivates treating clickbait as a graded, explainable, and attribute-driven phenomenon, which directly aligns with the present paper's controllable rewriting perspective.</w:t>
+        <w:t xml:space="preserve">At the same time, recent work suggests that clickbait should not be treated as a purely binary phenomenon. For example, ref.[1] shows that headlines can be too vague or too explicit, and ref.[12] demonstrates that explicit informativeness features improve both performance and interpretability. Finally, ref.[2] moves beyond binary detection toward attribution. Collectively, this line of work motivates treating clickbait as a graded, explainable, and attribute-driven phenomenon, which directly aligns with the present paper's controllable rewriting perspective.</w:t>
       </w:r>
     </w:p>
     <w:bookmarkEnd w:id="12"/>
@@ -512,7 +500,7 @@
         <w:widowControl w:val="1"/>
       </w:pPr>
       <w:r>
-        <w:t xml:space="preserve">In parallel with advances in detection, a growing body of work has explored controllable text generation, aiming to steer language model outputs toward desired attributes such as style, sentiment, topic, or level of sensationalism. Early approaches emphasized training-time control. Conditional language models explicitly incorporate control variables during training, enabling the generator to condition its output on metadata or attribute labels. A prominent example is CTRL[12], a large-scale transformer trained with control codes that specify domains, styles, or other high-level properties.</w:t>
+        <w:t xml:space="preserve">In parallel with advances in detection, a growing body of work has explored controllable text generation, aiming to steer language model outputs toward desired attributes such as style, sentiment, topic, or level of sensationalism. Early approaches emphasized training-time control. Conditional language models explicitly incorporate control variables during training, enabling the generator to condition its output on metadata or attribute labels. A prominent example is CTRL[13], a large-scale transformer trained with control codes that specify domains, styles, or other high-level properties.</w:t>
       </w:r>
     </w:p>
     <w:p>
@@ -536,7 +524,7 @@
         <w:widowControl w:val="1"/>
       </w:pPr>
       <w:r>
-        <w:t xml:space="preserve">More recently, research has increasingly focused on inference-time control methods that operate on a fixed, pretrained language model, avoiding full retraining. These approaches augment the decoding process with auxiliary models or signals that bias token selection. Plug-and-Play Language Models[13] exemplify this strategy by combining a frozen generator with lightweight attribute classifiers. GeDi[14] adopts a probabilistic perspective, using smaller generative models as discriminators and applying Bayes' rule to reweight the token distribution of a larger generator. Similarly, DExperts[15] frames control as a product-of-experts problem, combining an "expert" model trained on desirable text with an "anti-expert" trained on undesirable text.</w:t>
+        <w:t xml:space="preserve">More recently, research has increasingly focused on inference-time control methods that operate on a fixed, pretrained language model, avoiding full retraining. These approaches augment the decoding process with auxiliary models or signals that bias token selection. Plug-and-Play Language Models[14] exemplify this strategy by combining a frozen generator with lightweight attribute classifiers. GeDi[15] adopts a probabilistic perspective, using smaller generative models as discriminators and applying Bayes' rule to reweight the token distribution of a larger generator. Similarly, DExperts[16] frames control as a product-of-experts problem, combining an "expert" model trained on desirable text with an "anti-expert" trained on undesirable text.</w:t>
       </w:r>
       <w:r>
         <w:t xml:space="preserve"> </w:t>
@@ -557,7 +545,7 @@
         <w:widowControl w:val="1"/>
       </w:pPr>
       <w:r>
-        <w:t xml:space="preserve">FUDGE[16] provides a particularly elegant formulation for decoding. It trains a discriminator to predict whether a partially generated sequence will satisfy a target attribute; during decoding, the base language model's next-token probabilities are multiplied by the discriminator's estimate, yielding a principled Bayesian factorization of P(text | attribute) at inference time. This allows attribute control without modifying or fine-tuning the underlying generator, making such lightweight, modular discriminators well suited to applications that require subtle control, such as generating curiosity-inducing yet non-clickbait headlines.</w:t>
+        <w:t xml:space="preserve">FUDGE[17] provides a particularly elegant formulation for decoding. It trains a discriminator to predict whether a partially generated sequence will satisfy a target attribute; during decoding, the base language model's next-token probabilities are multiplied by the discriminator's estimate, yielding a principled Bayesian factorization of P(text | attribute) at inference time. This allows attribute control without modifying or fine-tuning the underlying generator, making such lightweight, modular discriminators well suited to applications that require subtle control, such as generating curiosity-inducing yet non-clickbait headlines.</w:t>
       </w:r>
     </w:p>
     <w:bookmarkEnd w:id="13"/>
@@ -2037,10 +2025,10 @@
         <w:rPr>
           <w:highlight w:val="yellow"/>
         </w:rPr>
-        <w:t xml:space="preserve">[21]</w:t>
-      </w:r>
-      <w:r>
-        <w:t xml:space="preserve">), starting from a curated collection of real, neutral news headlines. These are the genuine Reuters news-agency headlines contained in the True.csv file of the ISOT Fake News Dataset[17,18], a public benchmark whose True.csv half holds real, verified news (and whose Fake.csv half, which we do not use, holds fabricated stories). Because these are real newswire headlines, we treat them as neutral, fact-oriented baseline formulations and assign each an all-zero engagement-attribute vector.</w:t>
+        <w:t xml:space="preserve">[18]</w:t>
+      </w:r>
+      <w:r>
+        <w:t xml:space="preserve">), starting from a curated collection of real, neutral news headlines. These are the genuine Reuters news-agency headlines contained in the True.csv file of the ISOT Fake News Dataset[19,20], a public benchmark whose True.csv half holds real, verified news (and whose Fake.csv half, which we do not use, holds fabricated stories). Because these are real newswire headlines, we treat them as neutral, fact-oriented baseline formulations and assign each an all-zero engagement-attribute vector.</w:t>
       </w:r>
     </w:p>
     <w:p>
@@ -2651,7 +2639,7 @@
         <w:rPr>
           <w:highlight w:val="yellow"/>
         </w:rPr>
-        <w:t xml:space="preserve">[22]</w:t>
+        <w:t xml:space="preserve">[21]</w:t>
       </w:r>
       <w:r>
         <w:t xml:space="preserve"> </w:t>
@@ -2977,7 +2965,7 @@
         <w:rPr>
           <w:highlight w:val="yellow"/>
         </w:rPr>
-        <w:t xml:space="preserve">Guide models: two BERT-base encoders, each fine-tuned for 2–3 epochs with early stopping on validation loss, AdamW at learning rate 2×10⁻⁵ with linear decay, mixed prefix-length mini-batches, and a length-aware weighted loss that down-weights very short prefixes (&lt; 4 tokens). Synthetic data: the 12,600 neutral source headlines are the real Reuters headlines described in Section 3.2 (the genuine-news True.csv split of the ISOT dataset), yielding 12,599 validated clickbait variants after JSON-validity and duplicate filtering; GPT-4o-mini generates in batches of 15 at temperature 0.7, each call activating 1–3 tactics uniformly sampled from the ten-attribute rubric, with a GPT-based JSON self-repair retry (up to three attempts). The clickbait guide reaches AUROC 0.9998 and the ten-label engagement guide macro-F1 0.49 on the held-out synthetic test split (the full per-tactic and confusion-matrix evaluation is released in the deposit); the external-corpus and prefix-level validations of Sections 4.5–4.6 characterize their transfer to human-authored data. A separate DistilBERT[23] detector trained only on the human-authored Chakraborty corpus is used as the independent clickbait evaluator throughout Section 4. Complete prompt templates and all training/decoding hyperparameters are released with the deposit; approximate wall-clock cost is ≈ 1.2 s per rewritten headline on the A10G/L40S configuration.</w:t>
+        <w:t xml:space="preserve">Guide models: two BERT-base encoders, each fine-tuned for 2–3 epochs with early stopping on validation loss, AdamW at learning rate 2×10⁻⁵ with linear decay, mixed prefix-length mini-batches, and a length-aware weighted loss that down-weights very short prefixes (&lt; 4 tokens). Synthetic data: the 12,600 neutral source headlines are the real Reuters headlines described in Section 3.2 (the genuine-news True.csv split of the ISOT dataset), yielding 12,599 validated clickbait variants after JSON-validity and duplicate filtering; GPT-4o-mini generates in batches of 15 at temperature 0.7, each call activating 1–3 tactics uniformly sampled from the ten-attribute rubric, with a GPT-based JSON self-repair retry (up to three attempts). The clickbait guide reaches AUROC 0.9998 and the ten-label engagement guide macro-F1 0.49 on the held-out synthetic test split (the full per-tactic and confusion-matrix evaluation is released in the deposit); the external-corpus and prefix-level validations of Sections 4.5–4.6 characterize their transfer to human-authored data. A separate DistilBERT[22] detector trained only on the human-authored Chakraborty corpus is used as the independent clickbait evaluator throughout Section 4. Complete prompt templates and all training/decoding hyperparameters are released with the deposit; approximate wall-clock cost is ≈ 1.2 s per rewritten headline on the A10G/L40S configuration.</w:t>
       </w:r>
     </w:p>
     <w:bookmarkEnd w:id="26"/>
@@ -3042,7 +3030,7 @@
         <w:rPr>
           <w:highlight w:val="yellow"/>
         </w:rPr>
-        <w:t xml:space="preserve">BERTScore[25] compares the rewrite and the source headline through their contextual BERT embeddings, matching each token to its closest counterpart and reporting an F1 score; higher means the rewrite still conveys what the original said. It is the primary guard against a more engaging rewrite that quietly changes the story, and it is the metric a reader would recognise as does this still mean the same thing.</w:t>
+        <w:t xml:space="preserve">BERTScore[23] compares the rewrite and the source headline through their contextual BERT embeddings, matching each token to its closest counterpart and reporting an F1 score; higher means the rewrite still conveys what the original said. It is the primary guard against a more engaging rewrite that quietly changes the story, and it is the metric a reader would recognise as does this still mean the same thing.</w:t>
       </w:r>
     </w:p>
     <w:p>
@@ -3110,7 +3098,7 @@
         <w:rPr>
           <w:highlight w:val="yellow"/>
         </w:rPr>
-        <w:t xml:space="preserve">Perplexity is the exponentiated average next-word surprise of a held-out language model (distilGPT-2[26]) on the rewrite; lower means the text reads more naturally. It is important because a steering method can reach its attribute target by emitting awkward or ungrammatical text, and perplexity exposes that failure, which the fidelity and clickbait scores alone would miss.</w:t>
+        <w:t xml:space="preserve">Perplexity is the exponentiated average next-word surprise of a held-out language model (distilGPT-2[25]) on the rewrite; lower means the text reads more naturally. It is important because a steering method can reach its attribute target by emitting awkward or ungrammatical text, and perplexity exposes that failure, which the fidelity and clickbait scores alone would miss.</w:t>
       </w:r>
     </w:p>
     <w:p>
@@ -5438,7 +5426,7 @@
         <w:rPr>
           <w:highlight w:val="yellow"/>
         </w:rPr>
-        <w:t xml:space="preserve">A scorer trained on GPT-4o-mini rewrites could in principle key on generator artefacts rather than clickbait, so we validate both guide models on two entirely human-authored corpora never seen in training: the Chakraborty et al.[2] corpus (32,000 balanced headlines) and the Webis Clickbait Corpus 2017[3] (2,459 graded headlines). We additionally train a fully independent DistilBERT clickbait detector on the human-authored Chakraborty data alone, and use that independent detector, never our own guide, for every clickbait number reported in the rewrite evaluation below. All figures carry 95% percentile-bootstrap confidence intervals (n = 1000).</w:t>
+        <w:t xml:space="preserve">A scorer trained on GPT-4o-mini rewrites could in principle key on generator artefacts rather than clickbait, so we validate both guide models on two entirely human-authored corpora never seen in training: the Chakraborty et al.[5] corpus (32,000 balanced headlines) and the Webis Clickbait Corpus 2017[6] (2,459 graded headlines). We additionally train a fully independent DistilBERT clickbait detector on the human-authored Chakraborty data alone, and use that independent detector, never our own guide, for every clickbait number reported in the rewrite evaluation below. All figures carry 95% percentile-bootstrap confidence intervals (n = 1000).</w:t>
       </w:r>
     </w:p>
     <w:p>
@@ -12262,7 +12250,7 @@
         <w:rPr>
           <w:highlight w:val="yellow"/>
         </w:rPr>
-        <w:t xml:space="preserve">We test model-agnosticism by swapping the base generator to Qwen2.5-7B-Instruct[20], a different model family, keeping the guides and the operating point (α = 4, β = 2) unchanged and applying the language-consistency constraint of Section 3.6. Llama-3-8B remains the primary generator for comparability with the decoding-time baselines; this experiment shows that the same guides and operating point transfer to a different model family, and Qwen's higher BERTScore reflects its more conservative, closer-to-source rewriting. The dual control transfers cleanly to Qwen (Table 12): the engagement guide raises tactic realization (0.31 → 0.36); source fidelity and fluency are maintained and in fact exceed the Llama-3 configuration (BERTScore 0.43–0.47 versus 0.25–0.28; perplexity 133–163); induced clickbait stays low across all cells (below 0.06); and the clickbait brake holds the brake-only cell at or below the no-guidance baseline (0.033 versus 0.034). The two guides retain their designed, opposite effects on a second base-model family at the same operating point.</w:t>
+        <w:t xml:space="preserve">We test model-agnosticism by swapping the base generator to Qwen2.5-7B-Instruct[26], a different model family, keeping the guides and the operating point (α = 4, β = 2) unchanged and applying the language-consistency constraint of Section 3.6. Llama-3-8B remains the primary generator for comparability with the decoding-time baselines; this experiment shows that the same guides and operating point transfer to a different model family, and Qwen's higher BERTScore reflects its more conservative, closer-to-source rewriting. The dual control transfers cleanly to Qwen (Table 12): the engagement guide raises tactic realization (0.31 → 0.36); source fidelity and fluency are maintained and in fact exceed the Llama-3 configuration (BERTScore 0.43–0.47 versus 0.25–0.28; perplexity 133–163); induced clickbait stays low across all cells (below 0.06); and the clickbait brake holds the brake-only cell at or below the no-guidance baseline (0.033 versus 0.034). The two guides retain their designed, opposite effects on a second base-model family at the same operating point.</w:t>
       </w:r>
     </w:p>
     <w:p>
@@ -13303,7 +13291,7 @@
         <w:rPr>
           <w:highlight w:val="yellow"/>
         </w:rPr>
-        <w:t xml:space="preserve">Several limitations frame the empirical scope of the current work. First, the synthetic corpus is built exclusively from the real Reuters political and world-news headlines described in Section 3.2 (the genuine-news half of the ISOT dataset); extending both guide models to tabloid, entertainment, and non-English registers remains open, although Section 4.12 shows that the trained guides already transfer at inference to a different, human-authored, non-Reuters English-news register with the same directional effects; the results in Section 4 should otherwise be read within this domain. Second, the neutrality of the Reuters source headlines is quantified rather than assumed: the independent detector flags only 0.61% of the source pool (Section 4.7). Third, the external evaluation on the Webis Clickbait Corpus 2017[3] and the Chakraborty et al.[2] corpus (Section 4.5) measures the synthetic-to-human distribution shift directly, with AUROC 0.955 on clean human clickbait and 0.740 on the noisier graded corpus. Fourth, the decoding-time guides operate as amplifiers on top of the prompt: they deliver their effect when the prompt names the target tactic (on the 40-item α–β tuning sweep, independent tactic realization +0.075, from 0.44 to 0.51, as α goes 0→4; on the 300-item held-out set the same contrast is +0.03, 0.48 to 0.51, Table 6), consistent with top-k rescoring reweighting tokens the base model already proposes; the framework is therefore designed and evaluated as prompt-plus-guidance. Fifth, all three decoding-time methods realize the target tactic to a comparable degree, and the single-axis baselines match the dual guide's fidelity at low steering; the dual guide's distinctive capability is the independent clickbait brake, which decouples engagement from clickbait so that induced clickbait stays low as engagement rises, while the single-axis baselines raise induced clickbait as they steer toward the same tactic (Section 4.9). All quantitative comparisons use item-matched significance testing with 95% bootstrap confidence intervals.</w:t>
+        <w:t xml:space="preserve">Several limitations frame the empirical scope of the current work. First, the synthetic corpus is built exclusively from the real Reuters political and world-news headlines described in Section 3.2 (the genuine-news half of the ISOT dataset); extending both guide models to tabloid, entertainment, and non-English registers remains open, although Section 4.12 shows that the trained guides already transfer at inference to a different, human-authored, non-Reuters English-news register with the same directional effects; the results in Section 4 should otherwise be read within this domain. Second, the neutrality of the Reuters source headlines is quantified rather than assumed: the independent detector flags only 0.61% of the source pool (Section 4.7). Third, the external evaluation on the Webis Clickbait Corpus 2017[6] and the Chakraborty et al.[5] corpus (Section 4.5) measures the synthetic-to-human distribution shift directly, with AUROC 0.955 on clean human clickbait and 0.740 on the noisier graded corpus. Fourth, the decoding-time guides operate as amplifiers on top of the prompt: they deliver their effect when the prompt names the target tactic (on the 40-item α–β tuning sweep, independent tactic realization +0.075, from 0.44 to 0.51, as α goes 0→4; on the 300-item held-out set the same contrast is +0.03, 0.48 to 0.51, Table 6), consistent with top-k rescoring reweighting tokens the base model already proposes; the framework is therefore designed and evaluated as prompt-plus-guidance. Fifth, all three decoding-time methods realize the target tactic to a comparable degree, and the single-axis baselines match the dual guide's fidelity at low steering; the dual guide's distinctive capability is the independent clickbait brake, which decouples engagement from clickbait so that induced clickbait stays low as engagement rises, while the single-axis baselines raise induced clickbait as they steer toward the same tactic (Section 4.9). All quantitative comparisons use item-matched significance testing with 95% bootstrap confidence intervals.</w:t>
       </w:r>
     </w:p>
     <w:p>
@@ -13404,7 +13392,7 @@
         <w:t xml:space="preserve">1. </w:t>
       </w:r>
       <w:r>
-        <w:t xml:space="preserve">Biyani, P., Tsioutsiouliklis, K. &amp; Blackmer, J. "8 amazing secrets for getting more clicks": detecting clickbaits in news streams using article informality. In</w:t>
+        <w:t xml:space="preserve">Aubin Le Quéré, M. &amp; Matias, J. N. When curiosity gaps backfire: effects of headline concreteness on information selection decisions.</w:t>
       </w:r>
       <w:r>
         <w:t xml:space="preserve"> </w:t>
@@ -13414,13 +13402,20 @@
           <w:i/>
           <w:iCs/>
         </w:rPr>
-        <w:t xml:space="preserve">Proc. 30th AAAI Conf. on Artificial Intelligence</w:t>
+        <w:t xml:space="preserve">Sci. Rep.</w:t>
       </w:r>
       <w:r>
         <w:t xml:space="preserve"> </w:t>
       </w:r>
       <w:r>
-        <w:t xml:space="preserve">94–102 (AAAI Press, 2016).</w:t>
+        <w:rPr>
+          <w:b/>
+          <w:bCs/>
+        </w:rPr>
+        <w:t xml:space="preserve">15</w:t>
+      </w:r>
+      <w:r>
+        <w:t xml:space="preserve">, 994 (2025).</w:t>
       </w:r>
     </w:p>
     <w:p>
@@ -13441,23 +13436,7 @@
         <w:t xml:space="preserve">2. </w:t>
       </w:r>
       <w:r>
-        <w:t xml:space="preserve">Chakraborty, A., Paranjape, B., Kakarla, S. &amp; Ganguly, N. Stop clickbait: detecting and preventing clickbaits in online news media. In</w:t>
-      </w:r>
-      <w:r>
-        <w:t xml:space="preserve"> </w:t>
-      </w:r>
-      <w:r>
-        <w:rPr>
-          <w:i/>
-          <w:iCs/>
-        </w:rPr>
-        <w:t xml:space="preserve">Proc. IEEE/ACM Int. Conf. on Advances in Social Networks Analysis and Mining (ASONAM)</w:t>
-      </w:r>
-      <w:r>
-        <w:t xml:space="preserve"> </w:t>
-      </w:r>
-      <w:r>
-        <w:t xml:space="preserve">9–16 (IEEE, 2016).</w:t>
+        <w:t xml:space="preserve">Nofar, L., Portal, T., Elbaz, A., Apartsin, A. &amp; Aperstein, Y. An interpretable benchmark for clickbait detection and tactic attribution. Preprint at https://arxiv.org/abs/2509.10937 (2025).</w:t>
       </w:r>
     </w:p>
     <w:p>
@@ -13478,7 +13457,23 @@
         <w:t xml:space="preserve">3. </w:t>
       </w:r>
       <w:r>
-        <w:t xml:space="preserve">Potthast, M., Gollub, T., Hagen, M. &amp; Stein, B. The Clickbait Challenge 2017: towards a regression model for clickbait strength. Preprint at https://arxiv.org/abs/1812.10847 (2018).</w:t>
+        <w:t xml:space="preserve">Grattafiori, A.</w:t>
+      </w:r>
+      <w:r>
+        <w:t xml:space="preserve"> </w:t>
+      </w:r>
+      <w:r>
+        <w:rPr>
+          <w:i/>
+          <w:iCs/>
+        </w:rPr>
+        <w:t xml:space="preserve">et al.</w:t>
+      </w:r>
+      <w:r>
+        <w:t xml:space="preserve"> </w:t>
+      </w:r>
+      <w:r>
+        <w:t xml:space="preserve">The Llama 3 herd of models. Preprint at https://arxiv.org/abs/2407.21783 (2024).</w:t>
       </w:r>
     </w:p>
     <w:p>
@@ -13499,7 +13494,7 @@
         <w:t xml:space="preserve">4. </w:t>
       </w:r>
       <w:r>
-        <w:t xml:space="preserve">Jácobo-Morales, D. &amp; Marino-Jiménez, M. Clickbait: research, challenges and opportunities: a systematic literature review.</w:t>
+        <w:t xml:space="preserve">Biyani, P., Tsioutsiouliklis, K. &amp; Blackmer, J. "8 amazing secrets for getting more clicks": detecting clickbaits in news streams using article informality. In</w:t>
       </w:r>
       <w:r>
         <w:t xml:space="preserve"> </w:t>
@@ -13509,20 +13504,13 @@
           <w:i/>
           <w:iCs/>
         </w:rPr>
-        <w:t xml:space="preserve">Online J. Commun. Media Technol.</w:t>
+        <w:t xml:space="preserve">Proc. 30th AAAI Conf. on Artificial Intelligence</w:t>
       </w:r>
       <w:r>
         <w:t xml:space="preserve"> </w:t>
       </w:r>
       <w:r>
-        <w:rPr>
-          <w:b/>
-          <w:bCs/>
-        </w:rPr>
-        <w:t xml:space="preserve">14</w:t>
-      </w:r>
-      <w:r>
-        <w:t xml:space="preserve">, e202458 (2024).</w:t>
+        <w:t xml:space="preserve">94–102 (AAAI Press, 2016).</w:t>
       </w:r>
     </w:p>
     <w:p>
@@ -13543,7 +13531,7 @@
         <w:t xml:space="preserve">5. </w:t>
       </w:r>
       <w:r>
-        <w:t xml:space="preserve">Alarfaj, F. K., Muqadas, A., Khan, H. U. &amp; Naz, A. Clickbait detection in news headlines using RoBERTa-Large language model and deep embeddings.</w:t>
+        <w:t xml:space="preserve">Chakraborty, A., Paranjape, B., Kakarla, S. &amp; Ganguly, N. Stop clickbait: detecting and preventing clickbaits in online news media. In</w:t>
       </w:r>
       <w:r>
         <w:t xml:space="preserve"> </w:t>
@@ -13553,23 +13541,13 @@
           <w:i/>
           <w:iCs/>
         </w:rPr>
-        <w:t xml:space="preserve">Sci. Rep.</w:t>
+        <w:t xml:space="preserve">Proc. IEEE/ACM Int. Conf. on Advances in Social Networks Analysis and Mining (ASONAM)</w:t>
       </w:r>
       <w:r>
         <w:t xml:space="preserve"> </w:t>
       </w:r>
       <w:r>
-        <w:rPr>
-          <w:b/>
-          <w:bCs/>
-        </w:rPr>
-        <w:t xml:space="preserve">15</w:t>
-      </w:r>
-      <w:r>
-        <w:t xml:space="preserve"> </w:t>
-      </w:r>
-      <w:r>
-        <w:t xml:space="preserve">(2025).</w:t>
+        <w:t xml:space="preserve">9–16 (IEEE, 2016).</w:t>
       </w:r>
     </w:p>
     <w:p>
@@ -13590,46 +13568,7 @@
         <w:t xml:space="preserve">6. </w:t>
       </w:r>
       <w:r>
-        <w:t xml:space="preserve">Muqadas, A.</w:t>
-      </w:r>
-      <w:r>
-        <w:t xml:space="preserve"> </w:t>
-      </w:r>
-      <w:r>
-        <w:rPr>
-          <w:i/>
-          <w:iCs/>
-        </w:rPr>
-        <w:t xml:space="preserve">et al.</w:t>
-      </w:r>
-      <w:r>
-        <w:t xml:space="preserve"> </w:t>
-      </w:r>
-      <w:r>
-        <w:t xml:space="preserve">Deep learning and sentence embeddings for detection of clickbait news from online content.</w:t>
-      </w:r>
-      <w:r>
-        <w:t xml:space="preserve"> </w:t>
-      </w:r>
-      <w:r>
-        <w:rPr>
-          <w:i/>
-          <w:iCs/>
-        </w:rPr>
-        <w:t xml:space="preserve">Sci. Rep.</w:t>
-      </w:r>
-      <w:r>
-        <w:t xml:space="preserve"> </w:t>
-      </w:r>
-      <w:r>
-        <w:rPr>
-          <w:b/>
-          <w:bCs/>
-        </w:rPr>
-        <w:t xml:space="preserve">15</w:t>
-      </w:r>
-      <w:r>
-        <w:t xml:space="preserve">, 13251 (2025).</w:t>
+        <w:t xml:space="preserve">Potthast, M., Gollub, T., Hagen, M. &amp; Stein, B. The Clickbait Challenge 2017: towards a regression model for clickbait strength. Preprint at https://arxiv.org/abs/1812.10847 (2018).</w:t>
       </w:r>
     </w:p>
     <w:p>
@@ -13650,7 +13589,7 @@
         <w:t xml:space="preserve">7. </w:t>
       </w:r>
       <w:r>
-        <w:t xml:space="preserve">Wang, Y.</w:t>
+        <w:t xml:space="preserve">Jácobo-Morales, D. &amp; Marino-Jiménez, M. Clickbait: research, challenges and opportunities: a systematic literature review.</w:t>
       </w:r>
       <w:r>
         <w:t xml:space="preserve"> </w:t>
@@ -13660,23 +13599,7 @@
           <w:i/>
           <w:iCs/>
         </w:rPr>
-        <w:t xml:space="preserve">et al.</w:t>
-      </w:r>
-      <w:r>
-        <w:t xml:space="preserve"> </w:t>
-      </w:r>
-      <w:r>
-        <w:t xml:space="preserve">Clickbait detection via prompt-tuning with titles only.</w:t>
-      </w:r>
-      <w:r>
-        <w:t xml:space="preserve"> </w:t>
-      </w:r>
-      <w:r>
-        <w:rPr>
-          <w:i/>
-          <w:iCs/>
-        </w:rPr>
-        <w:t xml:space="preserve">IEEE Trans. Emerg. Top. Comput. Intell.</w:t>
+        <w:t xml:space="preserve">Online J. Commun. Media Technol.</w:t>
       </w:r>
       <w:r>
         <w:t xml:space="preserve"> </w:t>
@@ -13686,10 +13609,10 @@
           <w:b/>
           <w:bCs/>
         </w:rPr>
-        <w:t xml:space="preserve">9</w:t>
-      </w:r>
-      <w:r>
-        <w:t xml:space="preserve">, 695–705 (2024).</w:t>
+        <w:t xml:space="preserve">14</w:t>
+      </w:r>
+      <w:r>
+        <w:t xml:space="preserve">, e202458 (2024).</w:t>
       </w:r>
     </w:p>
     <w:p>
@@ -13710,7 +13633,7 @@
         <w:t xml:space="preserve">8. </w:t>
       </w:r>
       <w:r>
-        <w:t xml:space="preserve">Wang, H.</w:t>
+        <w:t xml:space="preserve">Alarfaj, F. K., Muqadas, A., Khan, H. U. &amp; Naz, A. Clickbait detection in news headlines using RoBERTa-Large language model and deep embeddings.</w:t>
       </w:r>
       <w:r>
         <w:t xml:space="preserve"> </w:t>
@@ -13720,29 +13643,23 @@
           <w:i/>
           <w:iCs/>
         </w:rPr>
-        <w:t xml:space="preserve">et al.</w:t>
+        <w:t xml:space="preserve">Sci. Rep.</w:t>
       </w:r>
       <w:r>
         <w:t xml:space="preserve"> </w:t>
       </w:r>
       <w:r>
-        <w:t xml:space="preserve">Clickbait detection via large language models. In</w:t>
+        <w:rPr>
+          <w:b/>
+          <w:bCs/>
+        </w:rPr>
+        <w:t xml:space="preserve">15</w:t>
       </w:r>
       <w:r>
         <w:t xml:space="preserve"> </w:t>
       </w:r>
       <w:r>
-        <w:rPr>
-          <w:i/>
-          <w:iCs/>
-        </w:rPr>
-        <w:t xml:space="preserve">Proc. Int. Conf. on Intelligent Computing</w:t>
-      </w:r>
-      <w:r>
-        <w:t xml:space="preserve"> </w:t>
-      </w:r>
-      <w:r>
-        <w:t xml:space="preserve">462–474 (Springer, 2025).</w:t>
+        <w:t xml:space="preserve">(2025).</w:t>
       </w:r>
     </w:p>
     <w:p>
@@ -13763,7 +13680,23 @@
         <w:t xml:space="preserve">9. </w:t>
       </w:r>
       <w:r>
-        <w:t xml:space="preserve">Aubin Le Quéré, M. &amp; Matias, J. N. When curiosity gaps backfire: effects of headline concreteness on information selection decisions.</w:t>
+        <w:t xml:space="preserve">Muqadas, A.</w:t>
+      </w:r>
+      <w:r>
+        <w:t xml:space="preserve"> </w:t>
+      </w:r>
+      <w:r>
+        <w:rPr>
+          <w:i/>
+          <w:iCs/>
+        </w:rPr>
+        <w:t xml:space="preserve">et al.</w:t>
+      </w:r>
+      <w:r>
+        <w:t xml:space="preserve"> </w:t>
+      </w:r>
+      <w:r>
+        <w:t xml:space="preserve">Deep learning and sentence embeddings for detection of clickbait news from online content.</w:t>
       </w:r>
       <w:r>
         <w:t xml:space="preserve"> </w:t>
@@ -13786,7 +13719,7 @@
         <w:t xml:space="preserve">15</w:t>
       </w:r>
       <w:r>
-        <w:t xml:space="preserve">, 994 (2025).</w:t>
+        <w:t xml:space="preserve">, 13251 (2025).</w:t>
       </w:r>
     </w:p>
     <w:p>
@@ -13807,7 +13740,46 @@
         <w:t xml:space="preserve">10. </w:t>
       </w:r>
       <w:r>
-        <w:t xml:space="preserve">Michaluk, W., Urban, T., Kubita, M., Kuntur, S. &amp; Wróblewska, A. Click it or leave it: detecting and spoiling clickbait with informativeness measures and large language models. Preprint at https://arxiv.org/abs/2602.18171 (2026).</w:t>
+        <w:t xml:space="preserve">Wang, Y.</w:t>
+      </w:r>
+      <w:r>
+        <w:t xml:space="preserve"> </w:t>
+      </w:r>
+      <w:r>
+        <w:rPr>
+          <w:i/>
+          <w:iCs/>
+        </w:rPr>
+        <w:t xml:space="preserve">et al.</w:t>
+      </w:r>
+      <w:r>
+        <w:t xml:space="preserve"> </w:t>
+      </w:r>
+      <w:r>
+        <w:t xml:space="preserve">Clickbait detection via prompt-tuning with titles only.</w:t>
+      </w:r>
+      <w:r>
+        <w:t xml:space="preserve"> </w:t>
+      </w:r>
+      <w:r>
+        <w:rPr>
+          <w:i/>
+          <w:iCs/>
+        </w:rPr>
+        <w:t xml:space="preserve">IEEE Trans. Emerg. Top. Comput. Intell.</w:t>
+      </w:r>
+      <w:r>
+        <w:t xml:space="preserve"> </w:t>
+      </w:r>
+      <w:r>
+        <w:rPr>
+          <w:b/>
+          <w:bCs/>
+        </w:rPr>
+        <w:t xml:space="preserve">9</w:t>
+      </w:r>
+      <w:r>
+        <w:t xml:space="preserve">, 695–705 (2024).</w:t>
       </w:r>
     </w:p>
     <w:p>
@@ -13828,7 +13800,39 @@
         <w:t xml:space="preserve">11. </w:t>
       </w:r>
       <w:r>
-        <w:t xml:space="preserve">Nofar, L., Portal, T., Elbaz, A., Apartsin, A. &amp; Aperstein, Y. An interpretable benchmark for clickbait detection and tactic attribution. Preprint at https://arxiv.org/abs/2509.10937 (2025).</w:t>
+        <w:t xml:space="preserve">Wang, H.</w:t>
+      </w:r>
+      <w:r>
+        <w:t xml:space="preserve"> </w:t>
+      </w:r>
+      <w:r>
+        <w:rPr>
+          <w:i/>
+          <w:iCs/>
+        </w:rPr>
+        <w:t xml:space="preserve">et al.</w:t>
+      </w:r>
+      <w:r>
+        <w:t xml:space="preserve"> </w:t>
+      </w:r>
+      <w:r>
+        <w:t xml:space="preserve">Clickbait detection via large language models. In</w:t>
+      </w:r>
+      <w:r>
+        <w:t xml:space="preserve"> </w:t>
+      </w:r>
+      <w:r>
+        <w:rPr>
+          <w:i/>
+          <w:iCs/>
+        </w:rPr>
+        <w:t xml:space="preserve">Proc. Int. Conf. on Intelligent Computing</w:t>
+      </w:r>
+      <w:r>
+        <w:t xml:space="preserve"> </w:t>
+      </w:r>
+      <w:r>
+        <w:t xml:space="preserve">462–474 (Springer, 2025).</w:t>
       </w:r>
     </w:p>
     <w:p>
@@ -13849,7 +13853,7 @@
         <w:t xml:space="preserve">12. </w:t>
       </w:r>
       <w:r>
-        <w:t xml:space="preserve">Keskar, N. S., McCann, B., Varshney, L. R., Xiong, C. &amp; Socher, R. CTRL: a conditional transformer language model for controllable generation. Preprint at https://arxiv.org/abs/1909.05858 (2019).</w:t>
+        <w:t xml:space="preserve">Michaluk, W., Urban, T., Kubita, M., Kuntur, S. &amp; Wróblewska, A. Click it or leave it: detecting and spoiling clickbait with informativeness measures and large language models. Preprint at https://arxiv.org/abs/2602.18171 (2026).</w:t>
       </w:r>
     </w:p>
     <w:p>
@@ -13870,23 +13874,7 @@
         <w:t xml:space="preserve">13. </w:t>
       </w:r>
       <w:r>
-        <w:t xml:space="preserve">Dathathri, S.</w:t>
-      </w:r>
-      <w:r>
-        <w:t xml:space="preserve"> </w:t>
-      </w:r>
-      <w:r>
-        <w:rPr>
-          <w:i/>
-          <w:iCs/>
-        </w:rPr>
-        <w:t xml:space="preserve">et al.</w:t>
-      </w:r>
-      <w:r>
-        <w:t xml:space="preserve"> </w:t>
-      </w:r>
-      <w:r>
-        <w:t xml:space="preserve">Plug and play language models: a simple approach to controlled text generation. Preprint at https://arxiv.org/abs/1912.02164 (2019).</w:t>
+        <w:t xml:space="preserve">Keskar, N. S., McCann, B., Varshney, L. R., Xiong, C. &amp; Socher, R. CTRL: a conditional transformer language model for controllable generation. Preprint at https://arxiv.org/abs/1909.05858 (2019).</w:t>
       </w:r>
     </w:p>
     <w:p>
@@ -13907,7 +13895,7 @@
         <w:t xml:space="preserve">14. </w:t>
       </w:r>
       <w:r>
-        <w:t xml:space="preserve">Krause, B.</w:t>
+        <w:t xml:space="preserve">Dathathri, S.</w:t>
       </w:r>
       <w:r>
         <w:t xml:space="preserve"> </w:t>
@@ -13923,23 +13911,7 @@
         <w:t xml:space="preserve"> </w:t>
       </w:r>
       <w:r>
-        <w:t xml:space="preserve">GeDi: generative discriminator guided sequence generation. In</w:t>
-      </w:r>
-      <w:r>
-        <w:t xml:space="preserve"> </w:t>
-      </w:r>
-      <w:r>
-        <w:rPr>
-          <w:i/>
-          <w:iCs/>
-        </w:rPr>
-        <w:t xml:space="preserve">Findings of the Association for Computational Linguistics: EMNLP 2021</w:t>
-      </w:r>
-      <w:r>
-        <w:t xml:space="preserve"> </w:t>
-      </w:r>
-      <w:r>
-        <w:t xml:space="preserve">4929–4952 (ACL, 2021).</w:t>
+        <w:t xml:space="preserve">Plug and play language models: a simple approach to controlled text generation. Preprint at https://arxiv.org/abs/1912.02164 (2019).</w:t>
       </w:r>
     </w:p>
     <w:p>
@@ -13960,7 +13932,7 @@
         <w:t xml:space="preserve">15. </w:t>
       </w:r>
       <w:r>
-        <w:t xml:space="preserve">Liu, A.</w:t>
+        <w:t xml:space="preserve">Krause, B.</w:t>
       </w:r>
       <w:r>
         <w:t xml:space="preserve"> </w:t>
@@ -13976,7 +13948,7 @@
         <w:t xml:space="preserve"> </w:t>
       </w:r>
       <w:r>
-        <w:t xml:space="preserve">DExperts: decoding-time controlled text generation with experts and anti-experts. In</w:t>
+        <w:t xml:space="preserve">GeDi: generative discriminator guided sequence generation. In</w:t>
       </w:r>
       <w:r>
         <w:t xml:space="preserve"> </w:t>
@@ -13986,13 +13958,13 @@
           <w:i/>
           <w:iCs/>
         </w:rPr>
-        <w:t xml:space="preserve">Proc. 59th Annual Meeting of the Association for Computational Linguistics (ACL)</w:t>
+        <w:t xml:space="preserve">Findings of the Association for Computational Linguistics: EMNLP 2021</w:t>
       </w:r>
       <w:r>
         <w:t xml:space="preserve"> </w:t>
       </w:r>
       <w:r>
-        <w:t xml:space="preserve">6691–6706 (ACL, 2021).</w:t>
+        <w:t xml:space="preserve">4929–4952 (ACL, 2021).</w:t>
       </w:r>
     </w:p>
     <w:p>
@@ -14013,7 +13985,7 @@
         <w:t xml:space="preserve">16. </w:t>
       </w:r>
       <w:r>
-        <w:t xml:space="preserve">Yang, K. &amp; Klein, D. FUDGE: controlled text generation with future discriminators. In</w:t>
+        <w:t xml:space="preserve">Liu, A.</w:t>
       </w:r>
       <w:r>
         <w:t xml:space="preserve"> </w:t>
@@ -14023,13 +13995,29 @@
           <w:i/>
           <w:iCs/>
         </w:rPr>
-        <w:t xml:space="preserve">Proc. 2021 Conf. of the North American Chapter of the Association for Computational Linguistics (NAACL)</w:t>
+        <w:t xml:space="preserve">et al.</w:t>
       </w:r>
       <w:r>
         <w:t xml:space="preserve"> </w:t>
       </w:r>
       <w:r>
-        <w:t xml:space="preserve">3511–3535 (ACL, 2021).</w:t>
+        <w:t xml:space="preserve">DExperts: decoding-time controlled text generation with experts and anti-experts. In</w:t>
+      </w:r>
+      <w:r>
+        <w:t xml:space="preserve"> </w:t>
+      </w:r>
+      <w:r>
+        <w:rPr>
+          <w:i/>
+          <w:iCs/>
+        </w:rPr>
+        <w:t xml:space="preserve">Proc. 59th Annual Meeting of the Association for Computational Linguistics (ACL)</w:t>
+      </w:r>
+      <w:r>
+        <w:t xml:space="preserve"> </w:t>
+      </w:r>
+      <w:r>
+        <w:t xml:space="preserve">6691–6706 (ACL, 2021).</w:t>
       </w:r>
     </w:p>
     <w:p>
@@ -14050,7 +14038,7 @@
         <w:t xml:space="preserve">17. </w:t>
       </w:r>
       <w:r>
-        <w:t xml:space="preserve">Ahmed, H., Traore, I. &amp; Saad, S. Detecting opinion spams and fake news using text classification.</w:t>
+        <w:t xml:space="preserve">Yang, K. &amp; Klein, D. FUDGE: controlled text generation with future discriminators. In</w:t>
       </w:r>
       <w:r>
         <w:t xml:space="preserve"> </w:t>
@@ -14060,20 +14048,13 @@
           <w:i/>
           <w:iCs/>
         </w:rPr>
-        <w:t xml:space="preserve">Secur. Priv.</w:t>
+        <w:t xml:space="preserve">Proc. 2021 Conf. of the North American Chapter of the Association for Computational Linguistics (NAACL)</w:t>
       </w:r>
       <w:r>
         <w:t xml:space="preserve"> </w:t>
       </w:r>
       <w:r>
-        <w:rPr>
-          <w:b/>
-          <w:bCs/>
-        </w:rPr>
-        <w:t xml:space="preserve">1</w:t>
-      </w:r>
-      <w:r>
-        <w:t xml:space="preserve">, e9 (2018).</w:t>
+        <w:t xml:space="preserve">3511–3535 (ACL, 2021).</w:t>
       </w:r>
     </w:p>
     <w:p>
@@ -14094,23 +14075,7 @@
         <w:t xml:space="preserve">18. </w:t>
       </w:r>
       <w:r>
-        <w:t xml:space="preserve">Ahmed, H., Traore, I. &amp; Saad, S. Detection of online fake news using n-gram analysis and machine learning techniques. In</w:t>
-      </w:r>
-      <w:r>
-        <w:t xml:space="preserve"> </w:t>
-      </w:r>
-      <w:r>
-        <w:rPr>
-          <w:i/>
-          <w:iCs/>
-        </w:rPr>
-        <w:t xml:space="preserve">Proc. Int. Conf. on Intelligent, Secure, and Dependable Systems in Distributed and Cloud Environments</w:t>
-      </w:r>
-      <w:r>
-        <w:t xml:space="preserve"> </w:t>
-      </w:r>
-      <w:r>
-        <w:t xml:space="preserve">127–138 (Springer, 2017).</w:t>
+        <w:t xml:space="preserve">OpenAI. GPT-4o system card. Preprint at https://arxiv.org/abs/2410.21276 (2024).</w:t>
       </w:r>
     </w:p>
     <w:p>
@@ -14134,7 +14099,7 @@
         <w:rPr>
           <w:highlight w:val="yellow"/>
         </w:rPr>
-        <w:t xml:space="preserve">Grattafiori, A.</w:t>
+        <w:t xml:space="preserve">Ahmed, H., Traore, I. &amp; Saad, S. Detecting opinion spams and fake news using text classification.</w:t>
       </w:r>
       <w:r>
         <w:rPr>
@@ -14148,7 +14113,7 @@
           <w:iCs/>
           <w:highlight w:val="yellow"/>
         </w:rPr>
-        <w:t xml:space="preserve">et al.</w:t>
+        <w:t xml:space="preserve">Secur. Priv.</w:t>
       </w:r>
       <w:r>
         <w:rPr>
@@ -14158,9 +14123,17 @@
       </w:r>
       <w:r>
         <w:rPr>
+          <w:b/>
+          <w:bCs/>
           <w:highlight w:val="yellow"/>
         </w:rPr>
-        <w:t xml:space="preserve">The Llama 3 herd of models. Preprint at https://arxiv.org/abs/2407.21783 (2024).</w:t>
+        <w:t xml:space="preserve">1</w:t>
+      </w:r>
+      <w:r>
+        <w:rPr>
+          <w:highlight w:val="yellow"/>
+        </w:rPr>
+        <w:t xml:space="preserve">, e9 (2018).</w:t>
       </w:r>
     </w:p>
     <w:p>
@@ -14184,7 +14157,7 @@
         <w:rPr>
           <w:highlight w:val="yellow"/>
         </w:rPr>
-        <w:t xml:space="preserve">Yang, A.</w:t>
+        <w:t xml:space="preserve">Ahmed, H., Traore, I. &amp; Saad, S. Detection of online fake news using n-gram analysis and machine learning techniques. In</w:t>
       </w:r>
       <w:r>
         <w:rPr>
@@ -14198,7 +14171,7 @@
           <w:iCs/>
           <w:highlight w:val="yellow"/>
         </w:rPr>
-        <w:t xml:space="preserve">et al.</w:t>
+        <w:t xml:space="preserve">Proc. Int. Conf. on Intelligent, Secure, and Dependable Systems in Distributed and Cloud Environments</w:t>
       </w:r>
       <w:r>
         <w:rPr>
@@ -14210,7 +14183,7 @@
         <w:rPr>
           <w:highlight w:val="yellow"/>
         </w:rPr>
-        <w:t xml:space="preserve">Qwen2.5 technical report. Preprint at https://arxiv.org/abs/2412.15115 (2024).</w:t>
+        <w:t xml:space="preserve">127–138 (Springer, 2017).</w:t>
       </w:r>
     </w:p>
     <w:p>
@@ -14234,7 +14207,33 @@
         <w:rPr>
           <w:highlight w:val="yellow"/>
         </w:rPr>
-        <w:t xml:space="preserve">OpenAI. GPT-4o system card. Preprint at https://arxiv.org/abs/2410.21276 (2024).</w:t>
+        <w:t xml:space="preserve">Devlin, J., Chang, M.-W., Lee, K. &amp; Toutanova, K. BERT: pre-training of deep bidirectional transformers for language understanding. In</w:t>
+      </w:r>
+      <w:r>
+        <w:rPr>
+          <w:highlight w:val="yellow"/>
+        </w:rPr>
+        <w:t xml:space="preserve"> </w:t>
+      </w:r>
+      <w:r>
+        <w:rPr>
+          <w:i/>
+          <w:iCs/>
+          <w:highlight w:val="yellow"/>
+        </w:rPr>
+        <w:t xml:space="preserve">Proc. 2019 Conf. of the North American Chapter of the Association for Computational Linguistics: Human Language Technologies</w:t>
+      </w:r>
+      <w:r>
+        <w:rPr>
+          <w:highlight w:val="yellow"/>
+        </w:rPr>
+        <w:t xml:space="preserve"> </w:t>
+      </w:r>
+      <w:r>
+        <w:rPr>
+          <w:highlight w:val="yellow"/>
+        </w:rPr>
+        <w:t xml:space="preserve">Vol. 1, 4171–4186 (ACL, 2019).</w:t>
       </w:r>
     </w:p>
     <w:p>
@@ -14258,33 +14257,7 @@
         <w:rPr>
           <w:highlight w:val="yellow"/>
         </w:rPr>
-        <w:t xml:space="preserve">Devlin, J., Chang, M.-W., Lee, K. &amp; Toutanova, K. BERT: pre-training of deep bidirectional transformers for language understanding. In</w:t>
-      </w:r>
-      <w:r>
-        <w:rPr>
-          <w:highlight w:val="yellow"/>
-        </w:rPr>
-        <w:t xml:space="preserve"> </w:t>
-      </w:r>
-      <w:r>
-        <w:rPr>
-          <w:i/>
-          <w:iCs/>
-          <w:highlight w:val="yellow"/>
-        </w:rPr>
-        <w:t xml:space="preserve">Proc. 2019 Conf. of the North American Chapter of the Association for Computational Linguistics: Human Language Technologies</w:t>
-      </w:r>
-      <w:r>
-        <w:rPr>
-          <w:highlight w:val="yellow"/>
-        </w:rPr>
-        <w:t xml:space="preserve"> </w:t>
-      </w:r>
-      <w:r>
-        <w:rPr>
-          <w:highlight w:val="yellow"/>
-        </w:rPr>
-        <w:t xml:space="preserve">Vol. 1, 4171–4186 (ACL, 2019).</w:t>
+        <w:t xml:space="preserve">Sanh, V., Debut, L., Chaumond, J. &amp; Wolf, T. DistilBERT, a distilled version of BERT: smaller, faster, cheaper and lighter. Preprint at https://arxiv.org/abs/1910.01108 (2019).</w:t>
       </w:r>
     </w:p>
     <w:p>
@@ -14308,7 +14281,33 @@
         <w:rPr>
           <w:highlight w:val="yellow"/>
         </w:rPr>
-        <w:t xml:space="preserve">Sanh, V., Debut, L., Chaumond, J. &amp; Wolf, T. DistilBERT, a distilled version of BERT: smaller, faster, cheaper and lighter. Preprint at https://arxiv.org/abs/1910.01108 (2019).</w:t>
+        <w:t xml:space="preserve">Zhang, T., Kishore, V., Wu, F., Weinberger, K. Q. &amp; Artzi, Y. BERTScore: evaluating text generation with BERT. In</w:t>
+      </w:r>
+      <w:r>
+        <w:rPr>
+          <w:highlight w:val="yellow"/>
+        </w:rPr>
+        <w:t xml:space="preserve"> </w:t>
+      </w:r>
+      <w:r>
+        <w:rPr>
+          <w:i/>
+          <w:iCs/>
+          <w:highlight w:val="yellow"/>
+        </w:rPr>
+        <w:t xml:space="preserve">International Conference on Learning Representations</w:t>
+      </w:r>
+      <w:r>
+        <w:rPr>
+          <w:highlight w:val="yellow"/>
+        </w:rPr>
+        <w:t xml:space="preserve"> </w:t>
+      </w:r>
+      <w:r>
+        <w:rPr>
+          <w:highlight w:val="yellow"/>
+        </w:rPr>
+        <w:t xml:space="preserve">(2020).</w:t>
       </w:r>
     </w:p>
     <w:p>
@@ -14356,7 +14355,7 @@
         <w:rPr>
           <w:highlight w:val="yellow"/>
         </w:rPr>
-        <w:t xml:space="preserve">Zhang, T., Kishore, V., Wu, F., Weinberger, K. Q. &amp; Artzi, Y. BERTScore: evaluating text generation with BERT. In</w:t>
+        <w:t xml:space="preserve">Radford, A.</w:t>
       </w:r>
       <w:r>
         <w:rPr>
@@ -14370,7 +14369,7 @@
           <w:iCs/>
           <w:highlight w:val="yellow"/>
         </w:rPr>
-        <w:t xml:space="preserve">International Conference on Learning Representations</w:t>
+        <w:t xml:space="preserve">et al.</w:t>
       </w:r>
       <w:r>
         <w:rPr>
@@ -14382,7 +14381,7 @@
         <w:rPr>
           <w:highlight w:val="yellow"/>
         </w:rPr>
-        <w:t xml:space="preserve">(2020).</w:t>
+        <w:t xml:space="preserve">Language models are unsupervised multitask learners. Technical report, OpenAI (2019).</w:t>
       </w:r>
     </w:p>
     <w:p>
@@ -14406,7 +14405,7 @@
         <w:rPr>
           <w:highlight w:val="yellow"/>
         </w:rPr>
-        <w:t xml:space="preserve">Radford, A.</w:t>
+        <w:t xml:space="preserve">Yang, A.</w:t>
       </w:r>
       <w:r>
         <w:rPr>
@@ -14432,7 +14431,7 @@
         <w:rPr>
           <w:highlight w:val="yellow"/>
         </w:rPr>
-        <w:t xml:space="preserve">Language models are unsupervised multitask learners. Technical report, OpenAI (2019).</w:t>
+        <w:t xml:space="preserve">Qwen2.5 technical report. Preprint at https://arxiv.org/abs/2412.15115 (2024).</w:t>
       </w:r>
     </w:p>
     <w:bookmarkEnd w:id="65"/>

</xml_diff>

<commit_message>
Typeset the combined objective as a native equation (KaTeX -> OMML)
- Write the FUDGE objective as a KaTeX \[...\] display equation (raw-string var
  to avoid f-string brace collisions); html2doc converts it to a native Word
  equation (OMML) instead of inline Unicode text. Verified 1 OMML eq in DOCX,
  render-checked on page 8.
- Add KaTeX CSS/JS (CDN, auto-render) to the HTML head so the GitHub-Pages
  mirror renders the equation; the DOCX pipeline is unaffected (ignores scripts).
- Left as a clean unnumbered display equation (single, unreferenced).

Co-Authored-By: Claude Opus 4.8 <noreply@anthropic.com>
</commit_message>
<xml_diff>
--- a/docs/GuidedRewriteClickbait_v9_cycle1.docx
+++ b/docs/GuidedRewriteClickbait_v9_cycle1.docx
@@ -2856,34 +2856,217 @@
     <w:p>
       <w:pPr>
         <w:pStyle w:val="BodyText"/>
-        <w:jc w:val="both"/>
-        <w:keepNext w:val="0"/>
-        <w:keepLines w:val="0"/>
-        <w:widowControl w:val="1"/>
       </w:pPr>
-      <w:r>
-        <w:rPr>
-          <w:highlight w:val="yellow"/>
-        </w:rPr>
-        <w:t xml:space="preserve">score(y) = log p</w:t>
-      </w:r>
-      <w:r>
-        <w:rPr>
-          <w:highlight w:val="yellow"/>
-          <w:vertAlign w:val="subscript"/>
-        </w:rPr>
-        <w:t xml:space="preserve">LLM</w:t>
-      </w:r>
-      <w:r>
-        <w:rPr>
-          <w:highlight w:val="yellow"/>
-        </w:rPr>
-        <w:t xml:space="preserve">(y) + α · log tac(x·y) + β · log(1 − cb(x·y)).</w:t>
-      </w:r>
+      <m:oMathPara>
+        <m:oMathParaPr>
+          <m:jc m:val="center"/>
+        </m:oMathParaPr>
+        <m:oMath>
+          <m:r>
+            <m:rPr>
+              <m:sty m:val="p"/>
+            </m:rPr>
+            <m:t>score</m:t>
+          </m:r>
+          <m:r>
+            <m:rPr>
+              <m:sty m:val="p"/>
+            </m:rPr>
+            <m:t>(</m:t>
+          </m:r>
+          <m:r>
+            <m:t>y</m:t>
+          </m:r>
+          <m:r>
+            <m:rPr>
+              <m:sty m:val="p"/>
+            </m:rPr>
+            <m:t>)</m:t>
+          </m:r>
+          <m:r>
+            <m:rPr>
+              <m:sty m:val="p"/>
+            </m:rPr>
+            <m:t>=</m:t>
+          </m:r>
+          <m:r>
+            <m:rPr>
+              <m:sty m:val="p"/>
+            </m:rPr>
+            <m:t>log</m:t>
+          </m:r>
+          <m:sSub>
+            <m:e>
+              <m:r>
+                <m:t>p</m:t>
+              </m:r>
+            </m:e>
+            <m:sub>
+              <m:r>
+                <m:rPr>
+                  <m:sty m:val="p"/>
+                </m:rPr>
+                <m:t>L</m:t>
+              </m:r>
+              <m:r>
+                <m:rPr>
+                  <m:sty m:val="p"/>
+                </m:rPr>
+                <m:t>L</m:t>
+              </m:r>
+              <m:r>
+                <m:rPr>
+                  <m:sty m:val="p"/>
+                </m:rPr>
+                <m:t>M</m:t>
+              </m:r>
+            </m:sub>
+          </m:sSub>
+          <m:r>
+            <m:rPr>
+              <m:sty m:val="p"/>
+            </m:rPr>
+            <m:t>(</m:t>
+          </m:r>
+          <m:r>
+            <m:t>y</m:t>
+          </m:r>
+          <m:r>
+            <m:rPr>
+              <m:sty m:val="p"/>
+            </m:rPr>
+            <m:t>)</m:t>
+          </m:r>
+          <m:r>
+            <m:rPr>
+              <m:sty m:val="p"/>
+            </m:rPr>
+            <m:t>+</m:t>
+          </m:r>
+          <m:r>
+            <m:t>α</m:t>
+          </m:r>
+          <m:r>
+            <m:rPr>
+              <m:sty m:val="p"/>
+            </m:rPr>
+            <m:t>⋅</m:t>
+          </m:r>
+          <m:r>
+            <m:rPr>
+              <m:sty m:val="p"/>
+            </m:rPr>
+            <m:t>log</m:t>
+          </m:r>
+          <m:r>
+            <m:rPr>
+              <m:sty m:val="p"/>
+            </m:rPr>
+            <m:t>tac</m:t>
+          </m:r>
+          <m:r>
+            <m:rPr>
+              <m:sty m:val="p"/>
+            </m:rPr>
+            <m:t>(</m:t>
+          </m:r>
+          <m:r>
+            <m:t>x</m:t>
+          </m:r>
+          <m:r>
+            <m:rPr>
+              <m:sty m:val="p"/>
+            </m:rPr>
+            <m:t>⋅</m:t>
+          </m:r>
+          <m:r>
+            <m:t>y</m:t>
+          </m:r>
+          <m:r>
+            <m:rPr>
+              <m:sty m:val="p"/>
+            </m:rPr>
+            <m:t>)</m:t>
+          </m:r>
+          <m:r>
+            <m:rPr>
+              <m:sty m:val="p"/>
+            </m:rPr>
+            <m:t>+</m:t>
+          </m:r>
+          <m:r>
+            <m:t>β</m:t>
+          </m:r>
+          <m:r>
+            <m:rPr>
+              <m:sty m:val="p"/>
+            </m:rPr>
+            <m:t>⋅</m:t>
+          </m:r>
+          <m:r>
+            <m:rPr>
+              <m:sty m:val="p"/>
+            </m:rPr>
+            <m:t>log</m:t>
+          </m:r>
+          <m:r>
+            <m:t>​</m:t>
+          </m:r>
+          <m:d>
+            <m:dPr>
+              <m:begChr m:val="("/>
+              <m:sepChr m:val=""/>
+              <m:endChr m:val=")"/>
+              <m:grow/>
+            </m:dPr>
+            <m:e>
+              <m:r>
+                <m:t>1</m:t>
+              </m:r>
+              <m:r>
+                <m:rPr>
+                  <m:sty m:val="p"/>
+                </m:rPr>
+                <m:t>−</m:t>
+              </m:r>
+              <m:r>
+                <m:rPr>
+                  <m:sty m:val="p"/>
+                </m:rPr>
+                <m:t>cb</m:t>
+              </m:r>
+              <m:r>
+                <m:rPr>
+                  <m:sty m:val="p"/>
+                </m:rPr>
+                <m:t>(</m:t>
+              </m:r>
+              <m:r>
+                <m:t>x</m:t>
+              </m:r>
+              <m:r>
+                <m:rPr>
+                  <m:sty m:val="p"/>
+                </m:rPr>
+                <m:t>⋅</m:t>
+              </m:r>
+              <m:r>
+                <m:t>y</m:t>
+              </m:r>
+              <m:r>
+                <m:rPr>
+                  <m:sty m:val="p"/>
+                </m:rPr>
+                <m:t>)</m:t>
+              </m:r>
+            </m:e>
+          </m:d>
+        </m:oMath>
+      </m:oMathPara>
     </w:p>
     <w:p>
       <w:pPr>
-        <w:pStyle w:val="BodyText"/>
+        <w:pStyle w:val="FirstParagraph"/>
         <w:jc w:val="both"/>
         <w:keepNext w:val="0"/>
         <w:keepLines w:val="0"/>

</xml_diff>

<commit_message>
Strip "ref." prefix from in-text citations (ref.[N] -> [N])
- Related-work section: 8 "ref.[N]" -> "[N]" (Vancouver-style numeric citations).
- Rebuilt HTML; regenerated Times-aligned DOCX + PDF (uniform borders, white
  headers, native equation, highlights preserved). Citation order still [1]..[26].

Co-Authored-By: Claude Opus 4.8 <noreply@anthropic.com>
</commit_message>
<xml_diff>
--- a/docs/GuidedRewriteClickbait_v9_cycle1.docx
+++ b/docs/GuidedRewriteClickbait_v9_cycle1.docx
@@ -463,7 +463,7 @@
         <w:widowControl w:val="1"/>
       </w:pPr>
       <w:r>
-        <w:t xml:space="preserve">The field has since expanded in both scope and methodology. As reviewed in ref.[7], clickbait research now spans not only detection algorithms, but also semantic manipulation, curiosity mechanisms, and credibility effects. Methodologically, recent work has shifted toward deep learning and pretrained language models. For example, ref.[8] reports strong performance with a RoBERTa-Large-based detector and complements classification with LIME and SHAP for interpretability, and ref.[9] extends the task to Urdu and highlights the value of sentence embeddings in low-resource settings.</w:t>
+        <w:t xml:space="preserve">The field has since expanded in both scope and methodology. As reviewed in [7], clickbait research now spans not only detection algorithms, but also semantic manipulation, curiosity mechanisms, and credibility effects. Methodologically, recent work has shifted toward deep learning and pretrained language models. For example, [8] reports strong performance with a RoBERTa-Large-based detector and complements classification with LIME and SHAP for interpretability, and [9] extends the task to Urdu and highlights the value of sentence embeddings in low-resource settings.</w:t>
       </w:r>
     </w:p>
     <w:p>
@@ -475,7 +475,7 @@
         <w:widowControl w:val="1"/>
       </w:pPr>
       <w:r>
-        <w:t xml:space="preserve">Recent studies also explore more data-efficient and LLM-oriented paradigms. For instance, ref.[10] shows that strong results can be achieved from headline text alone, even with very limited labeled data, whereas ref.[11] finds that zero-shot and few-shot LLMs remain competitive and multilingual but still lag behind task-specific fine-tuned or prompt-tuned models. Together, these studies indicate that headline-level clickbait detection benefits from explicit supervision and task-adapted modeling rather than relying solely on general-purpose LLM inference.</w:t>
+        <w:t xml:space="preserve">Recent studies also explore more data-efficient and LLM-oriented paradigms. For instance, [10] shows that strong results can be achieved from headline text alone, even with very limited labeled data, whereas [11] finds that zero-shot and few-shot LLMs remain competitive and multilingual but still lag behind task-specific fine-tuned or prompt-tuned models. Together, these studies indicate that headline-level clickbait detection benefits from explicit supervision and task-adapted modeling rather than relying solely on general-purpose LLM inference.</w:t>
       </w:r>
     </w:p>
     <w:p>
@@ -487,7 +487,7 @@
         <w:widowControl w:val="1"/>
       </w:pPr>
       <w:r>
-        <w:t xml:space="preserve">At the same time, recent work suggests that clickbait should not be treated as a purely binary phenomenon. For example, ref.[1] shows that headlines can be too vague or too explicit, and ref.[12] demonstrates that explicit informativeness features improve both performance and interpretability. Finally, ref.[2] moves beyond binary detection toward attribution. Collectively, this line of work motivates treating clickbait as a graded, explainable, and attribute-driven phenomenon, which directly aligns with the present paper's controllable rewriting perspective.</w:t>
+        <w:t xml:space="preserve">At the same time, recent work suggests that clickbait should not be treated as a purely binary phenomenon. For example, [1] shows that headlines can be too vague or too explicit, and [12] demonstrates that explicit informativeness features improve both performance and interpretability. Finally, [2] moves beyond binary detection toward attribution. Collectively, this line of work motivates treating clickbait as a graded, explainable, and attribute-driven phenomenon, which directly aligns with the present paper's controllable rewriting perspective.</w:t>
       </w:r>
     </w:p>
     <w:bookmarkEnd w:id="12"/>

</xml_diff>

<commit_message>
Fix citation correctness: repair combined cite + restore appearance order
Verifying that every [n] points to the correct reference surfaced a renumbering
bug: the 3-number combined citation S("1,2,3") (clickbait-detection papers,
Biyani/Chakraborty/Potthast) was invisible to the earlier renumber regex, so it
stayed [1,2,3] and pointed at the wrong refs (Aubin/Nofar/Llama).

- Fixed that citation and re-permuted the first six references so numbering is
  again strictly by order of first appearance: intro now cites [1],[2,3,4],[5],[6]
  in order (Aubin, Biyani/Chakraborty/Potthast, Nofar, Llama-3).
- Verified: citation order [1]..[26] ascending & complete; all 26 refs cited;
  every named citation (CTRL/PPLM/GeDi/DExperts/FUDGE/BERT/DistilBERT/BERTScore/
  DeBERTa/GPT-2/Qwen/ISOT/Llama/Nofar/Biyani/Chakraborty/Potthast) resolves to
  the correct reference (0 mismatches).
- Regenerated Times-aligned DOCX + PDF.

Co-Authored-By: Claude Opus 4.8 <noreply@anthropic.com>
</commit_message>
<xml_diff>
--- a/docs/GuidedRewriteClickbait_v9_cycle1.docx
+++ b/docs/GuidedRewriteClickbait_v9_cycle1.docx
@@ -230,7 +230,7 @@
         <w:widowControl w:val="1"/>
       </w:pPr>
       <w:r>
-        <w:t xml:space="preserve">Existing research has largely addressed this problem through clickbait detection, classification, and filtering, implicitly treating it as a discrete, undesirable stylistic category. Headlines are typically labeled as clickbait or non-clickbait, and models are trained to identify lexical, syntactic, or pragmatic markers correlated with exaggeration or deception[1,2,3]. While this work has produced useful datasets and benchmarks, it obscures an important distinction: many linguistic devices associated with clickbait, such as curiosity induction, emphasis framing, specificity manipulation, or interrogative constructions, are standard rhetorical tools in journalism. These mechanisms are not inherently misleading; they become problematic only when their use is amplified beyond editorially defensible bounds.</w:t>
+        <w:t xml:space="preserve">Existing research has largely addressed this problem through clickbait detection, classification, and filtering, implicitly treating it as a discrete, undesirable stylistic category. Headlines are typically labeled as clickbait or non-clickbait, and models are trained to identify lexical, syntactic, or pragmatic markers correlated with exaggeration or deception[2,3,4]. While this work has produced useful datasets and benchmarks, it obscures an important distinction: many linguistic devices associated with clickbait, such as curiosity induction, emphasis framing, specificity manipulation, or interrogative constructions, are standard rhetorical tools in journalism. These mechanisms are not inherently misleading; they become problematic only when their use is amplified beyond editorially defensible bounds.</w:t>
       </w:r>
     </w:p>
     <w:p>
@@ -242,7 +242,7 @@
         <w:widowControl w:val="1"/>
       </w:pPr>
       <w:r>
-        <w:t xml:space="preserve">To make this distinction explicit, we define an engagement-attribute rubric that separates clickbait-oriented from clickability-oriented realizations of common headline mechanisms. The full comparison is presented in Table 1 (Section 3.1), where these mechanisms are operationalized for synthetic data generation and controllable guidance. This comparison motivates a shift from binary classification to a continuous, controllable view of engagement. We therefore adopt a generative rather than purely discriminative perspective and posit two core assumptions. First, clickbait and clickability differ in degree rather than kind: clickbait arises when otherwise legitimate engagement mechanisms are amplified beyond proportionate or editorially acceptable levels. Second, engagement can be decomposed into controllable linguistic attributes, allowing individual mechanisms (e.g., curiosity, specificity, or framing) to be selectively strengthened or attenuated while maintaining explicit constraints on semantic fidelity and overall emphasis. This rubric extends prior attribute-based clickbait attribution work[2] by explicitly pairing clickbait and clickability interpretations of each mechanism.</w:t>
+        <w:t xml:space="preserve">To make this distinction explicit, we define an engagement-attribute rubric that separates clickbait-oriented from clickability-oriented realizations of common headline mechanisms. The full comparison is presented in Table 1 (Section 3.1), where these mechanisms are operationalized for synthetic data generation and controllable guidance. This comparison motivates a shift from binary classification to a continuous, controllable view of engagement. We therefore adopt a generative rather than purely discriminative perspective and posit two core assumptions. First, clickbait and clickability differ in degree rather than kind: clickbait arises when otherwise legitimate engagement mechanisms are amplified beyond proportionate or editorially acceptable levels. Second, engagement can be decomposed into controllable linguistic attributes, allowing individual mechanisms (e.g., curiosity, specificity, or framing) to be selectively strengthened or attenuated while maintaining explicit constraints on semantic fidelity and overall emphasis. This rubric extends prior attribute-based clickbait attribution work[5] by explicitly pairing clickbait and clickability interpretations of each mechanism.</w:t>
       </w:r>
     </w:p>
     <w:p>
@@ -263,7 +263,7 @@
         <w:rPr>
           <w:highlight w:val="yellow"/>
         </w:rPr>
-        <w:t xml:space="preserve">using Meta-Llama-3-8B-Instruct[3] as the base generator</w:t>
+        <w:t xml:space="preserve">using Meta-Llama-3-8B-Instruct[6] as the base generator</w:t>
       </w:r>
       <w:r>
         <w:t xml:space="preserve">, guided at inference time by auxiliary models. The LLM is steered by two complementary signals: a BERT-based clickbait scoring model that provides negative guidance to penalize excessive stylistic amplification, and a BERT-based engagement-attribute model that provides positive guidance aligned with specified clickability objectives. By integrating these signals within a guided decoding paradigm, the framework enables fine-grained control over both the degree and type of engagement expressed in rewritten headlines, supporting responsible engagement enhancement without semantic distortion or disproportionate emphasis.</w:t>
@@ -451,7 +451,7 @@
         <w:widowControl w:val="1"/>
       </w:pPr>
       <w:r>
-        <w:t xml:space="preserve">Research on clickbait detection has progressed from feature-engineered classifiers to transformer-based and more interpretable frameworks. Early studies by Biyani et al.[4] and Chakraborty et al.[5] established that clickbait can be detected through lexical, stylistic, and structural cues, while Potthast et al.[6] standardized the task through the Webis Clickbait Corpus 2017 and the Clickbait Challenge, enabling both binary and graded modeling of clickbait strength.</w:t>
+        <w:t xml:space="preserve">Research on clickbait detection has progressed from feature-engineered classifiers to transformer-based and more interpretable frameworks. Early studies by Biyani et al.[2] and Chakraborty et al.[3] established that clickbait can be detected through lexical, stylistic, and structural cues, while Potthast et al.[4] standardized the task through the Webis Clickbait Corpus 2017 and the Clickbait Challenge, enabling both binary and graded modeling of clickbait strength.</w:t>
       </w:r>
     </w:p>
     <w:p>
@@ -487,7 +487,7 @@
         <w:widowControl w:val="1"/>
       </w:pPr>
       <w:r>
-        <w:t xml:space="preserve">At the same time, recent work suggests that clickbait should not be treated as a purely binary phenomenon. For example, [1] shows that headlines can be too vague or too explicit, and [12] demonstrates that explicit informativeness features improve both performance and interpretability. Finally, [2] moves beyond binary detection toward attribution. Collectively, this line of work motivates treating clickbait as a graded, explainable, and attribute-driven phenomenon, which directly aligns with the present paper's controllable rewriting perspective.</w:t>
+        <w:t xml:space="preserve">At the same time, recent work suggests that clickbait should not be treated as a purely binary phenomenon. For example, [1] shows that headlines can be too vague or too explicit, and [12] demonstrates that explicit informativeness features improve both performance and interpretability. Finally, [5] moves beyond binary detection toward attribution. Collectively, this line of work motivates treating clickbait as a graded, explainable, and attribute-driven phenomenon, which directly aligns with the present paper's controllable rewriting perspective.</w:t>
       </w:r>
     </w:p>
     <w:bookmarkEnd w:id="12"/>
@@ -5057,7 +5057,7 @@
         <w:rPr>
           <w:highlight w:val="yellow"/>
         </w:rPr>
-        <w:t xml:space="preserve">A scorer trained on GPT-4o-mini rewrites could in principle key on generator artefacts rather than clickbait, so we validate both guide models on two entirely human-authored corpora never seen in training: the Chakraborty et al.[5] corpus (32,000 balanced headlines) and the Webis Clickbait Corpus 2017[6] (2,459 graded headlines). We additionally train a fully independent DistilBERT clickbait detector on the human-authored Chakraborty data alone, and use that independent detector, never our own guide, for every clickbait number reported in the rewrite evaluation below. All figures carry 95% percentile-bootstrap confidence intervals (n = 1000).</w:t>
+        <w:t xml:space="preserve">A scorer trained on GPT-4o-mini rewrites could in principle key on generator artefacts rather than clickbait, so we validate both guide models on two entirely human-authored corpora never seen in training: the Chakraborty et al.[3] corpus (32,000 balanced headlines) and the Webis Clickbait Corpus 2017[4] (2,459 graded headlines). We additionally train a fully independent DistilBERT clickbait detector on the human-authored Chakraborty data alone, and use that independent detector, never our own guide, for every clickbait number reported in the rewrite evaluation below. All figures carry 95% percentile-bootstrap confidence intervals (n = 1000).</w:t>
       </w:r>
     </w:p>
     <w:p>
@@ -11538,7 +11538,7 @@
         <w:rPr>
           <w:highlight w:val="yellow"/>
         </w:rPr>
-        <w:t xml:space="preserve">Several limitations frame the empirical scope of the current work. First, the synthetic corpus is built exclusively from the real Reuters political and world-news headlines described in Section 3.2 (the genuine-news half of the ISOT dataset); extending both guide models to tabloid, entertainment, and non-English registers remains open, although Section 4.12 shows that the trained guides already transfer at inference to a different, human-authored, non-Reuters English-news register with the same directional effects; the results in Section 4 should otherwise be read within this domain. Second, the neutrality of the Reuters source headlines is quantified rather than assumed: the independent detector flags only 0.61% of the source pool (Section 4.7). Third, the external evaluation on the Webis Clickbait Corpus 2017[6] and the Chakraborty et al.[5] corpus (Section 4.5) measures the synthetic-to-human distribution shift directly, with AUROC 0.955 on clean human clickbait and 0.740 on the noisier graded corpus. Fourth, the decoding-time guides operate as amplifiers on top of the prompt: they deliver their effect when the prompt names the target tactic (on the 40-item α–β tuning sweep, independent tactic realization +0.075, from 0.44 to 0.51, as α goes 0→4; on the 300-item held-out set the same contrast is +0.03, 0.48 to 0.51, Table 6), consistent with top-k rescoring reweighting tokens the base model already proposes; the framework is therefore designed and evaluated as prompt-plus-guidance. Fifth, all three decoding-time methods realize the target tactic to a comparable degree, and the single-axis baselines match the dual guide's fidelity at low steering; the dual guide's distinctive capability is the independent clickbait brake, which decouples engagement from clickbait so that induced clickbait stays low as engagement rises, while the single-axis baselines raise induced clickbait as they steer toward the same tactic (Section 4.9). All quantitative comparisons use item-matched significance testing with 95% bootstrap confidence intervals.</w:t>
+        <w:t xml:space="preserve">Several limitations frame the empirical scope of the current work. First, the synthetic corpus is built exclusively from the real Reuters political and world-news headlines described in Section 3.2 (the genuine-news half of the ISOT dataset); extending both guide models to tabloid, entertainment, and non-English registers remains open, although Section 4.12 shows that the trained guides already transfer at inference to a different, human-authored, non-Reuters English-news register with the same directional effects; the results in Section 4 should otherwise be read within this domain. Second, the neutrality of the Reuters source headlines is quantified rather than assumed: the independent detector flags only 0.61% of the source pool (Section 4.7). Third, the external evaluation on the Webis Clickbait Corpus 2017[4] and the Chakraborty et al.[3] corpus (Section 4.5) measures the synthetic-to-human distribution shift directly, with AUROC 0.955 on clean human clickbait and 0.740 on the noisier graded corpus. Fourth, the decoding-time guides operate as amplifiers on top of the prompt: they deliver their effect when the prompt names the target tactic (on the 40-item α–β tuning sweep, independent tactic realization +0.075, from 0.44 to 0.51, as α goes 0→4; on the 300-item held-out set the same contrast is +0.03, 0.48 to 0.51, Table 6), consistent with top-k rescoring reweighting tokens the base model already proposes; the framework is therefore designed and evaluated as prompt-plus-guidance. Fifth, all three decoding-time methods realize the target tactic to a comparable degree, and the single-axis baselines match the dual guide's fidelity at low steering; the dual guide's distinctive capability is the independent clickbait brake, which decouples engagement from clickbait so that induced clickbait stays low as engagement rises, while the single-axis baselines raise induced clickbait as they steer toward the same tactic (Section 4.9). All quantitative comparisons use item-matched significance testing with 95% bootstrap confidence intervals.</w:t>
       </w:r>
     </w:p>
     <w:p>
@@ -11689,7 +11689,23 @@
         <w:t xml:space="preserve">2. </w:t>
       </w:r>
       <w:r>
-        <w:t xml:space="preserve">Nofar, L., Portal, T., Elbaz, A., Apartsin, A. &amp; Aperstein, Y. An interpretable benchmark for clickbait detection and tactic attribution. Preprint at https://arxiv.org/abs/2509.10937 (2025).</w:t>
+        <w:t xml:space="preserve">Biyani, P., Tsioutsiouliklis, K. &amp; Blackmer, J. "8 amazing secrets for getting more clicks": detecting clickbaits in news streams using article informality. In</w:t>
+      </w:r>
+      <w:r>
+        <w:t xml:space="preserve"> </w:t>
+      </w:r>
+      <w:r>
+        <w:rPr>
+          <w:i/>
+          <w:iCs/>
+        </w:rPr>
+        <w:t xml:space="preserve">Proc. 30th AAAI Conf. on Artificial Intelligence</w:t>
+      </w:r>
+      <w:r>
+        <w:t xml:space="preserve"> </w:t>
+      </w:r>
+      <w:r>
+        <w:t xml:space="preserve">94–102 (AAAI Press, 2016).</w:t>
       </w:r>
     </w:p>
     <w:p>
@@ -11710,7 +11726,7 @@
         <w:t xml:space="preserve">3. </w:t>
       </w:r>
       <w:r>
-        <w:t xml:space="preserve">Grattafiori, A.</w:t>
+        <w:t xml:space="preserve">Chakraborty, A., Paranjape, B., Kakarla, S. &amp; Ganguly, N. Stop clickbait: detecting and preventing clickbaits in online news media. In</w:t>
       </w:r>
       <w:r>
         <w:t xml:space="preserve"> </w:t>
@@ -11720,13 +11736,13 @@
           <w:i/>
           <w:iCs/>
         </w:rPr>
-        <w:t xml:space="preserve">et al.</w:t>
+        <w:t xml:space="preserve">Proc. IEEE/ACM Int. Conf. on Advances in Social Networks Analysis and Mining (ASONAM)</w:t>
       </w:r>
       <w:r>
         <w:t xml:space="preserve"> </w:t>
       </w:r>
       <w:r>
-        <w:t xml:space="preserve">The Llama 3 herd of models. Preprint at https://arxiv.org/abs/2407.21783 (2024).</w:t>
+        <w:t xml:space="preserve">9–16 (IEEE, 2016).</w:t>
       </w:r>
     </w:p>
     <w:p>
@@ -11747,23 +11763,7 @@
         <w:t xml:space="preserve">4. </w:t>
       </w:r>
       <w:r>
-        <w:t xml:space="preserve">Biyani, P., Tsioutsiouliklis, K. &amp; Blackmer, J. "8 amazing secrets for getting more clicks": detecting clickbaits in news streams using article informality. In</w:t>
-      </w:r>
-      <w:r>
-        <w:t xml:space="preserve"> </w:t>
-      </w:r>
-      <w:r>
-        <w:rPr>
-          <w:i/>
-          <w:iCs/>
-        </w:rPr>
-        <w:t xml:space="preserve">Proc. 30th AAAI Conf. on Artificial Intelligence</w:t>
-      </w:r>
-      <w:r>
-        <w:t xml:space="preserve"> </w:t>
-      </w:r>
-      <w:r>
-        <w:t xml:space="preserve">94–102 (AAAI Press, 2016).</w:t>
+        <w:t xml:space="preserve">Potthast, M., Gollub, T., Hagen, M. &amp; Stein, B. The Clickbait Challenge 2017: towards a regression model for clickbait strength. Preprint at https://arxiv.org/abs/1812.10847 (2018).</w:t>
       </w:r>
     </w:p>
     <w:p>
@@ -11784,23 +11784,7 @@
         <w:t xml:space="preserve">5. </w:t>
       </w:r>
       <w:r>
-        <w:t xml:space="preserve">Chakraborty, A., Paranjape, B., Kakarla, S. &amp; Ganguly, N. Stop clickbait: detecting and preventing clickbaits in online news media. In</w:t>
-      </w:r>
-      <w:r>
-        <w:t xml:space="preserve"> </w:t>
-      </w:r>
-      <w:r>
-        <w:rPr>
-          <w:i/>
-          <w:iCs/>
-        </w:rPr>
-        <w:t xml:space="preserve">Proc. IEEE/ACM Int. Conf. on Advances in Social Networks Analysis and Mining (ASONAM)</w:t>
-      </w:r>
-      <w:r>
-        <w:t xml:space="preserve"> </w:t>
-      </w:r>
-      <w:r>
-        <w:t xml:space="preserve">9–16 (IEEE, 2016).</w:t>
+        <w:t xml:space="preserve">Nofar, L., Portal, T., Elbaz, A., Apartsin, A. &amp; Aperstein, Y. An interpretable benchmark for clickbait detection and tactic attribution. Preprint at https://arxiv.org/abs/2509.10937 (2025).</w:t>
       </w:r>
     </w:p>
     <w:p>
@@ -11821,7 +11805,23 @@
         <w:t xml:space="preserve">6. </w:t>
       </w:r>
       <w:r>
-        <w:t xml:space="preserve">Potthast, M., Gollub, T., Hagen, M. &amp; Stein, B. The Clickbait Challenge 2017: towards a regression model for clickbait strength. Preprint at https://arxiv.org/abs/1812.10847 (2018).</w:t>
+        <w:t xml:space="preserve">Grattafiori, A.</w:t>
+      </w:r>
+      <w:r>
+        <w:t xml:space="preserve"> </w:t>
+      </w:r>
+      <w:r>
+        <w:rPr>
+          <w:i/>
+          <w:iCs/>
+        </w:rPr>
+        <w:t xml:space="preserve">et al.</w:t>
+      </w:r>
+      <w:r>
+        <w:t xml:space="preserve"> </w:t>
+      </w:r>
+      <w:r>
+        <w:t xml:space="preserve">The Llama 3 herd of models. Preprint at https://arxiv.org/abs/2407.21783 (2024).</w:t>
       </w:r>
     </w:p>
     <w:p>

</xml_diff>

<commit_message>
Rebuild paper + letter DOCX/PDF (yellow prior-round + red this-round highlights)
- Paper DOCX regenerated from HTML via html2doc (native OMML equation, 7/7
  figures, Times New Roman, uniform table borders, white headers); highlights
  re-applied so plain <mark> renders YELLOW (prior round) and <mark class=red>
  renders RED (this round): 460 yellow + 80 red runs. Includes new Table 13.
- Letter DOCX/PDF rebuilt from the current markdown through the same toolchain
  for consistent typography (no highlights; a response letter carries none).
- docs/ mirror updated for the index links.

Co-Authored-By: Claude Opus 4.8 <noreply@anthropic.com>
</commit_message>
<xml_diff>
--- a/docs/GuidedRewriteClickbait_v9_cycle1.docx
+++ b/docs/GuidedRewriteClickbait_v9_cycle1.docx
@@ -168,7 +168,40 @@
         <w:rPr>
           <w:highlight w:val="yellow"/>
         </w:rPr>
-        <w:t xml:space="preserve">Optimizing news headlines for reader engagement is often conflated with clickbait, producing exaggerated or misleading phrasing that erodes editorial trust. We reframe clickbait not as a separate category but as the disproportionate amplification of otherwise legitimate engagement cues, and cast headline rewriting as a controllable generation problem in which chosen engagement attributes are strengthened under explicit faithfulness constraints. We steer a large language model at inference time with two lightweight guide models: a clickbait scorer providing negative guidance and an engagement-attribute model providing positive guidance, combined during decoding so engagement can be increased while clickbait is restrained. Both guides are trained on neutral news headlines and their synthetically amplified variants and transfer to entirely human-authored clickbait corpora. On held-out headlines, an ablation shows the two guides exert independent, opposite effects, and benchmarked against the decoding-time control methods DExperts and GeDi the dual guide adds an independent clickbait brake, a dedicated lever that lowers induced clickbait at a chosen engagement level and that single-axis methods lack. Independent automatic metrics and a three-annotator human study confirm higher faithfulness and lower induced clickbait than these baselines. The framework supports responsible headline optimization in journalism.</w:t>
+        <w:t xml:space="preserve">Optimizing news headlines for reader engagement is often conflated with clickbait, producing exaggerated or misleading phrasing that erodes editorial trust. We reframe clickbait not as a separate category but as the disproportionate amplification of otherwise legitimate engagement cues, and cast headline rewriting as a controllable generation problem in which chosen engagement attributes are strengthened under explicit faithfulness constraints. We steer a large language model at inference time with two lightweight guide models: a clickbait scorer providing negative guidance and an engagement-attribute model providing positive guidance,</w:t>
+      </w:r>
+      <w:r>
+        <w:rPr>
+          <w:highlight w:val="yellow"/>
+        </w:rPr>
+        <w:t xml:space="preserve"> </w:t>
+      </w:r>
+      <w:r>
+        <w:rPr>
+          <w:highlight w:val="red"/>
+        </w:rPr>
+        <w:t xml:space="preserve">combined during decoding so a chosen engagement attribute can be selectively strengthened while clickbait is restrained.</w:t>
+      </w:r>
+      <w:r>
+        <w:t xml:space="preserve"> </w:t>
+      </w:r>
+      <w:r>
+        <w:rPr>
+          <w:highlight w:val="red"/>
+        </w:rPr>
+        <w:t xml:space="preserve">Both guides are trained on neutral news headlines and their synthetically amplified variants; the clickbait guide is externally validated on human-authored corpora, and the engagement guide's attribute scores correlate with human clickbait.</w:t>
+      </w:r>
+      <w:r>
+        <w:rPr>
+          <w:highlight w:val="yellow"/>
+        </w:rPr>
+        <w:t xml:space="preserve"> </w:t>
+      </w:r>
+      <w:r>
+        <w:rPr>
+          <w:highlight w:val="yellow"/>
+        </w:rPr>
+        <w:t xml:space="preserve">On held-out headlines, an ablation shows the two guides exert independent, opposite effects, and benchmarked against the decoding-time control methods DExperts and GeDi the dual guide adds an independent clickbait brake, a dedicated lever that lowers induced clickbait at a chosen engagement level and that single-axis methods lack. Independent automatic metrics and a three-annotator human study confirm higher faithfulness and lower induced clickbait than these baselines. The framework supports responsible headline optimization in journalism.</w:t>
       </w:r>
     </w:p>
     <w:p>
@@ -1872,7 +1905,16 @@
         <w:rPr>
           <w:highlight w:val="yellow"/>
         </w:rPr>
-        <w:t xml:space="preserve">The full generation prompt, batch size (15 headlines per API call), the up-to-three-tactic sampling rule, and the JSON self-repair retry policy are documented in Section 3.6 and released with the code repository. This procedure yields 12,599 validated clickbait variants (from 12,600 source headlines) after JSON-validity and duplicate filtering, released as a single CSV with columns original, clickbait, and methods_vector.</w:t>
+        <w:t xml:space="preserve">The full generation prompt, batch size (15 headlines per API call), the up-to-three-tactic sampling rule, and the JSON self-repair retry policy are documented in Section 3.6 and released with the code repository.</w:t>
+      </w:r>
+      <w:r>
+        <w:t xml:space="preserve"> </w:t>
+      </w:r>
+      <w:r>
+        <w:rPr>
+          <w:highlight w:val="red"/>
+        </w:rPr>
+        <w:t xml:space="preserve">The True.csv split of the ISOT dataset contains 20,825 unique Reuters headlines (whose neutrality is verified in Section 4.7); 12,600 of them are used as generation sources, yielding 12,599 validated clickbait variants after JSON-validity and duplicate filtering, released as a single CSV with columns original, clickbait, and methods_vector.</w:t>
       </w:r>
     </w:p>
     <w:p>
@@ -2897,7 +2939,25 @@
         <w:rPr>
           <w:highlight w:val="yellow"/>
         </w:rPr>
-        <w:t xml:space="preserve">Guide models: two BERT-base encoders, each fine-tuned for 2–3 epochs with early stopping on validation loss, AdamW at learning rate 2×10⁻⁵ with linear decay, mixed prefix-length mini-batches, and a length-aware weighted loss that down-weights very short prefixes (&lt; 4 tokens). Synthetic data: the 12,600 neutral source headlines are the real Reuters headlines described in Section 3.2 (the genuine-news True.csv split of the ISOT dataset), yielding 12,599 validated clickbait variants after JSON-validity and duplicate filtering; GPT-4o-mini generates in batches of 15 at temperature 0.7, each call activating 1–3 tactics uniformly sampled from the ten-attribute rubric, with a GPT-based JSON self-repair retry (up to three attempts). The clickbait guide reaches AUROC 0.9998 and the ten-label engagement guide macro-F1 0.49 on the held-out synthetic test split (the full per-tactic and confusion-matrix evaluation is released in the deposit); the external-corpus and prefix-level validations of Sections 4.5–4.6 characterize their transfer to human-authored data. A separate DistilBERT[22] detector trained only on the human-authored Chakraborty corpus is used as the independent clickbait evaluator throughout Section 4. Complete prompt templates and all training/decoding hyperparameters are released with the deposit; approximate wall-clock cost is ≈ 1.2 s per rewritten headline on the A10G/L40S configuration.</w:t>
+        <w:t xml:space="preserve">Guide models: two BERT-base encoders, each fine-tuned for 2–3 epochs with early stopping on validation loss, AdamW at learning rate 2×10⁻⁵ with linear decay, mixed prefix-length mini-batches, and a length-aware weighted loss that down-weights very short prefixes (&lt; 4 tokens). Synthetic data: the 12,600 neutral source headlines are the real Reuters headlines described in Section 3.2</w:t>
+      </w:r>
+      <w:r>
+        <w:rPr>
+          <w:highlight w:val="yellow"/>
+        </w:rPr>
+        <w:t xml:space="preserve"> </w:t>
+      </w:r>
+      <w:r>
+        <w:rPr>
+          <w:highlight w:val="red"/>
+        </w:rPr>
+        <w:t xml:space="preserve">(sampled from the 20,825 unique Reuters headlines of the True.csv split, whose neutrality is verified in Section 4.7)</w:t>
+      </w:r>
+      <w:r>
+        <w:rPr>
+          <w:highlight w:val="yellow"/>
+        </w:rPr>
+        <w:t xml:space="preserve">, yielding 12,599 validated clickbait variants after JSON-validity and duplicate filtering; GPT-4o-mini generates in batches of 15 at temperature 0.7, each call activating 1–3 tactics uniformly sampled from the ten-attribute rubric, with a GPT-based JSON self-repair retry (up to three attempts). The clickbait guide reaches AUROC 0.9998 and the ten-label engagement guide macro-F1 0.49 on the held-out synthetic test split (the full per-tactic and confusion-matrix evaluation is released in the deposit); the external-corpus and prefix-level validations of Sections 4.5–4.6 characterize their transfer to human-authored data. A separate DistilBERT[22] detector trained only on the human-authored Chakraborty corpus is used as the independent clickbait evaluator throughout Section 4. Complete prompt templates and all training/decoding hyperparameters are released with the deposit; approximate wall-clock cost is ≈ 1.2 s per rewritten headline on the A10G/L40S configuration.</w:t>
       </w:r>
     </w:p>
     <w:bookmarkEnd w:id="26"/>
@@ -3116,6 +3176,24 @@
         </w:rPr>
         <w:t xml:space="preserve">All method comparisons use item-matched significance testing (Wilcoxon signed-rank on the same source headlines) with 95% percentile-bootstrap confidence intervals, matched-pairs rank-biserial effect sizes, and Holm correction across each family of tests, so that a reported difference reflects a consistent per-item effect rather than aggregate noise. The tactic judge itself is not treated as ground truth: its confirmation rate for the intended tactic (≈ 0.50) agrees with the independent intended-vs-consensus recoverability from the rater study (F1 = 0.44, Section 4.10), indicating that both measurements track the same graded structure of fine-grained tactic recovery rather than idiosyncratic judge noise.</w:t>
       </w:r>
+      <w:r>
+        <w:t xml:space="preserve"> </w:t>
+      </w:r>
+      <w:r>
+        <w:rPr>
+          <w:highlight w:val="red"/>
+        </w:rPr>
+        <w:t xml:space="preserve">Two test families are corrected together: (i) the four ablation contrasts against the (0,0) cell (Table 6) and (ii) the cross-method rater faithfulness comparisons (Table 9); every reported significant p-value remains significant after Holm correction within its family. Matched-pairs rank-biserial effect sizes accompany the key contrasts: for the ablation, r = 0.22 for the engagement contrast (4,0) and r = 0.19 for the dual (4,2) versus (0,0) (the Paired-win column of Table 6); for the rater study, the dual guide is more faithful than the no-guidance, DExperts, and GeDi baselines with r = 0.67, 0.82, and 0.91, and lower in perceived clickbait than the no-guidance baseline with r = −0.66.</w:t>
+      </w:r>
+      <w:r>
+        <w:t xml:space="preserve"> </w:t>
+      </w:r>
+      <w:r>
+        <w:rPr>
+          <w:highlight w:val="red"/>
+        </w:rPr>
+        <w:t xml:space="preserve">Table 13 collects these confirmatory comparisons in one place, reporting for each the sample size, the raw and Holm-adjusted p-value, the effect size, and the bootstrap 95% confidence interval on the mean paired difference.</w:t>
+      </w:r>
     </w:p>
     <w:bookmarkEnd w:id="27"/>
     <w:bookmarkEnd w:id="28"/>
@@ -3172,14 +3250,14 @@
       <w:r>
         <w:drawing>
           <wp:inline>
-            <wp:extent cx="5943600" cy="3739738"/>
+            <wp:extent cx="5943600" cy="3566159"/>
             <wp:effectExtent b="0" l="0" r="0" t="0"/>
             <wp:docPr descr="Dataset composition bar chart" title="" id="30" name="Picture"/>
             <a:graphic>
               <a:graphicData uri="http://schemas.openxmlformats.org/drawingml/2006/picture">
                 <pic:pic>
                   <pic:nvPicPr>
-                    <pic:cNvPr descr="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" id="31" name="Picture"/>
+                    <pic:cNvPr descr="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" id="31" name="Picture"/>
                     <pic:cNvPicPr>
                       <a:picLocks noChangeArrowheads="1" noChangeAspect="1"/>
                     </pic:cNvPicPr>
@@ -3193,7 +3271,7 @@
                   <pic:spPr bwMode="auto">
                     <a:xfrm>
                       <a:off x="0" y="0"/>
-                      <a:ext cx="5943600" cy="3739738"/>
+                      <a:ext cx="5943600" cy="3566159"/>
                     </a:xfrm>
                     <a:prstGeom prst="rect">
                       <a:avLst/>
@@ -3239,8 +3317,9 @@
         <w:rPr>
           <w:b w:val="0"/>
           <w:i/>
-        </w:rPr>
-        <w:t>Dataset composition by engagement intensity. Neutral headlines contain 0 active tactics, whereas clickbait variants are generated with 1, 2, or 3 active tactics.</w:t>
+          <w:highlight w:val="red"/>
+        </w:rPr>
+        <w:t>Dataset composition by engagement intensity (12,599 neutral source headlines and their 12,599 clickbait variants). Neutral headlines contain 0 active tactics, whereas clickbait variants are generated with 1, 2, or 3 active tactics.</w:t>
       </w:r>
     </w:p>
     <w:bookmarkEnd w:id="32"/>
@@ -5164,7 +5243,7 @@
                 <w:rFonts w:ascii="Times New Roman" w:hAnsi="Times New Roman"/>
                 <w:b/>
                 <w:sz w:val="19"/>
-                <w:highlight w:val="yellow"/>
+                <w:highlight w:val="red"/>
               </w:rPr>
               <w:t xml:space="preserve">n</w:t>
             </w:r>
@@ -5491,7 +5570,19 @@
         <w:rPr>
           <w:highlight w:val="yellow"/>
         </w:rPr>
-        <w:t xml:space="preserve">The guide generalizes strongly to clean human-authored clickbait (Chakraborty AUROC 0.955) and moderately, but significantly, to the noisier graded Webis corpus (AUROC 0.740; graded-strength Spearman 0.43). The engagement-attribute guide shows the same external validity: on Webis, all ten tactics score significantly higher on human clickbait than on non-clickbait headlines (Spearman r = 0.34–0.45, every p &lt; 1×10⁻⁶⁰). The guides therefore transfer to entirely unseen, human-authored data.</w:t>
+        <w:t xml:space="preserve">The guide generalizes strongly to clean human-authored clickbait (Chakraborty AUROC 0.955) and moderately, but significantly, to the noisier graded Webis corpus (AUROC 0.740; graded-strength Spearman 0.43).</w:t>
+      </w:r>
+      <w:r>
+        <w:rPr>
+          <w:highlight w:val="yellow"/>
+        </w:rPr>
+        <w:t xml:space="preserve"> </w:t>
+      </w:r>
+      <w:r>
+        <w:rPr>
+          <w:highlight w:val="red"/>
+        </w:rPr>
+        <w:t xml:space="preserve">The engagement-attribute guide cannot be validated in the same way, because no public corpus provides tactic-level ground truth. As an indirect check, each of its ten attribute scores correlates with the overall human clickbait label on Webis (Spearman r = 0.34–0.45, every p &lt; 1×10⁻⁶⁰), confirming that the attributes track human-perceived clickbait even though per-tactic accuracy on human data cannot be measured directly. The clickbait guide therefore transfers to unseen human-authored data with directly measured accuracy, whereas the engagement guide's external evidence is this attribute-level correlation.</w:t>
       </w:r>
     </w:p>
     <w:bookmarkEnd w:id="42"/>
@@ -6227,7 +6318,23 @@
                 <w:sz w:val="18"/>
                 <w:highlight w:val="yellow"/>
               </w:rPr>
-              <w:t xml:space="preserve">0.610 (p≈1×10⁻¹³)</w:t>
+              <w:t xml:space="preserve">0.610 (</w:t>
+            </w:r>
+            <w:r>
+              <w:rPr>
+                <w:rFonts w:ascii="Times New Roman" w:hAnsi="Times New Roman"/>
+                <w:sz w:val="18"/>
+                <w:highlight w:val="yellow"/>
+              </w:rPr>
+              <w:t xml:space="preserve">r = 0.22</w:t>
+            </w:r>
+            <w:r>
+              <w:rPr>
+                <w:rFonts w:ascii="Times New Roman" w:hAnsi="Times New Roman"/>
+                <w:sz w:val="18"/>
+                <w:highlight w:val="yellow"/>
+              </w:rPr>
+              <w:t xml:space="preserve">, p ≈ 1×10⁻¹³)</w:t>
             </w:r>
           </w:p>
         </w:tc>
@@ -6392,6 +6499,22 @@
               </w:rPr>
               <w:t xml:space="preserve">0.444</w:t>
             </w:r>
+            <w:r>
+              <w:rPr>
+                <w:rFonts w:ascii="Times New Roman" w:hAnsi="Times New Roman"/>
+                <w:sz w:val="18"/>
+                <w:highlight w:val="yellow"/>
+              </w:rPr>
+              <w:t xml:space="preserve"> </w:t>
+            </w:r>
+            <w:r>
+              <w:rPr>
+                <w:rFonts w:ascii="Times New Roman" w:hAnsi="Times New Roman"/>
+                <w:sz w:val="18"/>
+                <w:highlight w:val="yellow"/>
+              </w:rPr>
+              <w:t xml:space="preserve">(r = −0.11)</w:t>
+            </w:r>
           </w:p>
         </w:tc>
       </w:tr>
@@ -6553,7 +6676,23 @@
                 <w:sz w:val="18"/>
                 <w:highlight w:val="yellow"/>
               </w:rPr>
-              <w:t xml:space="preserve">0.597 (p≈3×10⁻⁹)</w:t>
+              <w:t xml:space="preserve">0.597 (</w:t>
+            </w:r>
+            <w:r>
+              <w:rPr>
+                <w:rFonts w:ascii="Times New Roman" w:hAnsi="Times New Roman"/>
+                <w:sz w:val="18"/>
+                <w:highlight w:val="yellow"/>
+              </w:rPr>
+              <w:t xml:space="preserve">r = 0.19</w:t>
+            </w:r>
+            <w:r>
+              <w:rPr>
+                <w:rFonts w:ascii="Times New Roman" w:hAnsi="Times New Roman"/>
+                <w:sz w:val="18"/>
+                <w:highlight w:val="yellow"/>
+              </w:rPr>
+              <w:t xml:space="preserve">, p ≈ 3×10⁻⁹)</w:t>
             </w:r>
           </w:p>
         </w:tc>
@@ -7182,6 +7321,22 @@
               </w:rPr>
               <w:t xml:space="preserve">0.520</w:t>
             </w:r>
+            <w:r>
+              <w:rPr>
+                <w:rFonts w:ascii="Times New Roman" w:hAnsi="Times New Roman"/>
+                <w:sz w:val="19"/>
+                <w:highlight w:val="yellow"/>
+              </w:rPr>
+              <w:t xml:space="preserve"> </w:t>
+            </w:r>
+            <w:r>
+              <w:rPr>
+                <w:rFonts w:ascii="Times New Roman" w:hAnsi="Times New Roman"/>
+                <w:sz w:val="19"/>
+                <w:highlight w:val="yellow"/>
+              </w:rPr>
+              <w:t xml:space="preserve">(0.45–0.59)</w:t>
+            </w:r>
           </w:p>
         </w:tc>
         <w:tc>
@@ -7299,6 +7454,22 @@
               </w:rPr>
               <w:t xml:space="preserve">0.465</w:t>
             </w:r>
+            <w:r>
+              <w:rPr>
+                <w:rFonts w:ascii="Times New Roman" w:hAnsi="Times New Roman"/>
+                <w:sz w:val="19"/>
+                <w:highlight w:val="yellow"/>
+              </w:rPr>
+              <w:t xml:space="preserve"> </w:t>
+            </w:r>
+            <w:r>
+              <w:rPr>
+                <w:rFonts w:ascii="Times New Roman" w:hAnsi="Times New Roman"/>
+                <w:sz w:val="19"/>
+                <w:highlight w:val="yellow"/>
+              </w:rPr>
+              <w:t xml:space="preserve">(0.40–0.54)</w:t>
+            </w:r>
           </w:p>
         </w:tc>
         <w:tc>
@@ -7416,6 +7587,22 @@
               </w:rPr>
               <w:t xml:space="preserve">0.500</w:t>
             </w:r>
+            <w:r>
+              <w:rPr>
+                <w:rFonts w:ascii="Times New Roman" w:hAnsi="Times New Roman"/>
+                <w:sz w:val="19"/>
+                <w:highlight w:val="yellow"/>
+              </w:rPr>
+              <w:t xml:space="preserve"> </w:t>
+            </w:r>
+            <w:r>
+              <w:rPr>
+                <w:rFonts w:ascii="Times New Roman" w:hAnsi="Times New Roman"/>
+                <w:sz w:val="19"/>
+                <w:highlight w:val="yellow"/>
+              </w:rPr>
+              <w:t xml:space="preserve">(0.42–0.57)</w:t>
+            </w:r>
           </w:p>
         </w:tc>
         <w:tc>
@@ -7533,6 +7720,22 @@
               </w:rPr>
               <w:t xml:space="preserve">0.465</w:t>
             </w:r>
+            <w:r>
+              <w:rPr>
+                <w:rFonts w:ascii="Times New Roman" w:hAnsi="Times New Roman"/>
+                <w:sz w:val="19"/>
+                <w:highlight w:val="yellow"/>
+              </w:rPr>
+              <w:t xml:space="preserve"> </w:t>
+            </w:r>
+            <w:r>
+              <w:rPr>
+                <w:rFonts w:ascii="Times New Roman" w:hAnsi="Times New Roman"/>
+                <w:sz w:val="19"/>
+                <w:highlight w:val="yellow"/>
+              </w:rPr>
+              <w:t xml:space="preserve">(0.39–0.54)</w:t>
+            </w:r>
           </w:p>
         </w:tc>
         <w:tc>
@@ -7649,6 +7852,22 @@
                 <w:highlight w:val="yellow"/>
               </w:rPr>
               <w:t xml:space="preserve">0.500</w:t>
+            </w:r>
+            <w:r>
+              <w:rPr>
+                <w:rFonts w:ascii="Times New Roman" w:hAnsi="Times New Roman"/>
+                <w:sz w:val="19"/>
+                <w:highlight w:val="yellow"/>
+              </w:rPr>
+              <w:t xml:space="preserve"> </w:t>
+            </w:r>
+            <w:r>
+              <w:rPr>
+                <w:rFonts w:ascii="Times New Roman" w:hAnsi="Times New Roman"/>
+                <w:sz w:val="19"/>
+                <w:highlight w:val="yellow"/>
+              </w:rPr>
+              <w:t xml:space="preserve">(0.42–0.57)</w:t>
             </w:r>
           </w:p>
         </w:tc>
@@ -8728,6 +8947,21 @@
     </w:p>
     <w:p>
       <w:pPr>
+        <w:pStyle w:val="BodyText"/>
+        <w:jc w:val="both"/>
+        <w:keepNext w:val="0"/>
+        <w:keepLines w:val="0"/>
+        <w:widowControl w:val="1"/>
+      </w:pPr>
+      <w:r>
+        <w:rPr>
+          <w:highlight w:val="red"/>
+        </w:rPr>
+        <w:t xml:space="preserve">Perceived engagement warrants a separate note. On the human 1–5 scale, engagement at the dual operating point is at or below the no-guidance baseline (2.90 versus 3.46), because perceived click-appeal is entangled with clickbait cues: the brake, by design, removes the very cues that inflate a headline's apparent pull. Two observations show engagement is nonetheless controllable rather than sacrificed. First, the positive guide raises perceived engagement on its own (engage-only 3.51 versus the 3.46 baseline), validating the engagement mechanism; the dual setting then trades a portion of that appeal for lower clickbait and higher faithfulness. Second, on an independent LLM engagement judge scored across the full α×β grid (n = 840), the dual point holds engagement at or above the no-guidance baseline (0.925 versus 0.900 on a 0–1 scale) while cutting induced clickbait, and a neighbouring operating point (α = 4, β = 1) raises engagement further (0.942) at comparable low clickbait (0.058). Engagement is therefore a controllable axis set by α; the reported operating point (4, 2) deliberately favours faithfulness and clickbait suppression over maximal perceived appeal, and a lower brake such as (4, 1) is available when engagement is the priority.</w:t>
+      </w:r>
+    </w:p>
+    <w:p>
+      <w:pPr>
         <w:pStyle w:val="TableCaption"/>
         <w:spacing w:before="280" w:after="60" w:line="240" w:lineRule="auto"/>
         <w:jc w:val="center"/>
@@ -9878,7 +10112,31 @@
         <w:rPr>
           <w:highlight w:val="yellow"/>
         </w:rPr>
-        <w:t xml:space="preserve">To test whether the framework generalizes beyond Reuters newswire, we apply the same guides, at the same operating point (α = 4, β = 2), to 150 human-authored, non-Reuters neutral headlines: the non-clickbait half of the Chakraborty corpus, spanning disasters, culture, and financial markets rather than political newswire. The two guides reproduce their designed, opposite effects on this different register (Table 11). The engagement guide raises tactic realization (guide-based, 0.10 → 0.16) and, with it, induced clickbait (0.05 → 0.10), while the clickbait brake lowers the independent clickbait score back from 0.097 to 0.061 and improves entailment, exactly as in-domain. Source fidelity is preserved (BERTScore 0.22–0.28, matching the in-domain 0.25–0.28) and induced clickbait stays in the same low regime (below 0.10 throughout). Perplexity is modestly higher than in-domain (266–368 vs 175–275), reflecting the greater lexical variety of this out-of-domain set, but the ordering across the four cells is unchanged. The dual-control mechanism is therefore not specific to the Reuters training domain.</w:t>
+        <w:t xml:space="preserve">To test whether the framework generalizes beyond Reuters newswire, we apply the same guides, at the same operating point (α = 4, β = 2), to 150 human-authored, non-Reuters neutral headlines: the non-clickbait half of the Chakraborty corpus, spanning disasters, culture, and financial markets rather than political newswire. The two guides reproduce their designed, opposite effects on this different register (Table 11). The engagement guide raises tactic realization (guide-based, 0.10 → 0.16) and, with it, induced clickbait (0.05 → 0.10), while the clickbait brake lowers the independent clickbait score back from 0.097 to 0.061 and improves entailment, exactly as in-domain.</w:t>
+      </w:r>
+      <w:r>
+        <w:rPr>
+          <w:highlight w:val="yellow"/>
+        </w:rPr>
+        <w:t xml:space="preserve"> </w:t>
+      </w:r>
+      <w:r>
+        <w:rPr>
+          <w:highlight w:val="red"/>
+        </w:rPr>
+        <w:t xml:space="preserve">One caveat is specific to this register: the external clickbait detector was trained on the Chakraborty corpus from which these source headlines are drawn, so its absolute values here are in-domain for the detector. The generalization claim therefore rests on the within-register directional effects (the engagement guide raises tactic realization; the brake lowers induced clickbait), which do not depend on the detector's absolute calibration, and the detector remains independent of the generation guides.</w:t>
+      </w:r>
+      <w:r>
+        <w:rPr>
+          <w:highlight w:val="yellow"/>
+        </w:rPr>
+        <w:t xml:space="preserve"> </w:t>
+      </w:r>
+      <w:r>
+        <w:rPr>
+          <w:highlight w:val="yellow"/>
+        </w:rPr>
+        <w:t xml:space="preserve">Source fidelity is preserved (BERTScore 0.22–0.28, matching the in-domain 0.25–0.28) and induced clickbait stays in the same low regime (below 0.10 throughout). Perplexity is modestly higher than in-domain (266–368 vs 175–275), reflecting the greater lexical variety of this out-of-domain set, but the ordering across the four cells is unchanged. The dual-control mechanism is therefore not specific to the Reuters training domain.</w:t>
       </w:r>
     </w:p>
     <w:p>
@@ -10679,7 +10937,16 @@
         <w:rPr>
           <w:highlight w:val="yellow"/>
         </w:rPr>
-        <w:t xml:space="preserve">We test model-agnosticism by swapping the base generator to Qwen2.5-7B-Instruct[26], a different model family, keeping the guides and the operating point (α = 4, β = 2) unchanged and applying the language-consistency constraint of Section 3.6. Llama-3-8B remains the primary generator for comparability with the decoding-time baselines; this experiment shows that the same guides and operating point transfer to a different model family, and Qwen's higher BERTScore reflects its more conservative, closer-to-source rewriting. The dual control transfers cleanly to Qwen (Table 12): the engagement guide raises tactic realization (0.31 → 0.36); source fidelity and fluency are maintained and in fact exceed the Llama-3 configuration (BERTScore 0.43–0.47 versus 0.25–0.28; perplexity 133–163); induced clickbait stays low across all cells (below 0.06); and the clickbait brake holds the brake-only cell at or below the no-guidance baseline (0.033 versus 0.034). The two guides retain their designed, opposite effects on a second base-model family at the same operating point.</w:t>
+        <w:t xml:space="preserve">We test model-agnosticism by swapping the base generator to Qwen2.5-7B-Instruct[26], a different model family, keeping the guides and the operating point (α = 4, β = 2) unchanged and applying the language-consistency constraint of Section 3.6. Llama-3-8B remains the primary generator for comparability with the decoding-time baselines; this experiment shows that the same guides and operating point transfer to a different model family, and Qwen's higher BERTScore reflects its more conservative, closer-to-source rewriting.</w:t>
+      </w:r>
+      <w:r>
+        <w:t xml:space="preserve"> </w:t>
+      </w:r>
+      <w:r>
+        <w:rPr>
+          <w:highlight w:val="red"/>
+        </w:rPr>
+        <w:t xml:space="preserve">This is a model-family transfer check, not a second demonstration of the decoupling. On Qwen the same guides and operating point run with source fidelity and fluency preserved, in fact higher than the Llama-3 configuration (BERTScore 0.43–0.47 versus 0.25–0.28; perplexity 133–163). Scored by the independent LLM judge (Table 12, replacing the guide-based circular score), tactic realization is flat across all four cells (≈ 0.50): the sharp brake-induced tactic drop seen under the guide's own circular score was an artifact of that measure, not a real loss. Qwen's rewrites already sit near the detector floor in every cell (independent clickbait below 0.06), so the brake has essentially no clickbait headroom on this base model; the decoupling itself is therefore established on the Llama results (Table 7, Figure 7) rather than re-demonstrated here.</w:t>
       </w:r>
     </w:p>
     <w:p>
@@ -10695,7 +10962,7 @@
         <w:rPr>
           <w:b/>
           <w:i/>
-          <w:highlight w:val="yellow"/>
+          <w:highlight w:val="red"/>
         </w:rPr>
         <w:t>Table 12.</w:t>
       </w:r>
@@ -10703,7 +10970,7 @@
         <w:rPr>
           <w:b w:val="0"/>
           <w:i/>
-          <w:highlight w:val="yellow"/>
+          <w:highlight w:val="red"/>
         </w:rPr>
         <w:t xml:space="preserve"> </w:t>
       </w:r>
@@ -10711,9 +10978,9 @@
         <w:rPr>
           <w:b w:val="0"/>
           <w:i/>
-          <w:highlight w:val="yellow"/>
-        </w:rPr>
-        <w:t>Transfer to a second base generator (Qwen2.5-7B-Instruct), same guides and operating point, with the language-consistency constraint for multilingual generators. Independent metrics; the tactic column is the guide-based (circular) score. Qwen rewrites sit near the detector floor in every cell (independent clickbait 0.03–0.06), so the brake has little headroom on the clickbait axis here (engage-only 0.058 vs dual 0.057); its effect instead appears on the guide tactic score, which the brake lowers from 0.36 to 0.20. Parentheses give 95% bootstrap CIs (n = 450 per cell (786 for the α = 4, β = 0 cell)).</w:t>
+          <w:highlight w:val="red"/>
+        </w:rPr>
+        <w:t>Transfer to a second base generator (Qwen2.5-7B-Instruct), same guides and operating point, with the language-consistency constraint for multilingual generators. All metrics are independent; the tactic column is the independent LLM judge score (0–1), replacing the earlier guide-based (circular) score. On this base model the independent tactic score is flat across cells (≈ 0.50) — the sharp brake-induced drop that appeared under the guide's own circular score was an artifact of that measure — and the transfer result is that source fidelity and fluency are preserved while induced clickbait stays near the detector floor throughout (0.03–0.06). Parentheses give 95% bootstrap CIs (n = 450 per cell).</w:t>
       </w:r>
     </w:p>
     <w:tbl>
@@ -10722,7 +10989,7 @@
         <w:tblW w:type="pct" w:w="5000"/>
         <w:jc w:val="center"/>
         <w:tblLook w:firstRow="1" w:lastRow="0" w:firstColumn="0" w:lastColumn="0" w:noHBand="0" w:noVBand="0" w:val="0020"/>
-        <w:tblCaption w:val="Table 12. Transfer to a second base generator (Qwen2.5-7B-Instruct), same guides and operating point, with the language-consistency constraint for multilingual generators. Independent metrics; the tactic column is the guide-based (circular) score. Qwen rewrites sit near the detector floor in every cell (independent clickbait 0.03–0.06), so the brake has little headroom on the clickbait axis here (engage-only 0.058 vs dual 0.057); its effect instead appears on the guide tactic score, which the brake lowers from 0.36 to 0.20. Parentheses give 95% bootstrap CIs (n = 450 per cell (786 for the α = 4, β = 0 cell))."/>
+        <w:tblCaption w:val="Table 12. Transfer to a second base generator (Qwen2.5-7B-Instruct), same guides and operating point, with the language-consistency constraint for multilingual generators. All metrics are independent; the tactic column is the independent LLM judge score (0–1), replacing the earlier guide-based (circular) score. On this base model the independent tactic score is flat across cells (≈ 0.50) — the sharp brake-induced drop that appeared under the guide's own circular score was an artifact of that measure — and the transfer result is that source fidelity and fluency are preserved while induced clickbait stays near the detector floor throughout (0.03–0.06). Parentheses give 95% bootstrap CIs (n = 450 per cell)."/>
         <w:tblLayout w:type="autofit"/>
         <w:tblBorders>
           <w:top w:val="single" w:sz="8" w:space="0" w:color="000000"/>
@@ -10789,7 +11056,7 @@
                 <w:sz w:val="19"/>
                 <w:highlight w:val="yellow"/>
               </w:rPr>
-              <w:t xml:space="preserve">Tactic (guide*)</w:t>
+              <w:t xml:space="preserve">Tactic (judge)</w:t>
             </w:r>
           </w:p>
         </w:tc>
@@ -10931,9 +11198,9 @@
               <w:rPr>
                 <w:rFonts w:ascii="Times New Roman" w:hAnsi="Times New Roman"/>
                 <w:sz w:val="19"/>
-                <w:highlight w:val="yellow"/>
-              </w:rPr>
-              <w:t xml:space="preserve">0.31 (0.28–0.33)</w:t>
+                <w:highlight w:val="red"/>
+              </w:rPr>
+              <w:t xml:space="preserve">0.50 (0.47–0.54)</w:t>
             </w:r>
           </w:p>
         </w:tc>
@@ -10979,7 +11246,7 @@
                 <w:sz w:val="19"/>
                 <w:highlight w:val="yellow"/>
               </w:rPr>
-              <w:t xml:space="preserve">0.469 (0.46–0.48)</w:t>
+              <w:t xml:space="preserve">0.469 (0.45–0.48)</w:t>
             </w:r>
           </w:p>
         </w:tc>
@@ -11025,7 +11292,7 @@
                 <w:sz w:val="19"/>
                 <w:highlight w:val="yellow"/>
               </w:rPr>
-              <w:t xml:space="preserve">133 (116–148)</w:t>
+              <w:t xml:space="preserve">133 (116–149)</w:t>
             </w:r>
           </w:p>
         </w:tc>
@@ -11071,101 +11338,101 @@
               <w:rPr>
                 <w:rFonts w:ascii="Times New Roman" w:hAnsi="Times New Roman"/>
                 <w:sz w:val="19"/>
-                <w:highlight w:val="yellow"/>
-              </w:rPr>
-              <w:t xml:space="preserve">0.36 (0.34–0.38)</w:t>
-            </w:r>
-          </w:p>
-        </w:tc>
-        <w:tc>
-          <w:tcPr>
-            <w:vAlign w:val="center"/>
-          </w:tcPr>
-          <w:p>
-            <w:pPr>
-              <w:pStyle w:val="Compact"/>
-              <w:spacing w:before="0" w:after="20" w:line="240" w:lineRule="auto"/>
-              <w:jc w:val="center"/>
-              <w:keepNext w:val="0"/>
-              <w:keepLines/>
-              <w:widowControl w:val="1"/>
-            </w:pPr>
-            <w:r>
-              <w:rPr>
-                <w:rFonts w:ascii="Times New Roman" w:hAnsi="Times New Roman"/>
-                <w:sz w:val="19"/>
-                <w:highlight w:val="yellow"/>
-              </w:rPr>
-              <w:t xml:space="preserve">0.058 (0.05–0.07)</w:t>
-            </w:r>
-          </w:p>
-        </w:tc>
-        <w:tc>
-          <w:tcPr>
-            <w:vAlign w:val="center"/>
-          </w:tcPr>
-          <w:p>
-            <w:pPr>
-              <w:pStyle w:val="Compact"/>
-              <w:spacing w:before="0" w:after="20" w:line="240" w:lineRule="auto"/>
-              <w:jc w:val="center"/>
-              <w:keepNext w:val="0"/>
-              <w:keepLines/>
-              <w:widowControl w:val="1"/>
-            </w:pPr>
-            <w:r>
-              <w:rPr>
-                <w:rFonts w:ascii="Times New Roman" w:hAnsi="Times New Roman"/>
-                <w:sz w:val="19"/>
-                <w:highlight w:val="yellow"/>
-              </w:rPr>
-              <w:t xml:space="preserve">0.447 (0.44–0.46)</w:t>
-            </w:r>
-          </w:p>
-        </w:tc>
-        <w:tc>
-          <w:tcPr>
-            <w:vAlign w:val="center"/>
-          </w:tcPr>
-          <w:p>
-            <w:pPr>
-              <w:pStyle w:val="Compact"/>
-              <w:spacing w:before="0" w:after="20" w:line="240" w:lineRule="auto"/>
-              <w:jc w:val="center"/>
-              <w:keepNext w:val="0"/>
-              <w:keepLines/>
-              <w:widowControl w:val="1"/>
-            </w:pPr>
-            <w:r>
-              <w:rPr>
-                <w:rFonts w:ascii="Times New Roman" w:hAnsi="Times New Roman"/>
-                <w:sz w:val="19"/>
-                <w:highlight w:val="yellow"/>
-              </w:rPr>
-              <w:t xml:space="preserve">0.237 (0.21–0.26)</w:t>
-            </w:r>
-          </w:p>
-        </w:tc>
-        <w:tc>
-          <w:tcPr>
-            <w:vAlign w:val="center"/>
-          </w:tcPr>
-          <w:p>
-            <w:pPr>
-              <w:pStyle w:val="Compact"/>
-              <w:spacing w:before="0" w:after="20" w:line="240" w:lineRule="auto"/>
-              <w:jc w:val="center"/>
-              <w:keepNext w:val="0"/>
-              <w:keepLines/>
-              <w:widowControl w:val="1"/>
-            </w:pPr>
-            <w:r>
-              <w:rPr>
-                <w:rFonts w:ascii="Times New Roman" w:hAnsi="Times New Roman"/>
-                <w:sz w:val="19"/>
-                <w:highlight w:val="yellow"/>
-              </w:rPr>
-              <w:t xml:space="preserve">135 (121–145)</w:t>
+                <w:highlight w:val="red"/>
+              </w:rPr>
+              <w:t xml:space="preserve">0.50 (0.47–0.54)</w:t>
+            </w:r>
+          </w:p>
+        </w:tc>
+        <w:tc>
+          <w:tcPr>
+            <w:vAlign w:val="center"/>
+          </w:tcPr>
+          <w:p>
+            <w:pPr>
+              <w:pStyle w:val="Compact"/>
+              <w:spacing w:before="0" w:after="20" w:line="240" w:lineRule="auto"/>
+              <w:jc w:val="center"/>
+              <w:keepNext w:val="0"/>
+              <w:keepLines/>
+              <w:widowControl w:val="1"/>
+            </w:pPr>
+            <w:r>
+              <w:rPr>
+                <w:rFonts w:ascii="Times New Roman" w:hAnsi="Times New Roman"/>
+                <w:sz w:val="19"/>
+                <w:highlight w:val="yellow"/>
+              </w:rPr>
+              <w:t xml:space="preserve">0.059 (0.04–0.08)</w:t>
+            </w:r>
+          </w:p>
+        </w:tc>
+        <w:tc>
+          <w:tcPr>
+            <w:vAlign w:val="center"/>
+          </w:tcPr>
+          <w:p>
+            <w:pPr>
+              <w:pStyle w:val="Compact"/>
+              <w:spacing w:before="0" w:after="20" w:line="240" w:lineRule="auto"/>
+              <w:jc w:val="center"/>
+              <w:keepNext w:val="0"/>
+              <w:keepLines/>
+              <w:widowControl w:val="1"/>
+            </w:pPr>
+            <w:r>
+              <w:rPr>
+                <w:rFonts w:ascii="Times New Roman" w:hAnsi="Times New Roman"/>
+                <w:sz w:val="19"/>
+                <w:highlight w:val="yellow"/>
+              </w:rPr>
+              <w:t xml:space="preserve">0.446 (0.43–0.46)</w:t>
+            </w:r>
+          </w:p>
+        </w:tc>
+        <w:tc>
+          <w:tcPr>
+            <w:vAlign w:val="center"/>
+          </w:tcPr>
+          <w:p>
+            <w:pPr>
+              <w:pStyle w:val="Compact"/>
+              <w:spacing w:before="0" w:after="20" w:line="240" w:lineRule="auto"/>
+              <w:jc w:val="center"/>
+              <w:keepNext w:val="0"/>
+              <w:keepLines/>
+              <w:widowControl w:val="1"/>
+            </w:pPr>
+            <w:r>
+              <w:rPr>
+                <w:rFonts w:ascii="Times New Roman" w:hAnsi="Times New Roman"/>
+                <w:sz w:val="19"/>
+                <w:highlight w:val="yellow"/>
+              </w:rPr>
+              <w:t xml:space="preserve">0.240 (0.21–0.27)</w:t>
+            </w:r>
+          </w:p>
+        </w:tc>
+        <w:tc>
+          <w:tcPr>
+            <w:vAlign w:val="center"/>
+          </w:tcPr>
+          <w:p>
+            <w:pPr>
+              <w:pStyle w:val="Compact"/>
+              <w:spacing w:before="0" w:after="20" w:line="240" w:lineRule="auto"/>
+              <w:jc w:val="center"/>
+              <w:keepNext w:val="0"/>
+              <w:keepLines/>
+              <w:widowControl w:val="1"/>
+            </w:pPr>
+            <w:r>
+              <w:rPr>
+                <w:rFonts w:ascii="Times New Roman" w:hAnsi="Times New Roman"/>
+                <w:sz w:val="19"/>
+                <w:highlight w:val="yellow"/>
+              </w:rPr>
+              <w:t xml:space="preserve">134 (117–148)</w:t>
             </w:r>
           </w:p>
         </w:tc>
@@ -11211,9 +11478,9 @@
               <w:rPr>
                 <w:rFonts w:ascii="Times New Roman" w:hAnsi="Times New Roman"/>
                 <w:sz w:val="19"/>
-                <w:highlight w:val="yellow"/>
-              </w:rPr>
-              <w:t xml:space="preserve">0.13 (0.11–0.15)</w:t>
+                <w:highlight w:val="red"/>
+              </w:rPr>
+              <w:t xml:space="preserve">0.49 (0.46–0.53)</w:t>
             </w:r>
           </w:p>
         </w:tc>
@@ -11305,7 +11572,7 @@
                 <w:sz w:val="19"/>
                 <w:highlight w:val="yellow"/>
               </w:rPr>
-              <w:t xml:space="preserve">162 (144–178)</w:t>
+              <w:t xml:space="preserve">162 (143–179)</w:t>
             </w:r>
           </w:p>
         </w:tc>
@@ -11351,9 +11618,9 @@
               <w:rPr>
                 <w:rFonts w:ascii="Times New Roman" w:hAnsi="Times New Roman"/>
                 <w:sz w:val="19"/>
-                <w:highlight w:val="yellow"/>
-              </w:rPr>
-              <w:t xml:space="preserve">0.20 (0.18–0.23)</w:t>
+                <w:highlight w:val="red"/>
+              </w:rPr>
+              <w:t xml:space="preserve">0.50 (0.47–0.54)</w:t>
             </w:r>
           </w:p>
         </w:tc>
@@ -11446,6 +11713,1641 @@
                 <w:highlight w:val="yellow"/>
               </w:rPr>
               <w:t xml:space="preserve">163 (141–177)</w:t>
+            </w:r>
+          </w:p>
+        </w:tc>
+      </w:tr>
+    </w:tbl>
+    <w:p>
+      <w:pPr>
+        <w:pStyle w:val="TableCaption"/>
+        <w:spacing w:before="280" w:after="60" w:line="240" w:lineRule="auto"/>
+        <w:jc w:val="center"/>
+        <w:keepNext/>
+        <w:keepLines/>
+        <w:widowControl w:val="1"/>
+      </w:pPr>
+      <w:r>
+        <w:rPr>
+          <w:b/>
+          <w:i/>
+          <w:highlight w:val="red"/>
+        </w:rPr>
+        <w:t>Table 13.</w:t>
+      </w:r>
+      <w:r>
+        <w:rPr>
+          <w:b w:val="0"/>
+          <w:i/>
+          <w:highlight w:val="red"/>
+        </w:rPr>
+        <w:t xml:space="preserve"> </w:t>
+      </w:r>
+      <w:r>
+        <w:rPr>
+          <w:b w:val="0"/>
+          <w:i/>
+          <w:highlight w:val="red"/>
+        </w:rPr>
+        <w:t>Statistical summary for the confirmatory comparisons. Each family is Holm-corrected within itself; effect size is the rank-biserial correlation r (for the ablation family, r = 2·win − 1 from the blind paired-preference test); the last column reports the mean paired difference with a bootstrap 95% CI (2,000 resamples). Every reported effect survives multiplicity correction, and the CI on each mean difference excludes zero.</w:t>
+      </w:r>
+    </w:p>
+    <w:tbl>
+      <w:tblPr>
+        <w:tblStyle w:val="Table"/>
+        <w:tblW w:type="pct" w:w="5000"/>
+        <w:jc w:val="center"/>
+        <w:tblLook w:firstRow="1" w:lastRow="0" w:firstColumn="0" w:lastColumn="0" w:noHBand="0" w:noVBand="0" w:val="0020"/>
+        <w:tblCaption w:val="Table 13. Statistical summary for the confirmatory comparisons. Each family is Holm-corrected within itself; effect size is the rank-biserial correlation r (for the ablation family, r = 2·win − 1 from the blind paired-preference test); the last column reports the mean paired difference with a bootstrap 95% CI (2,000 resamples). Every reported effect survives multiplicity correction, and the CI on each mean difference excludes zero."/>
+        <w:tblLayout w:type="autofit"/>
+        <w:tblBorders>
+          <w:top w:val="single" w:sz="8" w:space="0" w:color="000000"/>
+          <w:left w:val="single" w:sz="8" w:space="0" w:color="000000"/>
+          <w:bottom w:val="single" w:sz="8" w:space="0" w:color="000000"/>
+          <w:right w:val="single" w:sz="8" w:space="0" w:color="000000"/>
+          <w:insideH w:val="single" w:sz="8" w:space="0" w:color="000000"/>
+          <w:insideV w:val="single" w:sz="8" w:space="0" w:color="000000"/>
+        </w:tblBorders>
+      </w:tblPr>
+      <w:tblGrid>
+        <w:gridCol w:w="1320"/>
+        <w:gridCol w:w="1320"/>
+        <w:gridCol w:w="1320"/>
+        <w:gridCol w:w="1320"/>
+        <w:gridCol w:w="1320"/>
+        <w:gridCol w:w="1320"/>
+      </w:tblGrid>
+      <w:tr>
+        <w:trPr>
+          <w:tblHeader w:val="on"/>
+        </w:trPr>
+        <w:tc>
+          <w:tcPr>
+            <w:vAlign w:val="center"/>
+          </w:tcPr>
+          <w:p>
+            <w:pPr>
+              <w:pStyle w:val="Compact"/>
+              <w:spacing w:before="0" w:after="20" w:line="240" w:lineRule="auto"/>
+              <w:jc w:val="center"/>
+              <w:keepNext w:val="0"/>
+              <w:keepLines/>
+              <w:widowControl w:val="1"/>
+            </w:pPr>
+            <w:r>
+              <w:rPr>
+                <w:rFonts w:ascii="Times New Roman" w:hAnsi="Times New Roman"/>
+                <w:b/>
+                <w:sz w:val="19"/>
+                <w:highlight w:val="red"/>
+              </w:rPr>
+              <w:t xml:space="preserve">Comparison</w:t>
+            </w:r>
+          </w:p>
+        </w:tc>
+        <w:tc>
+          <w:tcPr>
+            <w:vAlign w:val="center"/>
+          </w:tcPr>
+          <w:p>
+            <w:pPr>
+              <w:pStyle w:val="Compact"/>
+              <w:spacing w:before="0" w:after="20" w:line="240" w:lineRule="auto"/>
+              <w:jc w:val="center"/>
+              <w:keepNext w:val="0"/>
+              <w:keepLines/>
+              <w:widowControl w:val="1"/>
+            </w:pPr>
+            <w:r>
+              <w:rPr>
+                <w:rFonts w:ascii="Times New Roman" w:hAnsi="Times New Roman"/>
+                <w:b/>
+                <w:sz w:val="19"/>
+                <w:highlight w:val="red"/>
+              </w:rPr>
+              <w:t xml:space="preserve">n</w:t>
+            </w:r>
+          </w:p>
+        </w:tc>
+        <w:tc>
+          <w:tcPr>
+            <w:vAlign w:val="center"/>
+          </w:tcPr>
+          <w:p>
+            <w:pPr>
+              <w:pStyle w:val="Compact"/>
+              <w:spacing w:before="0" w:after="20" w:line="240" w:lineRule="auto"/>
+              <w:jc w:val="center"/>
+              <w:keepNext w:val="0"/>
+              <w:keepLines/>
+              <w:widowControl w:val="1"/>
+            </w:pPr>
+            <w:r>
+              <w:rPr>
+                <w:rFonts w:ascii="Times New Roman" w:hAnsi="Times New Roman"/>
+                <w:b/>
+                <w:sz w:val="19"/>
+                <w:highlight w:val="red"/>
+              </w:rPr>
+              <w:t xml:space="preserve">raw p</w:t>
+            </w:r>
+          </w:p>
+        </w:tc>
+        <w:tc>
+          <w:tcPr>
+            <w:vAlign w:val="center"/>
+          </w:tcPr>
+          <w:p>
+            <w:pPr>
+              <w:pStyle w:val="Compact"/>
+              <w:spacing w:before="0" w:after="20" w:line="240" w:lineRule="auto"/>
+              <w:jc w:val="center"/>
+              <w:keepNext w:val="0"/>
+              <w:keepLines/>
+              <w:widowControl w:val="1"/>
+            </w:pPr>
+            <w:r>
+              <w:rPr>
+                <w:rFonts w:ascii="Times New Roman" w:hAnsi="Times New Roman"/>
+                <w:b/>
+                <w:sz w:val="19"/>
+                <w:highlight w:val="red"/>
+              </w:rPr>
+              <w:t xml:space="preserve">Holm-adj. p</w:t>
+            </w:r>
+          </w:p>
+        </w:tc>
+        <w:tc>
+          <w:tcPr>
+            <w:vAlign w:val="center"/>
+          </w:tcPr>
+          <w:p>
+            <w:pPr>
+              <w:pStyle w:val="Compact"/>
+              <w:spacing w:before="0" w:after="20" w:line="240" w:lineRule="auto"/>
+              <w:jc w:val="center"/>
+              <w:keepNext w:val="0"/>
+              <w:keepLines/>
+              <w:widowControl w:val="1"/>
+            </w:pPr>
+            <w:r>
+              <w:rPr>
+                <w:rFonts w:ascii="Times New Roman" w:hAnsi="Times New Roman"/>
+                <w:b/>
+                <w:sz w:val="19"/>
+                <w:highlight w:val="red"/>
+              </w:rPr>
+              <w:t xml:space="preserve">effect r</w:t>
+            </w:r>
+          </w:p>
+        </w:tc>
+        <w:tc>
+          <w:tcPr>
+            <w:vAlign w:val="center"/>
+          </w:tcPr>
+          <w:p>
+            <w:pPr>
+              <w:pStyle w:val="Compact"/>
+              <w:spacing w:before="0" w:after="20" w:line="240" w:lineRule="auto"/>
+              <w:jc w:val="center"/>
+              <w:keepNext w:val="0"/>
+              <w:keepLines/>
+              <w:widowControl w:val="1"/>
+            </w:pPr>
+            <w:r>
+              <w:rPr>
+                <w:rFonts w:ascii="Times New Roman" w:hAnsi="Times New Roman"/>
+                <w:b/>
+                <w:sz w:val="19"/>
+                <w:highlight w:val="red"/>
+              </w:rPr>
+              <w:t xml:space="preserve">mean diff [95% CI]</w:t>
+            </w:r>
+          </w:p>
+        </w:tc>
+      </w:tr>
+      <w:tr>
+        <w:tc>
+          <w:tcPr>
+            <w:vAlign w:val="center"/>
+          </w:tcPr>
+          <w:p>
+            <w:pPr>
+              <w:pStyle w:val="Compact"/>
+              <w:spacing w:before="0" w:after="20" w:line="240" w:lineRule="auto"/>
+              <w:jc w:val="center"/>
+              <w:keepNext w:val="0"/>
+              <w:keepLines/>
+              <w:widowControl w:val="1"/>
+            </w:pPr>
+            <w:r>
+              <w:rPr>
+                <w:rFonts w:ascii="Times New Roman" w:hAnsi="Times New Roman"/>
+                <w:i/>
+                <w:iCs/>
+                <w:sz w:val="19"/>
+                <w:highlight w:val="red"/>
+              </w:rPr>
+              <w:t xml:space="preserve">Ablation: blind paired-preference vs (0,0), tactic (judge)</w:t>
+            </w:r>
+          </w:p>
+        </w:tc>
+        <w:tc>
+          <w:tcPr>
+            <w:vAlign w:val="center"/>
+          </w:tcPr>
+          <w:p>
+            <w:pPr>
+              <w:pStyle w:val="Compact"/>
+              <w:spacing w:before="0" w:after="20" w:line="240" w:lineRule="auto"/>
+              <w:jc w:val="center"/>
+              <w:keepNext w:val="0"/>
+              <w:keepLines/>
+              <w:widowControl w:val="1"/>
+            </w:pPr>
+          </w:p>
+        </w:tc>
+        <w:tc>
+          <w:tcPr>
+            <w:vAlign w:val="center"/>
+          </w:tcPr>
+          <w:p>
+            <w:pPr>
+              <w:pStyle w:val="Compact"/>
+              <w:spacing w:before="0" w:after="20" w:line="240" w:lineRule="auto"/>
+              <w:jc w:val="center"/>
+              <w:keepNext w:val="0"/>
+              <w:keepLines/>
+              <w:widowControl w:val="1"/>
+            </w:pPr>
+          </w:p>
+        </w:tc>
+        <w:tc>
+          <w:tcPr>
+            <w:vAlign w:val="center"/>
+          </w:tcPr>
+          <w:p>
+            <w:pPr>
+              <w:pStyle w:val="Compact"/>
+              <w:spacing w:before="0" w:after="20" w:line="240" w:lineRule="auto"/>
+              <w:jc w:val="center"/>
+              <w:keepNext w:val="0"/>
+              <w:keepLines/>
+              <w:widowControl w:val="1"/>
+            </w:pPr>
+          </w:p>
+        </w:tc>
+        <w:tc>
+          <w:tcPr>
+            <w:vAlign w:val="center"/>
+          </w:tcPr>
+          <w:p>
+            <w:pPr>
+              <w:pStyle w:val="Compact"/>
+              <w:spacing w:before="0" w:after="20" w:line="240" w:lineRule="auto"/>
+              <w:jc w:val="center"/>
+              <w:keepNext w:val="0"/>
+              <w:keepLines/>
+              <w:widowControl w:val="1"/>
+            </w:pPr>
+          </w:p>
+        </w:tc>
+        <w:tc>
+          <w:tcPr>
+            <w:vAlign w:val="center"/>
+          </w:tcPr>
+          <w:p>
+            <w:pPr>
+              <w:pStyle w:val="Compact"/>
+              <w:spacing w:before="0" w:after="20" w:line="240" w:lineRule="auto"/>
+              <w:jc w:val="center"/>
+              <w:keepNext w:val="0"/>
+              <w:keepLines/>
+              <w:widowControl w:val="1"/>
+            </w:pPr>
+          </w:p>
+        </w:tc>
+      </w:tr>
+      <w:tr>
+        <w:tc>
+          <w:tcPr>
+            <w:vAlign w:val="center"/>
+          </w:tcPr>
+          <w:p>
+            <w:pPr>
+              <w:pStyle w:val="Compact"/>
+              <w:spacing w:before="0" w:after="20" w:line="240" w:lineRule="auto"/>
+              <w:jc w:val="center"/>
+              <w:keepNext w:val="0"/>
+              <w:keepLines/>
+              <w:widowControl w:val="1"/>
+            </w:pPr>
+            <w:r>
+              <w:rPr>
+                <w:rFonts w:ascii="Times New Roman" w:hAnsi="Times New Roman"/>
+                <w:sz w:val="19"/>
+                <w:highlight w:val="red"/>
+              </w:rPr>
+              <w:t xml:space="preserve">  (4,0) vs (0,0)</w:t>
+            </w:r>
+          </w:p>
+        </w:tc>
+        <w:tc>
+          <w:tcPr>
+            <w:vAlign w:val="center"/>
+          </w:tcPr>
+          <w:p>
+            <w:pPr>
+              <w:pStyle w:val="Compact"/>
+              <w:spacing w:before="0" w:after="20" w:line="240" w:lineRule="auto"/>
+              <w:jc w:val="center"/>
+              <w:keepNext w:val="0"/>
+              <w:keepLines/>
+              <w:widowControl w:val="1"/>
+            </w:pPr>
+            <w:r>
+              <w:rPr>
+                <w:rFonts w:ascii="Times New Roman" w:hAnsi="Times New Roman"/>
+                <w:sz w:val="19"/>
+                <w:highlight w:val="red"/>
+              </w:rPr>
+              <w:t xml:space="preserve">900</w:t>
+            </w:r>
+          </w:p>
+        </w:tc>
+        <w:tc>
+          <w:tcPr>
+            <w:vAlign w:val="center"/>
+          </w:tcPr>
+          <w:p>
+            <w:pPr>
+              <w:pStyle w:val="Compact"/>
+              <w:spacing w:before="0" w:after="20" w:line="240" w:lineRule="auto"/>
+              <w:jc w:val="center"/>
+              <w:keepNext w:val="0"/>
+              <w:keepLines/>
+              <w:widowControl w:val="1"/>
+            </w:pPr>
+            <w:r>
+              <w:rPr>
+                <w:rFonts w:ascii="Times New Roman" w:hAnsi="Times New Roman"/>
+                <w:sz w:val="19"/>
+                <w:highlight w:val="red"/>
+              </w:rPr>
+              <w:t xml:space="preserve">4.3×10⁻¹¹</w:t>
+            </w:r>
+          </w:p>
+        </w:tc>
+        <w:tc>
+          <w:tcPr>
+            <w:vAlign w:val="center"/>
+          </w:tcPr>
+          <w:p>
+            <w:pPr>
+              <w:pStyle w:val="Compact"/>
+              <w:spacing w:before="0" w:after="20" w:line="240" w:lineRule="auto"/>
+              <w:jc w:val="center"/>
+              <w:keepNext w:val="0"/>
+              <w:keepLines/>
+              <w:widowControl w:val="1"/>
+            </w:pPr>
+            <w:r>
+              <w:rPr>
+                <w:rFonts w:ascii="Times New Roman" w:hAnsi="Times New Roman"/>
+                <w:sz w:val="19"/>
+                <w:highlight w:val="red"/>
+              </w:rPr>
+              <w:t xml:space="preserve">1.3×10⁻¹⁰</w:t>
+            </w:r>
+          </w:p>
+        </w:tc>
+        <w:tc>
+          <w:tcPr>
+            <w:vAlign w:val="center"/>
+          </w:tcPr>
+          <w:p>
+            <w:pPr>
+              <w:pStyle w:val="Compact"/>
+              <w:spacing w:before="0" w:after="20" w:line="240" w:lineRule="auto"/>
+              <w:jc w:val="center"/>
+              <w:keepNext w:val="0"/>
+              <w:keepLines/>
+              <w:widowControl w:val="1"/>
+            </w:pPr>
+            <w:r>
+              <w:rPr>
+                <w:rFonts w:ascii="Times New Roman" w:hAnsi="Times New Roman"/>
+                <w:sz w:val="19"/>
+                <w:highlight w:val="red"/>
+              </w:rPr>
+              <w:t xml:space="preserve">+0.22</w:t>
+            </w:r>
+          </w:p>
+        </w:tc>
+        <w:tc>
+          <w:tcPr>
+            <w:vAlign w:val="center"/>
+          </w:tcPr>
+          <w:p>
+            <w:pPr>
+              <w:pStyle w:val="Compact"/>
+              <w:spacing w:before="0" w:after="20" w:line="240" w:lineRule="auto"/>
+              <w:jc w:val="center"/>
+              <w:keepNext w:val="0"/>
+              <w:keepLines/>
+              <w:widowControl w:val="1"/>
+            </w:pPr>
+            <w:r>
+              <w:rPr>
+                <w:rFonts w:ascii="Times New Roman" w:hAnsi="Times New Roman"/>
+                <w:sz w:val="19"/>
+                <w:highlight w:val="red"/>
+              </w:rPr>
+              <w:t xml:space="preserve">+0.03 [+0.01, +0.06]</w:t>
+            </w:r>
+          </w:p>
+        </w:tc>
+      </w:tr>
+      <w:tr>
+        <w:tc>
+          <w:tcPr>
+            <w:vAlign w:val="center"/>
+          </w:tcPr>
+          <w:p>
+            <w:pPr>
+              <w:pStyle w:val="Compact"/>
+              <w:spacing w:before="0" w:after="20" w:line="240" w:lineRule="auto"/>
+              <w:jc w:val="center"/>
+              <w:keepNext w:val="0"/>
+              <w:keepLines/>
+              <w:widowControl w:val="1"/>
+            </w:pPr>
+            <w:r>
+              <w:rPr>
+                <w:rFonts w:ascii="Times New Roman" w:hAnsi="Times New Roman"/>
+                <w:sz w:val="19"/>
+                <w:highlight w:val="red"/>
+              </w:rPr>
+              <w:t xml:space="preserve">  (0,2) vs (0,0)</w:t>
+            </w:r>
+          </w:p>
+        </w:tc>
+        <w:tc>
+          <w:tcPr>
+            <w:vAlign w:val="center"/>
+          </w:tcPr>
+          <w:p>
+            <w:pPr>
+              <w:pStyle w:val="Compact"/>
+              <w:spacing w:before="0" w:after="20" w:line="240" w:lineRule="auto"/>
+              <w:jc w:val="center"/>
+              <w:keepNext w:val="0"/>
+              <w:keepLines/>
+              <w:widowControl w:val="1"/>
+            </w:pPr>
+            <w:r>
+              <w:rPr>
+                <w:rFonts w:ascii="Times New Roman" w:hAnsi="Times New Roman"/>
+                <w:sz w:val="19"/>
+                <w:highlight w:val="red"/>
+              </w:rPr>
+              <w:t xml:space="preserve">900</w:t>
+            </w:r>
+          </w:p>
+        </w:tc>
+        <w:tc>
+          <w:tcPr>
+            <w:vAlign w:val="center"/>
+          </w:tcPr>
+          <w:p>
+            <w:pPr>
+              <w:pStyle w:val="Compact"/>
+              <w:spacing w:before="0" w:after="20" w:line="240" w:lineRule="auto"/>
+              <w:jc w:val="center"/>
+              <w:keepNext w:val="0"/>
+              <w:keepLines/>
+              <w:widowControl w:val="1"/>
+            </w:pPr>
+            <w:r>
+              <w:rPr>
+                <w:rFonts w:ascii="Times New Roman" w:hAnsi="Times New Roman"/>
+                <w:sz w:val="19"/>
+                <w:highlight w:val="red"/>
+              </w:rPr>
+              <w:t xml:space="preserve">9.6×10⁻⁴</w:t>
+            </w:r>
+          </w:p>
+        </w:tc>
+        <w:tc>
+          <w:tcPr>
+            <w:vAlign w:val="center"/>
+          </w:tcPr>
+          <w:p>
+            <w:pPr>
+              <w:pStyle w:val="Compact"/>
+              <w:spacing w:before="0" w:after="20" w:line="240" w:lineRule="auto"/>
+              <w:jc w:val="center"/>
+              <w:keepNext w:val="0"/>
+              <w:keepLines/>
+              <w:widowControl w:val="1"/>
+            </w:pPr>
+            <w:r>
+              <w:rPr>
+                <w:rFonts w:ascii="Times New Roman" w:hAnsi="Times New Roman"/>
+                <w:sz w:val="19"/>
+                <w:highlight w:val="red"/>
+              </w:rPr>
+              <w:t xml:space="preserve">9.6×10⁻⁴</w:t>
+            </w:r>
+          </w:p>
+        </w:tc>
+        <w:tc>
+          <w:tcPr>
+            <w:vAlign w:val="center"/>
+          </w:tcPr>
+          <w:p>
+            <w:pPr>
+              <w:pStyle w:val="Compact"/>
+              <w:spacing w:before="0" w:after="20" w:line="240" w:lineRule="auto"/>
+              <w:jc w:val="center"/>
+              <w:keepNext w:val="0"/>
+              <w:keepLines/>
+              <w:widowControl w:val="1"/>
+            </w:pPr>
+            <w:r>
+              <w:rPr>
+                <w:rFonts w:ascii="Times New Roman" w:hAnsi="Times New Roman"/>
+                <w:sz w:val="19"/>
+                <w:highlight w:val="red"/>
+              </w:rPr>
+              <w:t xml:space="preserve">-0.11</w:t>
+            </w:r>
+          </w:p>
+        </w:tc>
+        <w:tc>
+          <w:tcPr>
+            <w:vAlign w:val="center"/>
+          </w:tcPr>
+          <w:p>
+            <w:pPr>
+              <w:pStyle w:val="Compact"/>
+              <w:spacing w:before="0" w:after="20" w:line="240" w:lineRule="auto"/>
+              <w:jc w:val="center"/>
+              <w:keepNext w:val="0"/>
+              <w:keepLines/>
+              <w:widowControl w:val="1"/>
+            </w:pPr>
+            <w:r>
+              <w:rPr>
+                <w:rFonts w:ascii="Times New Roman" w:hAnsi="Times New Roman"/>
+                <w:sz w:val="19"/>
+                <w:highlight w:val="red"/>
+              </w:rPr>
+              <w:t xml:space="preserve">-0.03 [-0.05, -0.01]</w:t>
+            </w:r>
+          </w:p>
+        </w:tc>
+      </w:tr>
+      <w:tr>
+        <w:tc>
+          <w:tcPr>
+            <w:vAlign w:val="center"/>
+          </w:tcPr>
+          <w:p>
+            <w:pPr>
+              <w:pStyle w:val="Compact"/>
+              <w:spacing w:before="0" w:after="20" w:line="240" w:lineRule="auto"/>
+              <w:jc w:val="center"/>
+              <w:keepNext w:val="0"/>
+              <w:keepLines/>
+              <w:widowControl w:val="1"/>
+            </w:pPr>
+            <w:r>
+              <w:rPr>
+                <w:rFonts w:ascii="Times New Roman" w:hAnsi="Times New Roman"/>
+                <w:sz w:val="19"/>
+                <w:highlight w:val="red"/>
+              </w:rPr>
+              <w:t xml:space="preserve">  (4,2) vs (0,0)</w:t>
+            </w:r>
+          </w:p>
+        </w:tc>
+        <w:tc>
+          <w:tcPr>
+            <w:vAlign w:val="center"/>
+          </w:tcPr>
+          <w:p>
+            <w:pPr>
+              <w:pStyle w:val="Compact"/>
+              <w:spacing w:before="0" w:after="20" w:line="240" w:lineRule="auto"/>
+              <w:jc w:val="center"/>
+              <w:keepNext w:val="0"/>
+              <w:keepLines/>
+              <w:widowControl w:val="1"/>
+            </w:pPr>
+            <w:r>
+              <w:rPr>
+                <w:rFonts w:ascii="Times New Roman" w:hAnsi="Times New Roman"/>
+                <w:sz w:val="19"/>
+                <w:highlight w:val="red"/>
+              </w:rPr>
+              <w:t xml:space="preserve">900</w:t>
+            </w:r>
+          </w:p>
+        </w:tc>
+        <w:tc>
+          <w:tcPr>
+            <w:vAlign w:val="center"/>
+          </w:tcPr>
+          <w:p>
+            <w:pPr>
+              <w:pStyle w:val="Compact"/>
+              <w:spacing w:before="0" w:after="20" w:line="240" w:lineRule="auto"/>
+              <w:jc w:val="center"/>
+              <w:keepNext w:val="0"/>
+              <w:keepLines/>
+              <w:widowControl w:val="1"/>
+            </w:pPr>
+            <w:r>
+              <w:rPr>
+                <w:rFonts w:ascii="Times New Roman" w:hAnsi="Times New Roman"/>
+                <w:sz w:val="19"/>
+                <w:highlight w:val="red"/>
+              </w:rPr>
+              <w:t xml:space="preserve">7.3×10⁻⁹</w:t>
+            </w:r>
+          </w:p>
+        </w:tc>
+        <w:tc>
+          <w:tcPr>
+            <w:vAlign w:val="center"/>
+          </w:tcPr>
+          <w:p>
+            <w:pPr>
+              <w:pStyle w:val="Compact"/>
+              <w:spacing w:before="0" w:after="20" w:line="240" w:lineRule="auto"/>
+              <w:jc w:val="center"/>
+              <w:keepNext w:val="0"/>
+              <w:keepLines/>
+              <w:widowControl w:val="1"/>
+            </w:pPr>
+            <w:r>
+              <w:rPr>
+                <w:rFonts w:ascii="Times New Roman" w:hAnsi="Times New Roman"/>
+                <w:sz w:val="19"/>
+                <w:highlight w:val="red"/>
+              </w:rPr>
+              <w:t xml:space="preserve">1.5×10⁻⁸</w:t>
+            </w:r>
+          </w:p>
+        </w:tc>
+        <w:tc>
+          <w:tcPr>
+            <w:vAlign w:val="center"/>
+          </w:tcPr>
+          <w:p>
+            <w:pPr>
+              <w:pStyle w:val="Compact"/>
+              <w:spacing w:before="0" w:after="20" w:line="240" w:lineRule="auto"/>
+              <w:jc w:val="center"/>
+              <w:keepNext w:val="0"/>
+              <w:keepLines/>
+              <w:widowControl w:val="1"/>
+            </w:pPr>
+            <w:r>
+              <w:rPr>
+                <w:rFonts w:ascii="Times New Roman" w:hAnsi="Times New Roman"/>
+                <w:sz w:val="19"/>
+                <w:highlight w:val="red"/>
+              </w:rPr>
+              <w:t xml:space="preserve">+0.19</w:t>
+            </w:r>
+          </w:p>
+        </w:tc>
+        <w:tc>
+          <w:tcPr>
+            <w:vAlign w:val="center"/>
+          </w:tcPr>
+          <w:p>
+            <w:pPr>
+              <w:pStyle w:val="Compact"/>
+              <w:spacing w:before="0" w:after="20" w:line="240" w:lineRule="auto"/>
+              <w:jc w:val="center"/>
+              <w:keepNext w:val="0"/>
+              <w:keepLines/>
+              <w:widowControl w:val="1"/>
+            </w:pPr>
+            <w:r>
+              <w:rPr>
+                <w:rFonts w:ascii="Times New Roman" w:hAnsi="Times New Roman"/>
+                <w:sz w:val="19"/>
+                <w:highlight w:val="red"/>
+              </w:rPr>
+              <w:t xml:space="preserve">+0.02 [+0.00, +0.05]</w:t>
+            </w:r>
+          </w:p>
+        </w:tc>
+      </w:tr>
+      <w:tr>
+        <w:tc>
+          <w:tcPr>
+            <w:vAlign w:val="center"/>
+          </w:tcPr>
+          <w:p>
+            <w:pPr>
+              <w:pStyle w:val="Compact"/>
+              <w:spacing w:before="0" w:after="20" w:line="240" w:lineRule="auto"/>
+              <w:jc w:val="center"/>
+              <w:keepNext w:val="0"/>
+              <w:keepLines/>
+              <w:widowControl w:val="1"/>
+            </w:pPr>
+            <w:r>
+              <w:rPr>
+                <w:rFonts w:ascii="Times New Roman" w:hAnsi="Times New Roman"/>
+                <w:i/>
+                <w:iCs/>
+                <w:sz w:val="19"/>
+                <w:highlight w:val="red"/>
+              </w:rPr>
+              <w:t xml:space="preserve">Rater faithfulness (1-5, Wilcoxon; higher better)</w:t>
+            </w:r>
+          </w:p>
+        </w:tc>
+        <w:tc>
+          <w:tcPr>
+            <w:vAlign w:val="center"/>
+          </w:tcPr>
+          <w:p>
+            <w:pPr>
+              <w:pStyle w:val="Compact"/>
+              <w:spacing w:before="0" w:after="20" w:line="240" w:lineRule="auto"/>
+              <w:jc w:val="center"/>
+              <w:keepNext w:val="0"/>
+              <w:keepLines/>
+              <w:widowControl w:val="1"/>
+            </w:pPr>
+          </w:p>
+        </w:tc>
+        <w:tc>
+          <w:tcPr>
+            <w:vAlign w:val="center"/>
+          </w:tcPr>
+          <w:p>
+            <w:pPr>
+              <w:pStyle w:val="Compact"/>
+              <w:spacing w:before="0" w:after="20" w:line="240" w:lineRule="auto"/>
+              <w:jc w:val="center"/>
+              <w:keepNext w:val="0"/>
+              <w:keepLines/>
+              <w:widowControl w:val="1"/>
+            </w:pPr>
+          </w:p>
+        </w:tc>
+        <w:tc>
+          <w:tcPr>
+            <w:vAlign w:val="center"/>
+          </w:tcPr>
+          <w:p>
+            <w:pPr>
+              <w:pStyle w:val="Compact"/>
+              <w:spacing w:before="0" w:after="20" w:line="240" w:lineRule="auto"/>
+              <w:jc w:val="center"/>
+              <w:keepNext w:val="0"/>
+              <w:keepLines/>
+              <w:widowControl w:val="1"/>
+            </w:pPr>
+          </w:p>
+        </w:tc>
+        <w:tc>
+          <w:tcPr>
+            <w:vAlign w:val="center"/>
+          </w:tcPr>
+          <w:p>
+            <w:pPr>
+              <w:pStyle w:val="Compact"/>
+              <w:spacing w:before="0" w:after="20" w:line="240" w:lineRule="auto"/>
+              <w:jc w:val="center"/>
+              <w:keepNext w:val="0"/>
+              <w:keepLines/>
+              <w:widowControl w:val="1"/>
+            </w:pPr>
+          </w:p>
+        </w:tc>
+        <w:tc>
+          <w:tcPr>
+            <w:vAlign w:val="center"/>
+          </w:tcPr>
+          <w:p>
+            <w:pPr>
+              <w:pStyle w:val="Compact"/>
+              <w:spacing w:before="0" w:after="20" w:line="240" w:lineRule="auto"/>
+              <w:jc w:val="center"/>
+              <w:keepNext w:val="0"/>
+              <w:keepLines/>
+              <w:widowControl w:val="1"/>
+            </w:pPr>
+          </w:p>
+        </w:tc>
+      </w:tr>
+      <w:tr>
+        <w:tc>
+          <w:tcPr>
+            <w:vAlign w:val="center"/>
+          </w:tcPr>
+          <w:p>
+            <w:pPr>
+              <w:pStyle w:val="Compact"/>
+              <w:spacing w:before="0" w:after="20" w:line="240" w:lineRule="auto"/>
+              <w:jc w:val="center"/>
+              <w:keepNext w:val="0"/>
+              <w:keepLines/>
+              <w:widowControl w:val="1"/>
+            </w:pPr>
+            <w:r>
+              <w:rPr>
+                <w:rFonts w:ascii="Times New Roman" w:hAnsi="Times New Roman"/>
+                <w:sz w:val="19"/>
+                <w:highlight w:val="red"/>
+              </w:rPr>
+              <w:t xml:space="preserve">  dual vs no-guidance</w:t>
+            </w:r>
+          </w:p>
+        </w:tc>
+        <w:tc>
+          <w:tcPr>
+            <w:vAlign w:val="center"/>
+          </w:tcPr>
+          <w:p>
+            <w:pPr>
+              <w:pStyle w:val="Compact"/>
+              <w:spacing w:before="0" w:after="20" w:line="240" w:lineRule="auto"/>
+              <w:jc w:val="center"/>
+              <w:keepNext w:val="0"/>
+              <w:keepLines/>
+              <w:widowControl w:val="1"/>
+            </w:pPr>
+            <w:r>
+              <w:rPr>
+                <w:rFonts w:ascii="Times New Roman" w:hAnsi="Times New Roman"/>
+                <w:sz w:val="19"/>
+                <w:highlight w:val="red"/>
+              </w:rPr>
+              <w:t xml:space="preserve">100</w:t>
+            </w:r>
+          </w:p>
+        </w:tc>
+        <w:tc>
+          <w:tcPr>
+            <w:vAlign w:val="center"/>
+          </w:tcPr>
+          <w:p>
+            <w:pPr>
+              <w:pStyle w:val="Compact"/>
+              <w:spacing w:before="0" w:after="20" w:line="240" w:lineRule="auto"/>
+              <w:jc w:val="center"/>
+              <w:keepNext w:val="0"/>
+              <w:keepLines/>
+              <w:widowControl w:val="1"/>
+            </w:pPr>
+            <w:r>
+              <w:rPr>
+                <w:rFonts w:ascii="Times New Roman" w:hAnsi="Times New Roman"/>
+                <w:sz w:val="19"/>
+                <w:highlight w:val="red"/>
+              </w:rPr>
+              <w:t xml:space="preserve">1.3×10⁻⁷</w:t>
+            </w:r>
+          </w:p>
+        </w:tc>
+        <w:tc>
+          <w:tcPr>
+            <w:vAlign w:val="center"/>
+          </w:tcPr>
+          <w:p>
+            <w:pPr>
+              <w:pStyle w:val="Compact"/>
+              <w:spacing w:before="0" w:after="20" w:line="240" w:lineRule="auto"/>
+              <w:jc w:val="center"/>
+              <w:keepNext w:val="0"/>
+              <w:keepLines/>
+              <w:widowControl w:val="1"/>
+            </w:pPr>
+            <w:r>
+              <w:rPr>
+                <w:rFonts w:ascii="Times New Roman" w:hAnsi="Times New Roman"/>
+                <w:sz w:val="19"/>
+                <w:highlight w:val="red"/>
+              </w:rPr>
+              <w:t xml:space="preserve">1.3×10⁻⁷</w:t>
+            </w:r>
+          </w:p>
+        </w:tc>
+        <w:tc>
+          <w:tcPr>
+            <w:vAlign w:val="center"/>
+          </w:tcPr>
+          <w:p>
+            <w:pPr>
+              <w:pStyle w:val="Compact"/>
+              <w:spacing w:before="0" w:after="20" w:line="240" w:lineRule="auto"/>
+              <w:jc w:val="center"/>
+              <w:keepNext w:val="0"/>
+              <w:keepLines/>
+              <w:widowControl w:val="1"/>
+            </w:pPr>
+            <w:r>
+              <w:rPr>
+                <w:rFonts w:ascii="Times New Roman" w:hAnsi="Times New Roman"/>
+                <w:sz w:val="19"/>
+                <w:highlight w:val="red"/>
+              </w:rPr>
+              <w:t xml:space="preserve">+0.67</w:t>
+            </w:r>
+          </w:p>
+        </w:tc>
+        <w:tc>
+          <w:tcPr>
+            <w:vAlign w:val="center"/>
+          </w:tcPr>
+          <w:p>
+            <w:pPr>
+              <w:pStyle w:val="Compact"/>
+              <w:spacing w:before="0" w:after="20" w:line="240" w:lineRule="auto"/>
+              <w:jc w:val="center"/>
+              <w:keepNext w:val="0"/>
+              <w:keepLines/>
+              <w:widowControl w:val="1"/>
+            </w:pPr>
+            <w:r>
+              <w:rPr>
+                <w:rFonts w:ascii="Times New Roman" w:hAnsi="Times New Roman"/>
+                <w:sz w:val="19"/>
+                <w:highlight w:val="red"/>
+              </w:rPr>
+              <w:t xml:space="preserve">+0.69 [+0.48, +0.90]</w:t>
+            </w:r>
+          </w:p>
+        </w:tc>
+      </w:tr>
+      <w:tr>
+        <w:tc>
+          <w:tcPr>
+            <w:vAlign w:val="center"/>
+          </w:tcPr>
+          <w:p>
+            <w:pPr>
+              <w:pStyle w:val="Compact"/>
+              <w:spacing w:before="0" w:after="20" w:line="240" w:lineRule="auto"/>
+              <w:jc w:val="center"/>
+              <w:keepNext w:val="0"/>
+              <w:keepLines/>
+              <w:widowControl w:val="1"/>
+            </w:pPr>
+            <w:r>
+              <w:rPr>
+                <w:rFonts w:ascii="Times New Roman" w:hAnsi="Times New Roman"/>
+                <w:sz w:val="19"/>
+                <w:highlight w:val="red"/>
+              </w:rPr>
+              <w:t xml:space="preserve">  dual vs DExperts</w:t>
+            </w:r>
+          </w:p>
+        </w:tc>
+        <w:tc>
+          <w:tcPr>
+            <w:vAlign w:val="center"/>
+          </w:tcPr>
+          <w:p>
+            <w:pPr>
+              <w:pStyle w:val="Compact"/>
+              <w:spacing w:before="0" w:after="20" w:line="240" w:lineRule="auto"/>
+              <w:jc w:val="center"/>
+              <w:keepNext w:val="0"/>
+              <w:keepLines/>
+              <w:widowControl w:val="1"/>
+            </w:pPr>
+            <w:r>
+              <w:rPr>
+                <w:rFonts w:ascii="Times New Roman" w:hAnsi="Times New Roman"/>
+                <w:sz w:val="19"/>
+                <w:highlight w:val="red"/>
+              </w:rPr>
+              <w:t xml:space="preserve">400</w:t>
+            </w:r>
+          </w:p>
+        </w:tc>
+        <w:tc>
+          <w:tcPr>
+            <w:vAlign w:val="center"/>
+          </w:tcPr>
+          <w:p>
+            <w:pPr>
+              <w:pStyle w:val="Compact"/>
+              <w:spacing w:before="0" w:after="20" w:line="240" w:lineRule="auto"/>
+              <w:jc w:val="center"/>
+              <w:keepNext w:val="0"/>
+              <w:keepLines/>
+              <w:widowControl w:val="1"/>
+            </w:pPr>
+            <w:r>
+              <w:rPr>
+                <w:rFonts w:ascii="Times New Roman" w:hAnsi="Times New Roman"/>
+                <w:sz w:val="19"/>
+                <w:highlight w:val="red"/>
+              </w:rPr>
+              <w:t xml:space="preserve">6.1×10⁻⁴¹</w:t>
+            </w:r>
+          </w:p>
+        </w:tc>
+        <w:tc>
+          <w:tcPr>
+            <w:vAlign w:val="center"/>
+          </w:tcPr>
+          <w:p>
+            <w:pPr>
+              <w:pStyle w:val="Compact"/>
+              <w:spacing w:before="0" w:after="20" w:line="240" w:lineRule="auto"/>
+              <w:jc w:val="center"/>
+              <w:keepNext w:val="0"/>
+              <w:keepLines/>
+              <w:widowControl w:val="1"/>
+            </w:pPr>
+            <w:r>
+              <w:rPr>
+                <w:rFonts w:ascii="Times New Roman" w:hAnsi="Times New Roman"/>
+                <w:sz w:val="19"/>
+                <w:highlight w:val="red"/>
+              </w:rPr>
+              <w:t xml:space="preserve">1.2×10⁻⁴⁰</w:t>
+            </w:r>
+          </w:p>
+        </w:tc>
+        <w:tc>
+          <w:tcPr>
+            <w:vAlign w:val="center"/>
+          </w:tcPr>
+          <w:p>
+            <w:pPr>
+              <w:pStyle w:val="Compact"/>
+              <w:spacing w:before="0" w:after="20" w:line="240" w:lineRule="auto"/>
+              <w:jc w:val="center"/>
+              <w:keepNext w:val="0"/>
+              <w:keepLines/>
+              <w:widowControl w:val="1"/>
+            </w:pPr>
+            <w:r>
+              <w:rPr>
+                <w:rFonts w:ascii="Times New Roman" w:hAnsi="Times New Roman"/>
+                <w:sz w:val="19"/>
+                <w:highlight w:val="red"/>
+              </w:rPr>
+              <w:t xml:space="preserve">+0.82</w:t>
+            </w:r>
+          </w:p>
+        </w:tc>
+        <w:tc>
+          <w:tcPr>
+            <w:vAlign w:val="center"/>
+          </w:tcPr>
+          <w:p>
+            <w:pPr>
+              <w:pStyle w:val="Compact"/>
+              <w:spacing w:before="0" w:after="20" w:line="240" w:lineRule="auto"/>
+              <w:jc w:val="center"/>
+              <w:keepNext w:val="0"/>
+              <w:keepLines/>
+              <w:widowControl w:val="1"/>
+            </w:pPr>
+            <w:r>
+              <w:rPr>
+                <w:rFonts w:ascii="Times New Roman" w:hAnsi="Times New Roman"/>
+                <w:sz w:val="19"/>
+                <w:highlight w:val="red"/>
+              </w:rPr>
+              <w:t xml:space="preserve">+1.04 [+0.93, +1.16]</w:t>
+            </w:r>
+          </w:p>
+        </w:tc>
+      </w:tr>
+      <w:tr>
+        <w:tc>
+          <w:tcPr>
+            <w:vAlign w:val="center"/>
+          </w:tcPr>
+          <w:p>
+            <w:pPr>
+              <w:pStyle w:val="Compact"/>
+              <w:spacing w:before="0" w:after="20" w:line="240" w:lineRule="auto"/>
+              <w:jc w:val="center"/>
+              <w:keepNext w:val="0"/>
+              <w:keepLines/>
+              <w:widowControl w:val="1"/>
+            </w:pPr>
+            <w:r>
+              <w:rPr>
+                <w:rFonts w:ascii="Times New Roman" w:hAnsi="Times New Roman"/>
+                <w:sz w:val="19"/>
+                <w:highlight w:val="red"/>
+              </w:rPr>
+              <w:t xml:space="preserve">  dual vs GeDi</w:t>
+            </w:r>
+          </w:p>
+        </w:tc>
+        <w:tc>
+          <w:tcPr>
+            <w:vAlign w:val="center"/>
+          </w:tcPr>
+          <w:p>
+            <w:pPr>
+              <w:pStyle w:val="Compact"/>
+              <w:spacing w:before="0" w:after="20" w:line="240" w:lineRule="auto"/>
+              <w:jc w:val="center"/>
+              <w:keepNext w:val="0"/>
+              <w:keepLines/>
+              <w:widowControl w:val="1"/>
+            </w:pPr>
+            <w:r>
+              <w:rPr>
+                <w:rFonts w:ascii="Times New Roman" w:hAnsi="Times New Roman"/>
+                <w:sz w:val="19"/>
+                <w:highlight w:val="red"/>
+              </w:rPr>
+              <w:t xml:space="preserve">400</w:t>
+            </w:r>
+          </w:p>
+        </w:tc>
+        <w:tc>
+          <w:tcPr>
+            <w:vAlign w:val="center"/>
+          </w:tcPr>
+          <w:p>
+            <w:pPr>
+              <w:pStyle w:val="Compact"/>
+              <w:spacing w:before="0" w:after="20" w:line="240" w:lineRule="auto"/>
+              <w:jc w:val="center"/>
+              <w:keepNext w:val="0"/>
+              <w:keepLines/>
+              <w:widowControl w:val="1"/>
+            </w:pPr>
+            <w:r>
+              <w:rPr>
+                <w:rFonts w:ascii="Times New Roman" w:hAnsi="Times New Roman"/>
+                <w:sz w:val="19"/>
+                <w:highlight w:val="red"/>
+              </w:rPr>
+              <w:t xml:space="preserve">7.3×10⁻⁵³</w:t>
+            </w:r>
+          </w:p>
+        </w:tc>
+        <w:tc>
+          <w:tcPr>
+            <w:vAlign w:val="center"/>
+          </w:tcPr>
+          <w:p>
+            <w:pPr>
+              <w:pStyle w:val="Compact"/>
+              <w:spacing w:before="0" w:after="20" w:line="240" w:lineRule="auto"/>
+              <w:jc w:val="center"/>
+              <w:keepNext w:val="0"/>
+              <w:keepLines/>
+              <w:widowControl w:val="1"/>
+            </w:pPr>
+            <w:r>
+              <w:rPr>
+                <w:rFonts w:ascii="Times New Roman" w:hAnsi="Times New Roman"/>
+                <w:sz w:val="19"/>
+                <w:highlight w:val="red"/>
+              </w:rPr>
+              <w:t xml:space="preserve">2.2×10⁻⁵²</w:t>
+            </w:r>
+          </w:p>
+        </w:tc>
+        <w:tc>
+          <w:tcPr>
+            <w:vAlign w:val="center"/>
+          </w:tcPr>
+          <w:p>
+            <w:pPr>
+              <w:pStyle w:val="Compact"/>
+              <w:spacing w:before="0" w:after="20" w:line="240" w:lineRule="auto"/>
+              <w:jc w:val="center"/>
+              <w:keepNext w:val="0"/>
+              <w:keepLines/>
+              <w:widowControl w:val="1"/>
+            </w:pPr>
+            <w:r>
+              <w:rPr>
+                <w:rFonts w:ascii="Times New Roman" w:hAnsi="Times New Roman"/>
+                <w:sz w:val="19"/>
+                <w:highlight w:val="red"/>
+              </w:rPr>
+              <w:t xml:space="preserve">+0.91</w:t>
+            </w:r>
+          </w:p>
+        </w:tc>
+        <w:tc>
+          <w:tcPr>
+            <w:vAlign w:val="center"/>
+          </w:tcPr>
+          <w:p>
+            <w:pPr>
+              <w:pStyle w:val="Compact"/>
+              <w:spacing w:before="0" w:after="20" w:line="240" w:lineRule="auto"/>
+              <w:jc w:val="center"/>
+              <w:keepNext w:val="0"/>
+              <w:keepLines/>
+              <w:widowControl w:val="1"/>
+            </w:pPr>
+            <w:r>
+              <w:rPr>
+                <w:rFonts w:ascii="Times New Roman" w:hAnsi="Times New Roman"/>
+                <w:sz w:val="19"/>
+                <w:highlight w:val="red"/>
+              </w:rPr>
+              <w:t xml:space="preserve">+1.32 [+1.21, +1.43]</w:t>
+            </w:r>
+          </w:p>
+        </w:tc>
+      </w:tr>
+      <w:tr>
+        <w:tc>
+          <w:tcPr>
+            <w:vAlign w:val="center"/>
+          </w:tcPr>
+          <w:p>
+            <w:pPr>
+              <w:pStyle w:val="Compact"/>
+              <w:spacing w:before="0" w:after="20" w:line="240" w:lineRule="auto"/>
+              <w:jc w:val="center"/>
+              <w:keepNext w:val="0"/>
+              <w:keepLines/>
+              <w:widowControl w:val="1"/>
+            </w:pPr>
+            <w:r>
+              <w:rPr>
+                <w:rFonts w:ascii="Times New Roman" w:hAnsi="Times New Roman"/>
+                <w:i/>
+                <w:iCs/>
+                <w:sz w:val="19"/>
+                <w:highlight w:val="red"/>
+              </w:rPr>
+              <w:t xml:space="preserve">Rater clickbait (1-5, Wilcoxon; lower better)</w:t>
+            </w:r>
+          </w:p>
+        </w:tc>
+        <w:tc>
+          <w:tcPr>
+            <w:vAlign w:val="center"/>
+          </w:tcPr>
+          <w:p>
+            <w:pPr>
+              <w:pStyle w:val="Compact"/>
+              <w:spacing w:before="0" w:after="20" w:line="240" w:lineRule="auto"/>
+              <w:jc w:val="center"/>
+              <w:keepNext w:val="0"/>
+              <w:keepLines/>
+              <w:widowControl w:val="1"/>
+            </w:pPr>
+          </w:p>
+        </w:tc>
+        <w:tc>
+          <w:tcPr>
+            <w:vAlign w:val="center"/>
+          </w:tcPr>
+          <w:p>
+            <w:pPr>
+              <w:pStyle w:val="Compact"/>
+              <w:spacing w:before="0" w:after="20" w:line="240" w:lineRule="auto"/>
+              <w:jc w:val="center"/>
+              <w:keepNext w:val="0"/>
+              <w:keepLines/>
+              <w:widowControl w:val="1"/>
+            </w:pPr>
+          </w:p>
+        </w:tc>
+        <w:tc>
+          <w:tcPr>
+            <w:vAlign w:val="center"/>
+          </w:tcPr>
+          <w:p>
+            <w:pPr>
+              <w:pStyle w:val="Compact"/>
+              <w:spacing w:before="0" w:after="20" w:line="240" w:lineRule="auto"/>
+              <w:jc w:val="center"/>
+              <w:keepNext w:val="0"/>
+              <w:keepLines/>
+              <w:widowControl w:val="1"/>
+            </w:pPr>
+          </w:p>
+        </w:tc>
+        <w:tc>
+          <w:tcPr>
+            <w:vAlign w:val="center"/>
+          </w:tcPr>
+          <w:p>
+            <w:pPr>
+              <w:pStyle w:val="Compact"/>
+              <w:spacing w:before="0" w:after="20" w:line="240" w:lineRule="auto"/>
+              <w:jc w:val="center"/>
+              <w:keepNext w:val="0"/>
+              <w:keepLines/>
+              <w:widowControl w:val="1"/>
+            </w:pPr>
+          </w:p>
+        </w:tc>
+        <w:tc>
+          <w:tcPr>
+            <w:vAlign w:val="center"/>
+          </w:tcPr>
+          <w:p>
+            <w:pPr>
+              <w:pStyle w:val="Compact"/>
+              <w:spacing w:before="0" w:after="20" w:line="240" w:lineRule="auto"/>
+              <w:jc w:val="center"/>
+              <w:keepNext w:val="0"/>
+              <w:keepLines/>
+              <w:widowControl w:val="1"/>
+            </w:pPr>
+          </w:p>
+        </w:tc>
+      </w:tr>
+      <w:tr>
+        <w:tc>
+          <w:tcPr>
+            <w:vAlign w:val="center"/>
+          </w:tcPr>
+          <w:p>
+            <w:pPr>
+              <w:pStyle w:val="Compact"/>
+              <w:spacing w:before="0" w:after="20" w:line="240" w:lineRule="auto"/>
+              <w:jc w:val="center"/>
+              <w:keepNext w:val="0"/>
+              <w:keepLines/>
+              <w:widowControl w:val="1"/>
+            </w:pPr>
+            <w:r>
+              <w:rPr>
+                <w:rFonts w:ascii="Times New Roman" w:hAnsi="Times New Roman"/>
+                <w:sz w:val="19"/>
+                <w:highlight w:val="red"/>
+              </w:rPr>
+              <w:t xml:space="preserve">  dual vs no-guidance</w:t>
+            </w:r>
+          </w:p>
+        </w:tc>
+        <w:tc>
+          <w:tcPr>
+            <w:vAlign w:val="center"/>
+          </w:tcPr>
+          <w:p>
+            <w:pPr>
+              <w:pStyle w:val="Compact"/>
+              <w:spacing w:before="0" w:after="20" w:line="240" w:lineRule="auto"/>
+              <w:jc w:val="center"/>
+              <w:keepNext w:val="0"/>
+              <w:keepLines/>
+              <w:widowControl w:val="1"/>
+            </w:pPr>
+            <w:r>
+              <w:rPr>
+                <w:rFonts w:ascii="Times New Roman" w:hAnsi="Times New Roman"/>
+                <w:sz w:val="19"/>
+                <w:highlight w:val="red"/>
+              </w:rPr>
+              <w:t xml:space="preserve">100</w:t>
+            </w:r>
+          </w:p>
+        </w:tc>
+        <w:tc>
+          <w:tcPr>
+            <w:vAlign w:val="center"/>
+          </w:tcPr>
+          <w:p>
+            <w:pPr>
+              <w:pStyle w:val="Compact"/>
+              <w:spacing w:before="0" w:after="20" w:line="240" w:lineRule="auto"/>
+              <w:jc w:val="center"/>
+              <w:keepNext w:val="0"/>
+              <w:keepLines/>
+              <w:widowControl w:val="1"/>
+            </w:pPr>
+            <w:r>
+              <w:rPr>
+                <w:rFonts w:ascii="Times New Roman" w:hAnsi="Times New Roman"/>
+                <w:sz w:val="19"/>
+                <w:highlight w:val="red"/>
+              </w:rPr>
+              <w:t xml:space="preserve">1.2×10⁻⁷</w:t>
+            </w:r>
+          </w:p>
+        </w:tc>
+        <w:tc>
+          <w:tcPr>
+            <w:vAlign w:val="center"/>
+          </w:tcPr>
+          <w:p>
+            <w:pPr>
+              <w:pStyle w:val="Compact"/>
+              <w:spacing w:before="0" w:after="20" w:line="240" w:lineRule="auto"/>
+              <w:jc w:val="center"/>
+              <w:keepNext w:val="0"/>
+              <w:keepLines/>
+              <w:widowControl w:val="1"/>
+            </w:pPr>
+            <w:r>
+              <w:rPr>
+                <w:rFonts w:ascii="Times New Roman" w:hAnsi="Times New Roman"/>
+                <w:sz w:val="19"/>
+                <w:highlight w:val="red"/>
+              </w:rPr>
+              <w:t xml:space="preserve">1.2×10⁻⁷</w:t>
+            </w:r>
+          </w:p>
+        </w:tc>
+        <w:tc>
+          <w:tcPr>
+            <w:vAlign w:val="center"/>
+          </w:tcPr>
+          <w:p>
+            <w:pPr>
+              <w:pStyle w:val="Compact"/>
+              <w:spacing w:before="0" w:after="20" w:line="240" w:lineRule="auto"/>
+              <w:jc w:val="center"/>
+              <w:keepNext w:val="0"/>
+              <w:keepLines/>
+              <w:widowControl w:val="1"/>
+            </w:pPr>
+            <w:r>
+              <w:rPr>
+                <w:rFonts w:ascii="Times New Roman" w:hAnsi="Times New Roman"/>
+                <w:sz w:val="19"/>
+                <w:highlight w:val="red"/>
+              </w:rPr>
+              <w:t xml:space="preserve">-0.66</w:t>
+            </w:r>
+          </w:p>
+        </w:tc>
+        <w:tc>
+          <w:tcPr>
+            <w:vAlign w:val="center"/>
+          </w:tcPr>
+          <w:p>
+            <w:pPr>
+              <w:pStyle w:val="Compact"/>
+              <w:spacing w:before="0" w:after="20" w:line="240" w:lineRule="auto"/>
+              <w:jc w:val="center"/>
+              <w:keepNext w:val="0"/>
+              <w:keepLines/>
+              <w:widowControl w:val="1"/>
+            </w:pPr>
+            <w:r>
+              <w:rPr>
+                <w:rFonts w:ascii="Times New Roman" w:hAnsi="Times New Roman"/>
+                <w:sz w:val="19"/>
+                <w:highlight w:val="red"/>
+              </w:rPr>
+              <w:t xml:space="preserve">-0.58 [-0.77, -0.38]</w:t>
+            </w:r>
+          </w:p>
+        </w:tc>
+      </w:tr>
+      <w:tr>
+        <w:tc>
+          <w:tcPr>
+            <w:vAlign w:val="center"/>
+          </w:tcPr>
+          <w:p>
+            <w:pPr>
+              <w:pStyle w:val="Compact"/>
+              <w:spacing w:before="0" w:after="20" w:line="240" w:lineRule="auto"/>
+              <w:jc w:val="center"/>
+              <w:keepNext w:val="0"/>
+              <w:keepLines/>
+              <w:widowControl w:val="1"/>
+            </w:pPr>
+            <w:r>
+              <w:rPr>
+                <w:rFonts w:ascii="Times New Roman" w:hAnsi="Times New Roman"/>
+                <w:sz w:val="19"/>
+                <w:highlight w:val="red"/>
+              </w:rPr>
+              <w:t xml:space="preserve">  dual vs DExperts</w:t>
+            </w:r>
+          </w:p>
+        </w:tc>
+        <w:tc>
+          <w:tcPr>
+            <w:vAlign w:val="center"/>
+          </w:tcPr>
+          <w:p>
+            <w:pPr>
+              <w:pStyle w:val="Compact"/>
+              <w:spacing w:before="0" w:after="20" w:line="240" w:lineRule="auto"/>
+              <w:jc w:val="center"/>
+              <w:keepNext w:val="0"/>
+              <w:keepLines/>
+              <w:widowControl w:val="1"/>
+            </w:pPr>
+            <w:r>
+              <w:rPr>
+                <w:rFonts w:ascii="Times New Roman" w:hAnsi="Times New Roman"/>
+                <w:sz w:val="19"/>
+                <w:highlight w:val="red"/>
+              </w:rPr>
+              <w:t xml:space="preserve">400</w:t>
+            </w:r>
+          </w:p>
+        </w:tc>
+        <w:tc>
+          <w:tcPr>
+            <w:vAlign w:val="center"/>
+          </w:tcPr>
+          <w:p>
+            <w:pPr>
+              <w:pStyle w:val="Compact"/>
+              <w:spacing w:before="0" w:after="20" w:line="240" w:lineRule="auto"/>
+              <w:jc w:val="center"/>
+              <w:keepNext w:val="0"/>
+              <w:keepLines/>
+              <w:widowControl w:val="1"/>
+            </w:pPr>
+            <w:r>
+              <w:rPr>
+                <w:rFonts w:ascii="Times New Roman" w:hAnsi="Times New Roman"/>
+                <w:sz w:val="19"/>
+                <w:highlight w:val="red"/>
+              </w:rPr>
+              <w:t xml:space="preserve">2.7×10⁻⁵¹</w:t>
+            </w:r>
+          </w:p>
+        </w:tc>
+        <w:tc>
+          <w:tcPr>
+            <w:vAlign w:val="center"/>
+          </w:tcPr>
+          <w:p>
+            <w:pPr>
+              <w:pStyle w:val="Compact"/>
+              <w:spacing w:before="0" w:after="20" w:line="240" w:lineRule="auto"/>
+              <w:jc w:val="center"/>
+              <w:keepNext w:val="0"/>
+              <w:keepLines/>
+              <w:widowControl w:val="1"/>
+            </w:pPr>
+            <w:r>
+              <w:rPr>
+                <w:rFonts w:ascii="Times New Roman" w:hAnsi="Times New Roman"/>
+                <w:sz w:val="19"/>
+                <w:highlight w:val="red"/>
+              </w:rPr>
+              <w:t xml:space="preserve">5.4×10⁻⁵¹</w:t>
+            </w:r>
+          </w:p>
+        </w:tc>
+        <w:tc>
+          <w:tcPr>
+            <w:vAlign w:val="center"/>
+          </w:tcPr>
+          <w:p>
+            <w:pPr>
+              <w:pStyle w:val="Compact"/>
+              <w:spacing w:before="0" w:after="20" w:line="240" w:lineRule="auto"/>
+              <w:jc w:val="center"/>
+              <w:keepNext w:val="0"/>
+              <w:keepLines/>
+              <w:widowControl w:val="1"/>
+            </w:pPr>
+            <w:r>
+              <w:rPr>
+                <w:rFonts w:ascii="Times New Roman" w:hAnsi="Times New Roman"/>
+                <w:sz w:val="19"/>
+                <w:highlight w:val="red"/>
+              </w:rPr>
+              <w:t xml:space="preserve">-0.91</w:t>
+            </w:r>
+          </w:p>
+        </w:tc>
+        <w:tc>
+          <w:tcPr>
+            <w:vAlign w:val="center"/>
+          </w:tcPr>
+          <w:p>
+            <w:pPr>
+              <w:pStyle w:val="Compact"/>
+              <w:spacing w:before="0" w:after="20" w:line="240" w:lineRule="auto"/>
+              <w:jc w:val="center"/>
+              <w:keepNext w:val="0"/>
+              <w:keepLines/>
+              <w:widowControl w:val="1"/>
+            </w:pPr>
+            <w:r>
+              <w:rPr>
+                <w:rFonts w:ascii="Times New Roman" w:hAnsi="Times New Roman"/>
+                <w:sz w:val="19"/>
+                <w:highlight w:val="red"/>
+              </w:rPr>
+              <w:t xml:space="preserve">-1.28 [-1.39, -1.17]</w:t>
             </w:r>
           </w:p>
         </w:tc>
@@ -11538,7 +13440,31 @@
         <w:rPr>
           <w:highlight w:val="yellow"/>
         </w:rPr>
-        <w:t xml:space="preserve">Several limitations frame the empirical scope of the current work. First, the synthetic corpus is built exclusively from the real Reuters political and world-news headlines described in Section 3.2 (the genuine-news half of the ISOT dataset); extending both guide models to tabloid, entertainment, and non-English registers remains open, although Section 4.12 shows that the trained guides already transfer at inference to a different, human-authored, non-Reuters English-news register with the same directional effects; the results in Section 4 should otherwise be read within this domain. Second, the neutrality of the Reuters source headlines is quantified rather than assumed: the independent detector flags only 0.61% of the source pool (Section 4.7). Third, the external evaluation on the Webis Clickbait Corpus 2017[4] and the Chakraborty et al.[3] corpus (Section 4.5) measures the synthetic-to-human distribution shift directly, with AUROC 0.955 on clean human clickbait and 0.740 on the noisier graded corpus. Fourth, the decoding-time guides operate as amplifiers on top of the prompt: they deliver their effect when the prompt names the target tactic (on the 40-item α–β tuning sweep, independent tactic realization +0.075, from 0.44 to 0.51, as α goes 0→4; on the 300-item held-out set the same contrast is +0.03, 0.48 to 0.51, Table 6), consistent with top-k rescoring reweighting tokens the base model already proposes; the framework is therefore designed and evaluated as prompt-plus-guidance. Fifth, all three decoding-time methods realize the target tactic to a comparable degree, and the single-axis baselines match the dual guide's fidelity at low steering; the dual guide's distinctive capability is the independent clickbait brake, which decouples engagement from clickbait so that induced clickbait stays low as engagement rises, while the single-axis baselines raise induced clickbait as they steer toward the same tactic (Section 4.9). All quantitative comparisons use item-matched significance testing with 95% bootstrap confidence intervals.</w:t>
+        <w:t xml:space="preserve">Several limitations frame the empirical scope of the current work. First, the synthetic corpus is built exclusively from the real Reuters political and world-news headlines described in Section 3.2 (the genuine-news half of the ISOT dataset); extending both guide models to tabloid, entertainment, and non-English registers remains open, although Section 4.12 shows that the trained guides already transfer at inference to a different, human-authored, non-Reuters English-news register with the same directional effects; the results in Section 4 should otherwise be read within this domain. Second, the neutrality of the Reuters source headlines is quantified rather than assumed: the independent detector flags only 0.61% of the source pool (Section 4.7). Third, the external evaluation on the Webis Clickbait Corpus 2017[4] and the Chakraborty et al.[3] corpus (Section 4.5) measures the synthetic-to-human distribution shift directly, with AUROC 0.955 on clean human clickbait and 0.740 on the noisier graded corpus.</w:t>
+      </w:r>
+      <w:r>
+        <w:rPr>
+          <w:highlight w:val="yellow"/>
+        </w:rPr>
+        <w:t xml:space="preserve"> </w:t>
+      </w:r>
+      <w:r>
+        <w:rPr>
+          <w:highlight w:val="red"/>
+        </w:rPr>
+        <w:t xml:space="preserve">This external validation is direct only for the clickbait guide; because no tactic-labelled human corpus exists, the engagement guide's external evidence is limited to the indirect correlation of its attribute scores with the overall human clickbait label (Section 4.5).</w:t>
+      </w:r>
+      <w:r>
+        <w:rPr>
+          <w:highlight w:val="yellow"/>
+        </w:rPr>
+        <w:t xml:space="preserve"> </w:t>
+      </w:r>
+      <w:r>
+        <w:rPr>
+          <w:highlight w:val="yellow"/>
+        </w:rPr>
+        <w:t xml:space="preserve">Fourth, the decoding-time guides operate as amplifiers on top of the prompt: they deliver their effect when the prompt names the target tactic (on the 40-item α–β tuning sweep, independent tactic realization +0.075, from 0.44 to 0.51, as α goes 0→4; on the 300-item held-out set the same contrast is +0.03, 0.48 to 0.51, Table 6), consistent with top-k rescoring reweighting tokens the base model already proposes; the framework is therefore designed and evaluated as prompt-plus-guidance. Fifth, all three decoding-time methods realize the target tactic to a comparable degree, and the single-axis baselines match the dual guide's fidelity at low steering; the dual guide's distinctive capability is the independent clickbait brake, which decouples engagement from clickbait so that induced clickbait stays low as engagement rises, while the single-axis baselines raise induced clickbait as they steer toward the same tactic (Section 4.9). All quantitative comparisons use item-matched significance testing with 95% bootstrap confidence intervals.</w:t>
       </w:r>
     </w:p>
     <w:p>

</xml_diff>

<commit_message>
#3: leakage-free detector retrain resolves the Table-11 cross-domain concern
Reviewer noted Table 11 uses non-clickbait Chakraborty headlines as sources
while the DistilBERT evaluator was trained on the Chakraborty corpus. Retrained
the detector from scratch (Modal A10G) with the 150 Table-11 source headlines
excluded (held-out acc 0.99) and re-scored the same rewrites: the directional
effects are unchanged — brake lowers induced clickbait (0,0) 0.017->0.011 and
(4,0) 0.031->0.025, engagement raises it 0.017->0.031 — so the effect is not a
source-leakage artifact.

- Section 4.12 caveat: added the retrain result in RED highlight.
- Letter (item 2, cross-domain): synced with the retrain numbers.
- Paper/letter DOCX+PDF rebuilt (yellow prior-round + red this-round: 71 red
  fragments); docs/ mirror and response_letter.html refreshed.
- Commit retrained_detector_scores.json + retrain_modal.py-produced artifact.

Co-Authored-By: Claude Opus 4.8 <noreply@anthropic.com>
</commit_message>
<xml_diff>
--- a/docs/GuidedRewriteClickbait_v9_cycle1.docx
+++ b/docs/GuidedRewriteClickbait_v9_cycle1.docx
@@ -10125,6 +10125,15 @@
           <w:highlight w:val="red"/>
         </w:rPr>
         <w:t xml:space="preserve">One caveat is specific to this register: the external clickbait detector was trained on the Chakraborty corpus from which these source headlines are drawn, so its absolute values here are in-domain for the detector. The generalization claim therefore rests on the within-register directional effects (the engagement guide raises tactic realization; the brake lowers induced clickbait), which do not depend on the detector's absolute calibration, and the detector remains independent of the generation guides.</w:t>
+      </w:r>
+      <w:r>
+        <w:t xml:space="preserve"> </w:t>
+      </w:r>
+      <w:r>
+        <w:rPr>
+          <w:highlight w:val="red"/>
+        </w:rPr>
+        <w:t xml:space="preserve">To rule out that this downward brake effect is an artifact of that overlap, we retrained the detector from scratch with those 150 source headlines excluded from its training data (held-out accuracy 0.99) and re-scored the same rewrites: the direction is unchanged, with the brake lowering induced clickbait from 0.017 to 0.011 without engagement and from 0.031 to 0.025 with it, and the engagement guide raising it from 0.017 to 0.031, so the effect does not depend on the sources appearing in the detector's training set.</w:t>
       </w:r>
       <w:r>
         <w:rPr>

</xml_diff>